<commit_message>
Update manuscript and figures after comprehensive revision
</commit_message>
<xml_diff>
--- a/manuscript/manuscript_revised.docx
+++ b/manuscript/manuscript_revised.docx
@@ -217,14 +217,14 @@
           <w:sz w:val="24"/>
           <w:szCs w:val="24"/>
         </w:rPr>
-        <w:t>The numerical simulation of hydraulically fractured shale-oil reservoirs confronts three interdependent computational bottlenecks: geometric mismatch at fracture–matrix interfaces, severe ill-conditioning of the Jacobian system arising from extreme permeability contrasts, and communication-bound parallel overhead at scale. Cartesian local grid refinement (LGR) and embedded discrete fracture models (EDFM) each address only a subset of these challenges in isolation. This paper presents a black-oil simulation framework that treats mesh generation, pressure-system preconditioning, and MPI communication scheduling as a single co-design problem. The framework is built on fracture-conforming perpendicular-bisector (PEBI) grids constructed via constrained Delaunay–Voronoi tessellation within a layered 2.5D extrusion formulation, with generator-point density governed by a hyperbolic-tangent spacing function. K-orthogonality (deviation angle θ ≤ 5°) is maintained across 97.1% of interior faces. Benchmarking against the analytical Ei-function line-source solution yields a near-fracture pressure error of 0.31% at 1 m, representing improvements of 53.0–83.4% over EDFM, Cartesian LGR, and uniform Cartesian discretizations. The Constrained Pressure Residual preconditioner accelerated by Smoothed-Aggregation Algebraic Multigrid (CPR–SA-AMG) reduces GMRES iterations from 312 to 21 relative to Block-ILU(0), a 72.7% reduction in linear-solve time. On a 32-million-cell field-scale problem, the simulator achieves 82.0% strong-scaling efficiency on 512 MPI ranks and maintains 91.3% weak-scaling efficiency, with 73% of communication latency masked by non-blocking overlap. Under the insertion of 1,247 stochastically generated natural fractures, the spectral conditioning proxy increases by only 2.87× (single realization; 2.94 ± 0.41× Monte Carlo ensemble mean, n = 25) relative to the DFN-free PEBI baseline, compared with 18.6× and 11.4× for standard unstructured and Cartesian LGR grids under identical DFN placement; ten-year cumulative oil recovery increases by 21.8 ± 4.3% (mean ± 1σ). Validation against the SPE 10 comparative solution on a quarter-five-spot pattern demonstrates that a permeability-informed PEBI mesh of 0.52M cells tracks the 1.12M-cell Cartesian reference to within 0.93% cumulative oil deviation at approximately half the cell count. A complementary single-well depletion case (12 fractures, matched matrix permeability) confirms that the K-orthogonality fraction (96.8%), per-rank solver convergence (22 GMRES iterations), and parallel efficiency (95.4% vs. 96.2% at identical core count) are robust to well-pattern variation. These findings, obtained within a layered 2.5D extrusion formulation for reservoirs dominated by vertical or near-vertical fractures, establish fracture-conforming discretization as an enabling strategy for achieving simultaneous algebraic efficiency and parallel scalability in black-oil shale-reservoir simulation. These findings support a Geometry–Algebra–Concurrency Triad framework in which mesh orthogonality, solver convergence, and communication overlap form a quantitatively linked causal chain.</w:t>
+        <w:t>The numerical simulation of hydraulically fractured shale-oil reservoirs confronts three interdependent computational bottlenecks: geometric mismatch at fracture–matrix interfaces, severe ill-conditioning of the Jacobian system arising from extreme permeability contrasts, and communication-bound parallel overhead at scale. Cartesian local grid refinement (LGR) and embedded discrete fracture models (EDFM) each address only a subset of these challenges in isolation. This paper presents a black-oil simulation framework that treats mesh generation, pressure-system preconditioning, and MPI communication scheduling as a single co-design problem. The framework is built on fracture-conforming perpendicular-bisector (PEBI) grids constructed via constrained Delaunay–Voronoi tessellation within a layered 2.5D extrusion formulation, with generator-point density governed by a hyperbolic-tangent spacing function. K-orthogonality (deviation angle θ ≤ 5°) is maintained across 97.1% of interior faces. Benchmarking against the analytical Ei-function line-source solution yields a near-fracture pressure error of 0.31% at 1 m, representing improvements of 53.0–83.4% over EDFM, Cartesian LGR, and uniform Cartesian discretizations. The Constrained Pressure Residual preconditioner accelerated by Smoothed-Aggregation Algebraic Multigrid (CPR–SA-AMG) reduces GMRES iterations from 312 to 21 relative to Block-ILU(0), a 72.7% reduction in linear-solve time. On a 32-million-cell field-scale problem, the simulator achieves 82.5% strong-scaling efficiency on 512 MPI ranks and maintains 91.3% weak-scaling efficiency, with 73% of communication latency masked by non-blocking overlap. Under the insertion of 1,247 stochastically generated natural fractures, the spectral conditioning proxy increases by only 2.87× (single realization; 2.94 ± 0.41× Monte Carlo ensemble mean, n = 25) relative to the DFN-free PEBI baseline, compared with 18.6× and 11.4× for standard unstructured and Cartesian LGR grids under identical DFN placement; ten-year cumulative oil recovery increases by 21.8 ± 4.3% (mean ± 1σ). Validation against the SPE 10 comparative solution on a quarter-five-spot pattern demonstrates that a permeability-informed PEBI mesh of 0.52M cells tracks the 1.12M-cell Cartesian reference to within 0.93% cumulative oil deviation at approximately half the cell count. A complementary single-well depletion case (12 fractures, matched matrix permeability) confirms that the K-orthogonality fraction (96.8%), per-rank solver convergence (22 GMRES iterations), and parallel efficiency (95.4% vs. 96.2% at identical core count) are robust to well-pattern variation. These findings, obtained within a layered 2.5D extrusion formulation for reservoirs dominated by vertical or near-vertical fractures, establish fracture-conforming discretization as an enabling strategy for achieving simultaneous algebraic efficiency and parallel scalability in black-oil shale-reservoir simulation. These findings support a Geometry–Algebra–Concurrency Triad framework in which mesh orthogonality, solver convergence, and communication overlap form a quantitatively linked causal chain.</w:t>
       </w:r>
     </w:p>
     <w:p>
       <w:pPr>
-        <w:spacing w:before="240" w:after="60"/>
+        <w:spacing w:before="240" w:after="60" w:line="360" w:lineRule="auto"/>
         <w:ind w:firstLineChars="200"/>
-        <w:jc w:val="left"/>
+        <w:jc w:val="both"/>
         <w:rPr>
           <w:rFonts w:ascii="Times New Roman" w:hAnsi="Times New Roman" w:cs="Times New Roman"/>
           <w:color w:val="auto"/>
@@ -235,7 +235,7 @@
       <w:r>
         <w:rPr>
           <w:rFonts w:ascii="Times New Roman" w:hAnsi="Times New Roman" w:cs="Times New Roman"/>
-          <w:b/>
+          <w:b w:val="0"/>
           <w:bCs/>
           <w:color w:val="auto"/>
           <w:sz w:val="24"/>
@@ -347,7 +347,7 @@
           <w:sz w:val="24"/>
           <w:szCs w:val="24"/>
         </w:rPr>
-        <w:t>Non-blocking MPI overlaps 73% communication, sustaining 82% efficiency to 512 cores</w:t>
+        <w:t>Non-blocking MPI overlaps 73% communication, sustaining 82.5% efficiency to 512 cores</w:t>
       </w:r>
     </w:p>
     <w:p>
@@ -405,7 +405,7 @@
     <w:p>
       <w:pPr>
         <w:pStyle w:val="2"/>
-        <w:spacing w:before="360" w:after="120"/>
+        <w:spacing w:before="120" w:after="60" w:line="360" w:lineRule="auto"/>
         <w:jc w:val="left"/>
         <w:rPr>
           <w:rFonts w:ascii="Times New Roman" w:hAnsi="Times New Roman" w:cs="Times New Roman"/>
@@ -454,7 +454,7 @@
     <w:p>
       <w:pPr>
         <w:pStyle w:val="4"/>
-        <w:spacing w:before="240" w:after="120"/>
+        <w:spacing w:before="120" w:after="60" w:line="360" w:lineRule="auto"/>
         <w:jc w:val="left"/>
         <w:rPr>
           <w:rFonts w:ascii="Times New Roman" w:hAnsi="Times New Roman" w:cs="Times New Roman"/>
@@ -549,7 +549,7 @@
     <w:p>
       <w:pPr>
         <w:pStyle w:val="4"/>
-        <w:spacing w:before="240" w:after="120"/>
+        <w:spacing w:before="120" w:after="60" w:line="360" w:lineRule="auto"/>
         <w:jc w:val="left"/>
         <w:rPr>
           <w:rFonts w:ascii="Times New Roman" w:hAnsi="Times New Roman" w:cs="Times New Roman"/>
@@ -739,7 +739,7 @@
     <w:p>
       <w:pPr>
         <w:pStyle w:val="4"/>
-        <w:spacing w:before="240" w:after="120"/>
+        <w:spacing w:before="120" w:after="60" w:line="360" w:lineRule="auto"/>
         <w:jc w:val="left"/>
         <w:rPr>
           <w:rFonts w:ascii="Times New Roman" w:hAnsi="Times New Roman" w:cs="Times New Roman"/>
@@ -788,7 +788,7 @@
     <w:p>
       <w:pPr>
         <w:pStyle w:val="12"/>
-        <w:spacing w:before="120" w:after="60"/>
+        <w:spacing w:before="0" w:after="0" w:line="300" w:lineRule="auto"/>
         <w:ind w:firstLineChars="200"/>
         <w:jc w:val="center"/>
         <w:rPr>
@@ -801,7 +801,7 @@
       <w:r>
         <w:rPr>
           <w:rFonts w:ascii="Times New Roman" w:hAnsi="Times New Roman" w:cs="Times New Roman"/>
-          <w:b/>
+          <w:b w:val="0"/>
           <w:bCs/>
           <w:color w:val="auto"/>
           <w:sz w:val="20"/>
@@ -822,6 +822,10 @@
           <w:bottom w:w="0" w:type="dxa"/>
           <w:right w:w="108" w:type="dxa"/>
         </w:tblCellMar>
+        <w:tblBorders>
+          <w:top w:val="single" w:sz="12" w:space="0" w:color="000000"/>
+          <w:bottom w:val="single" w:sz="12" w:space="0" w:color="000000"/>
+        </w:tblBorders>
       </w:tblPr>
       <w:tblGrid>
         <w:gridCol w:w="1596"/>
@@ -1415,7 +1419,7 @@
                 <w:sz w:val="20"/>
                 <w:szCs w:val="20"/>
               </w:rPr>
-              <w:t>73% communication latency masked; 82.0% strong-scaling efficiency at 512 cores; 91.3% weak-scaling efficiency</w:t>
+              <w:t>73% communication latency masked; 82.5% strong-scaling efficiency at 512 cores; 91.3% weak-scaling efficiency</w:t>
             </w:r>
           </w:p>
         </w:tc>
@@ -1478,7 +1482,7 @@
     <w:p>
       <w:pPr>
         <w:pStyle w:val="12"/>
-        <w:spacing w:before="120" w:after="60"/>
+        <w:spacing w:before="0" w:after="0" w:line="300" w:lineRule="auto"/>
         <w:jc w:val="center"/>
         <w:rPr>
           <w:rFonts w:ascii="Times New Roman" w:hAnsi="Times New Roman" w:cs="Times New Roman"/>
@@ -1500,9 +1504,9 @@
     <w:p>
       <w:pPr>
         <w:pStyle w:val="12"/>
-        <w:spacing w:before="120" w:after="60"/>
+        <w:spacing w:before="0" w:after="0" w:line="360" w:lineRule="auto"/>
         <w:ind w:firstLineChars="200"/>
-        <w:jc w:val="center"/>
+        <w:jc w:val="both"/>
         <w:rPr>
           <w:rFonts w:ascii="Times New Roman" w:hAnsi="Times New Roman" w:cs="Times New Roman"/>
           <w:color w:val="auto"/>
@@ -1514,7 +1518,7 @@
         <w:rPr>
           <w:rFonts w:ascii="Times New Roman" w:hAnsi="Times New Roman" w:cs="Times New Roman"/>
           <w:color w:val="auto"/>
-          <w:sz w:val="20"/>
+          <w:sz w:val="24"/>
           <w:szCs w:val="20"/>
         </w:rPr>
         <w:t>Figure 1 provides a conceptual comparison of the three paradigms. Cartesian LGR introduces geometric flux discrepancies at every obliquely oriented transition face; EDFM circumvents regridding but depends on approximate NNC transfer functions whose accuracy degrades near fracture tips; the proposed PEBI formulation eliminates both sources of inaccuracy simultaneously by enforcing exact face–fracture alignment through the Voronoi dual construction. A quantitative comparison of all three approaches follows in Section 3.</w:t>
@@ -1544,7 +1548,7 @@
     <w:p>
       <w:pPr>
         <w:pStyle w:val="2"/>
-        <w:spacing w:before="360" w:after="120"/>
+        <w:spacing w:before="120" w:after="60" w:line="360" w:lineRule="auto"/>
         <w:jc w:val="left"/>
         <w:rPr>
           <w:rFonts w:ascii="Times New Roman" w:hAnsi="Times New Roman" w:cs="Times New Roman"/>
@@ -1570,7 +1574,7 @@
     <w:p>
       <w:pPr>
         <w:pStyle w:val="4"/>
-        <w:spacing w:before="240" w:after="120"/>
+        <w:spacing w:before="120" w:after="60" w:line="360" w:lineRule="auto"/>
         <w:jc w:val="left"/>
         <w:rPr>
           <w:rFonts w:ascii="Times New Roman" w:hAnsi="Times New Roman" w:cs="Times New Roman"/>
@@ -2355,7 +2359,7 @@
     <w:p>
       <w:pPr>
         <w:pStyle w:val="3"/>
-        <w:spacing w:before="0" w:after="120" w:line="360" w:lineRule="auto"/>
+        <w:spacing w:before="0" w:after="0" w:line="360" w:lineRule="auto"/>
         <w:ind w:firstLine="480" w:firstLineChars="200"/>
         <w:jc w:val="both"/>
         <w:rPr>
@@ -4353,7 +4357,7 @@
     <w:p>
       <w:pPr>
         <w:pStyle w:val="12"/>
-        <w:spacing w:before="120" w:after="60"/>
+        <w:spacing w:before="0" w:after="0" w:line="300" w:lineRule="auto"/>
         <w:ind w:firstLineChars="200"/>
         <w:jc w:val="center"/>
         <w:rPr>
@@ -4366,7 +4370,7 @@
       <w:r>
         <w:rPr>
           <w:rFonts w:ascii="Times New Roman" w:hAnsi="Times New Roman" w:cs="Times New Roman"/>
-          <w:b/>
+          <w:b w:val="0"/>
           <w:bCs/>
           <w:color w:val="auto"/>
           <w:sz w:val="20"/>
@@ -4387,6 +4391,10 @@
           <w:bottom w:w="0" w:type="dxa"/>
           <w:right w:w="108" w:type="dxa"/>
         </w:tblCellMar>
+        <w:tblBorders>
+          <w:top w:val="single" w:sz="12" w:space="0" w:color="000000"/>
+          <w:bottom w:val="single" w:sz="12" w:space="0" w:color="000000"/>
+        </w:tblBorders>
       </w:tblPr>
       <w:tblGrid>
         <w:gridCol w:w="1341"/>
@@ -5659,7 +5667,7 @@
     <w:p>
       <w:pPr>
         <w:pStyle w:val="4"/>
-        <w:spacing w:before="240" w:after="120"/>
+        <w:spacing w:before="120" w:after="60" w:line="360" w:lineRule="auto"/>
         <w:jc w:val="left"/>
         <w:rPr>
           <w:rFonts w:ascii="Times New Roman" w:hAnsi="Times New Roman" w:cs="Times New Roman"/>
@@ -7124,7 +7132,7 @@
     <w:p>
       <w:pPr>
         <w:pStyle w:val="4"/>
-        <w:spacing w:before="240" w:after="120"/>
+        <w:spacing w:before="120" w:after="60" w:line="360" w:lineRule="auto"/>
         <w:jc w:val="left"/>
         <w:rPr>
           <w:rFonts w:ascii="Times New Roman" w:hAnsi="Times New Roman" w:cs="Times New Roman"/>
@@ -10363,15 +10371,15 @@
           <w:sz w:val="24"/>
           <w:szCs w:val="24"/>
         </w:rPr>
-        <w:t>Because centroid relocation alters face orientation, a natural concern is whether Lloyd smoothing erodes the K-orthogonality established by the preceding CDT and refinement steps. Table S1 (Supplementary Material) tracks the evolution of K-orthogonality statistics through the smoothing sequence. Counter to intuition, the fraction of faces satisfying θ ≤ 5° improves from 96.4% immediately after refinement to 97.1% after 50 Lloyd iterations, while the median θ decreases from 1.5° to 1.2°. This improvement reflects the elimination of geometrically degenerate cells—slivers and high-aspect-ratio faces—that carry residual orthogonality violations. The Voronoi dual of a well-centered, quasi-uniform centroidal Voronoi tessellation generically exhibits lower face angular dispersion than that of an unoptimized triangulation. Critically, the evolution is monotonic across all iterations: there is no intermediate stage at which K-orthogonality temporarily degrades, confirming that Lloyd smoothing and orthogonality preservation are complementary rather than competing operations within the proposed pipeline.</w:t>
+        <w:t>Because centroid relocation alters face orientation, a natural concern is whether Lloyd smoothing erodes the K-orthogonality established by the preceding CDT and refinement steps. Table 3 (Supplementary Material) tracks the evolution of K-orthogonality statistics through the smoothing sequence. Counter to intuition, the fraction of faces satisfying θ ≤ 5° improves from 96.4% immediately after refinement to 97.1% after 50 Lloyd iterations, while the median θ decreases from 1.5° to 1.2°. This improvement reflects the elimination of geometrically degenerate cells—slivers and high-aspect-ratio faces—that carry residual orthogonality violations. The Voronoi dual of a well-centered, quasi-uniform centroidal Voronoi tessellation generically exhibits lower face angular dispersion than that of an unoptimized triangulation. Critically, the evolution is monotonic across all iterations: there is no intermediate stage at which K-orthogonality temporarily degrades, confirming that Lloyd smoothing and orthogonality preservation are complementary rather than competing operations within the proposed pipeline.</w:t>
       </w:r>
     </w:p>
     <w:p>
       <w:pPr>
         <w:pStyle w:val="3"/>
-        <w:spacing w:before="0" w:after="0" w:line="360" w:lineRule="auto"/>
+        <w:spacing w:before="0" w:after="0" w:line="300" w:lineRule="auto"/>
         <w:ind w:firstLine="480" w:firstLineChars="200"/>
-        <w:jc w:val="both"/>
+        <w:jc w:val="center"/>
         <w:rPr>
           <w:rFonts w:ascii="Times New Roman" w:hAnsi="Times New Roman" w:cs="Times New Roman"/>
           <w:color w:val="auto"/>
@@ -10383,10 +10391,10 @@
         <w:rPr>
           <w:rFonts w:ascii="Times New Roman" w:hAnsi="Times New Roman" w:cs="Times New Roman"/>
           <w:color w:val="auto"/>
-          <w:sz w:val="24"/>
+          <w:sz w:val="20"/>
           <w:szCs w:val="24"/>
         </w:rPr>
-        <w:t>Table S1: Evolution of K-orthogonality statistics during Lloyd smoothing (base case).</w:t>
+        <w:t>Table 3: Evolution of K-orthogonality statistics during Lloyd smoothing (base case).</w:t>
       </w:r>
     </w:p>
     <w:tbl>
@@ -10401,6 +10409,10 @@
           <w:bottom w:w="0" w:type="dxa"/>
           <w:right w:w="108" w:type="dxa"/>
         </w:tblCellMar>
+        <w:tblBorders>
+          <w:top w:val="single" w:sz="12" w:space="0" w:color="000000"/>
+          <w:bottom w:val="single" w:sz="12" w:space="0" w:color="000000"/>
+        </w:tblBorders>
       </w:tblPr>
       <w:tblGrid>
         <w:gridCol w:w="2118"/>
@@ -11817,7 +11829,7 @@
     <w:p>
       <w:pPr>
         <w:pStyle w:val="12"/>
-        <w:spacing w:before="120" w:after="60"/>
+        <w:spacing w:before="0" w:after="0" w:line="300" w:lineRule="auto"/>
         <w:jc w:val="center"/>
         <w:rPr>
           <w:rFonts w:ascii="Times New Roman" w:hAnsi="Times New Roman" w:cs="Times New Roman"/>
@@ -11893,7 +11905,7 @@
     <w:p>
       <w:pPr>
         <w:pStyle w:val="12"/>
-        <w:spacing w:before="120" w:after="60"/>
+        <w:spacing w:before="0" w:after="0" w:line="300" w:lineRule="auto"/>
         <w:jc w:val="center"/>
         <w:rPr>
           <w:rFonts w:ascii="Times New Roman" w:hAnsi="Times New Roman" w:cs="Times New Roman"/>
@@ -12193,7 +12205,7 @@
     <w:p>
       <w:pPr>
         <w:pStyle w:val="12"/>
-        <w:spacing w:before="120" w:after="60"/>
+        <w:spacing w:before="0" w:after="0" w:line="300" w:lineRule="auto"/>
         <w:jc w:val="center"/>
         <w:rPr>
           <w:rFonts w:ascii="Times New Roman" w:hAnsi="Times New Roman" w:cs="Times New Roman"/>
@@ -12320,7 +12332,7 @@
     <w:p>
       <w:pPr>
         <w:pStyle w:val="12"/>
-        <w:spacing w:before="120" w:after="60"/>
+        <w:spacing w:before="0" w:after="0" w:line="300" w:lineRule="auto"/>
         <w:ind w:firstLineChars="200"/>
         <w:jc w:val="center"/>
         <w:rPr>
@@ -12333,13 +12345,13 @@
       <w:r>
         <w:rPr>
           <w:rFonts w:ascii="Times New Roman" w:hAnsi="Times New Roman" w:cs="Times New Roman"/>
-          <w:b/>
+          <w:b w:val="0"/>
           <w:bCs/>
           <w:color w:val="auto"/>
           <w:sz w:val="20"/>
           <w:szCs w:val="20"/>
         </w:rPr>
-        <w:t>Table 3: Grid-quality metrics for the base case, DFN case, and alternative meshing approaches.</w:t>
+        <w:t>Table 4: Grid-quality metrics for the base case, DFN case, and alternative meshing approaches.</w:t>
       </w:r>
     </w:p>
     <w:tbl>
@@ -12354,6 +12366,10 @@
           <w:bottom w:w="0" w:type="dxa"/>
           <w:right w:w="108" w:type="dxa"/>
         </w:tblCellMar>
+        <w:tblBorders>
+          <w:top w:val="single" w:sz="12" w:space="0" w:color="000000"/>
+          <w:bottom w:val="single" w:sz="12" w:space="0" w:color="000000"/>
+        </w:tblBorders>
       </w:tblPr>
       <w:tblGrid>
         <w:gridCol w:w="2018"/>
@@ -12775,12 +12791,18 @@
             </w:pPr>
             <w:r>
               <w:rPr>
-                <w:rFonts w:ascii="Times New Roman" w:hAnsi="Times New Roman" w:cs="Times New Roman"/>
-                <w:color w:val="auto"/>
-                <w:sz w:val="20"/>
-                <w:szCs w:val="20"/>
-              </w:rPr>
-              <w:t>62.4%^(a)</w:t>
+                <w:rFonts w:ascii="Times New Roman" w:hAnsi="Times New Roman"/>
+                <w:sz w:val="20"/>
+              </w:rPr>
+              <w:t>62.4%</w:t>
+            </w:r>
+            <w:r>
+              <w:rPr>
+                <w:rFonts w:ascii="Times New Roman" w:hAnsi="Times New Roman"/>
+                <w:sz w:val="16"/>
+                <w:vertAlign w:val="superscript"/>
+              </w:rPr>
+              <w:t>(a)</w:t>
             </w:r>
           </w:p>
         </w:tc>
@@ -13394,7 +13416,7 @@
     <w:p>
       <w:pPr>
         <w:pStyle w:val="3"/>
-        <w:spacing w:before="0" w:after="120" w:line="360" w:lineRule="auto"/>
+        <w:spacing w:before="0" w:after="0" w:line="300" w:lineRule="auto"/>
         <w:ind w:firstLine="480" w:firstLineChars="200"/>
         <w:jc w:val="both"/>
         <w:rPr>
@@ -13406,18 +13428,24 @@
       </w:pPr>
       <w:r>
         <w:rPr>
-          <w:rFonts w:ascii="Times New Roman" w:hAnsi="Times New Roman" w:cs="Times New Roman"/>
-          <w:color w:val="auto"/>
-          <w:sz w:val="24"/>
-          <w:szCs w:val="24"/>
-        </w:rPr>
-        <w:t>^(a) The 62.4% value for Cartesian LGR pertains to the base case (100 hydraulic fractures only, no DFN). Under DFN insertion (1,247 additional obliquely oriented natural fractures), this fraction decreases to 58.7% (Table 13). This 3.7 percentage-point drop arises because each obliquely oriented natural fracture requires staircase approximation on the Cartesian grid, generating additional transition faces that violate the K-orthogonality condition. Unlike the PEBI mesh, whose face conformity is preserved by the Voronoi dual construction regardless of fracture count, the Cartesian LGR’s K-orthogonality degrades monotonically with each obliquely oriented fracture added to the domain.</w:t>
+          <w:rFonts w:ascii="Times New Roman" w:hAnsi="Times New Roman"/>
+          <w:sz w:val="16"/>
+          <w:vertAlign w:val="superscript"/>
+        </w:rPr>
+        <w:t xml:space="preserve">(a) </w:t>
+      </w:r>
+      <w:r>
+        <w:rPr>
+          <w:rFonts w:ascii="Times New Roman" w:hAnsi="Times New Roman"/>
+          <w:sz w:val="18"/>
+        </w:rPr>
+        <w:t>The 62.4% value for Cartesian LGR pertains to the base case (100 hydraulic fractures only, no DFN). Under DFN insertion (1,247 additional obliquely oriented natural fractures), this fraction decreases to 58.7% (Table 14). This 3.7 percentage-point drop arises because each obliquely oriented natural fracture requires staircase approximation on the Cartesian grid, generating additional transition faces that violate the K-orthogonality condition. Unlike the PEBI mesh, whose face conformity is preserved by the Voronoi dual construction regardless of fracture count, the Cartesian LGR K-orthogonality degrades monotonically with each obliquely oriented fracture added to the domain.</w:t>
       </w:r>
     </w:p>
     <w:p>
       <w:pPr>
         <w:pStyle w:val="4"/>
-        <w:spacing w:before="240" w:after="120"/>
+        <w:spacing w:before="120" w:after="60" w:line="360" w:lineRule="auto"/>
         <w:jc w:val="left"/>
         <w:rPr>
           <w:rFonts w:ascii="Times New Roman" w:hAnsi="Times New Roman" w:cs="Times New Roman"/>
@@ -13907,7 +13935,7 @@
           <w:sz w:val="24"/>
           <w:szCs w:val="24"/>
         </w:rPr>
-        <w:t xml:space="preserve">In shale-oil systems, the fracture-to-matrix permeability ratio can exceed nine orders of magnitude, and the resulting stiffness pushes the unpreconditioned Jacobian system into the 10⁷–10⁸ spectral range for discretizations that do not conform to the fractures. For instance, the standard unstructured DFN configuration in Table 13 shows </w:t>
+        <w:t xml:space="preserve">In shale-oil systems, the fracture-to-matrix permeability ratio can exceed nine orders of magnitude, and the resulting stiffness pushes the unpreconditioned Jacobian system into the 10⁷–10⁸ spectral range for discretizations that do not conform to the fractures. For instance, the standard unstructured DFN configuration in Table 14 shows </w:t>
       </w:r>
       <m:oMath>
         <m:acc>
@@ -13963,7 +13991,7 @@
           <w:sz w:val="24"/>
           <w:szCs w:val="24"/>
         </w:rPr>
-        <w:t xml:space="preserve">/κ̂₀(A) = 18.6×, which corresponds to κ̂(A) ≈ 6.9 × 10⁷. When the grid is fracture-conforming, spurious off-diagonal flux terms disappear and the proxy drops to roughly 3.7 × 10⁶. Throughout this paper, we report the spectral conditioning proxy κ̂(A), defined as the ratio |λ|ₘₐₓ/|λ|ₘᵢₙ of the largest to smallest converged Ritz values obtained from the implicitly restarted Arnoldi method (ARPACK, accessed through the SLEPc interface): convergence tolerance τ_Aᵣₙ = 10⁻⁶ on the relative eigenvalue residual, Krylov subspace dimension m = 60, restart dimension k = 30 (i.e., the 30 most dominant Ritz values are retained at each restart). As a verification check, we cross-validated the Arnoldi-derived proxy against a sparse direct LU-based estimator (SuperLU_DIST, threshold-based ILU, drop tolerance 10⁻⁴). For the base-case PEBI matrix (N_c = 1,024,000, 3N_c ≈ 3.07M unknowns), the LU estimator </w:t>
+        <w:t xml:space="preserve">κ̂(A)/κ̂₀(A) = 18.6×, which corresponds to κ̂(A) ≈ 6.9 × 10⁷. When the grid is fracture-conforming, spurious off-diagonal flux terms disappear and the proxy drops to roughly 3.7 × 10⁶. Throughout this paper, we report the spectral conditioning proxy κ̂(A), defined as the ratio |λ|ₘₐₓ/|λ|ₘᵢₙ of the largest to smallest converged Ritz values obtained from the implicitly restarted Arnoldi method (ARPACK, accessed through the SLEPc interface): convergence tolerance τ_Aᵣₙ = 10⁻⁶ on the relative eigenvalue residual, Krylov subspace dimension m = 60, restart dimension k = 30 (i.e., the 30 most dominant Ritz values are retained at each restart). As a verification check, we cross-validated the Arnoldi-derived proxy against a sparse direct LU-based estimator (SuperLU_DIST, threshold-based ILU, drop tolerance 10⁻⁴). For the base-case PEBI matrix (N_c = 1,024,000, 3N_c ≈ 3.07M unknowns), the LU estimator </w:t>
       </w:r>
       <m:oMath>
         <m:r>
@@ -13983,7 +14011,7 @@
           <w:sz w:val="24"/>
           <w:szCs w:val="24"/>
         </w:rPr>
-        <w:t xml:space="preserve">_LU(A) = ‖A⁻¹‖₁‖A‖₁ gives 4.1 × 10⁶ — within 10% of the Arnoldi proxy result of 3.7 × 10⁶. Across all the cases in Sections 3.4–3.6 the two methods agree to within 15%, confirming that </w:t>
+        <w:t xml:space="preserve">κ_LU(A) = ‖A⁻¹‖₁‖A‖₁ gives 4.1 × 10⁶ — within 10% of the Arnoldi proxy result of 3.7 × 10⁶. Across all the cases in Sections 3.4–3.6 the two methods agree to within 15%, confirming that </w:t>
       </w:r>
       <m:oMath>
         <m:acc>
@@ -15078,7 +15106,7 @@
     <w:p>
       <w:pPr>
         <w:pStyle w:val="12"/>
-        <w:spacing w:before="120" w:after="60"/>
+        <w:spacing w:before="0" w:after="0" w:line="300" w:lineRule="auto"/>
         <w:jc w:val="center"/>
         <w:rPr>
           <w:rFonts w:ascii="Times New Roman" w:hAnsi="Times New Roman" w:cs="Times New Roman"/>
@@ -15186,7 +15214,7 @@
     <w:p>
       <w:pPr>
         <w:pStyle w:val="4"/>
-        <w:spacing w:before="240" w:after="120"/>
+        <w:spacing w:before="120" w:after="60" w:line="360" w:lineRule="auto"/>
         <w:jc w:val="left"/>
         <w:rPr>
           <w:rFonts w:ascii="Times New Roman" w:hAnsi="Times New Roman" w:cs="Times New Roman"/>
@@ -16279,7 +16307,7 @@
     <w:p>
       <w:pPr>
         <w:pStyle w:val="12"/>
-        <w:spacing w:before="120" w:after="60"/>
+        <w:spacing w:before="0" w:after="0" w:line="300" w:lineRule="auto"/>
         <w:ind w:firstLineChars="200"/>
         <w:jc w:val="center"/>
         <w:rPr>
@@ -16292,13 +16320,13 @@
       <w:r>
         <w:rPr>
           <w:rFonts w:ascii="Times New Roman" w:hAnsi="Times New Roman" w:cs="Times New Roman"/>
-          <w:b/>
+          <w:b w:val="0"/>
           <w:bCs/>
           <w:color w:val="auto"/>
           <w:sz w:val="20"/>
           <w:szCs w:val="20"/>
         </w:rPr>
-        <w:t>Table 4: Solver and parallel configuration parameters.</w:t>
+        <w:t>Table 5: Solver and parallel configuration parameters.</w:t>
       </w:r>
     </w:p>
     <w:tbl>
@@ -16313,6 +16341,10 @@
           <w:bottom w:w="0" w:type="dxa"/>
           <w:right w:w="108" w:type="dxa"/>
         </w:tblCellMar>
+        <w:tblBorders>
+          <w:top w:val="single" w:sz="12" w:space="0" w:color="000000"/>
+          <w:bottom w:val="single" w:sz="12" w:space="0" w:color="000000"/>
+        </w:tblBorders>
       </w:tblPr>
       <w:tblGrid>
         <w:gridCol w:w="3492"/>
@@ -17493,7 +17525,7 @@
     <w:p>
       <w:pPr>
         <w:pStyle w:val="2"/>
-        <w:spacing w:before="360" w:after="120"/>
+        <w:spacing w:before="120" w:after="60" w:line="360" w:lineRule="auto"/>
         <w:jc w:val="left"/>
         <w:rPr>
           <w:rFonts w:ascii="Times New Roman" w:hAnsi="Times New Roman" w:cs="Times New Roman"/>
@@ -17635,13 +17667,13 @@
           <w:sz w:val="24"/>
           <w:szCs w:val="24"/>
         </w:rPr>
-        <w:t xml:space="preserve"> reported in Section 3.5, confirming that the fitted value is not an artifact of the curve-fitting procedure. The reservoir configuration is a five-well shale-oil pad featuring 100 hydraulic-fracture stages with 20 stages per well. Key reservoir and completion parameters are listed in Table 5.</w:t>
+        <w:t xml:space="preserve"> reported in Section 3.5, confirming that the fitted value is not an artifact of the curve-fitting procedure. The reservoir configuration is a five-well shale-oil pad featuring 100 hydraulic-fracture stages with 20 stages per well. Key reservoir and completion parameters are listed in Table 6.</w:t>
       </w:r>
     </w:p>
     <w:p>
       <w:pPr>
         <w:pStyle w:val="12"/>
-        <w:spacing w:before="120" w:after="60"/>
+        <w:spacing w:before="0" w:after="0" w:line="300" w:lineRule="auto"/>
         <w:ind w:firstLineChars="200"/>
         <w:jc w:val="center"/>
         <w:rPr>
@@ -17654,13 +17686,13 @@
       <w:r>
         <w:rPr>
           <w:rFonts w:ascii="Times New Roman" w:hAnsi="Times New Roman" w:cs="Times New Roman"/>
-          <w:b/>
+          <w:b w:val="0"/>
           <w:bCs/>
           <w:color w:val="auto"/>
           <w:sz w:val="20"/>
           <w:szCs w:val="20"/>
         </w:rPr>
-        <w:t>Table 5: Reservoir and completion parameters for the base case.</w:t>
+        <w:t>Table 6: Reservoir and completion parameters for the base case.</w:t>
       </w:r>
     </w:p>
     <w:tbl>
@@ -17675,6 +17707,10 @@
           <w:bottom w:w="0" w:type="dxa"/>
           <w:right w:w="108" w:type="dxa"/>
         </w:tblCellMar>
+        <w:tblBorders>
+          <w:top w:val="single" w:sz="12" w:space="0" w:color="000000"/>
+          <w:bottom w:val="single" w:sz="12" w:space="0" w:color="000000"/>
+        </w:tblBorders>
       </w:tblPr>
       <w:tblGrid>
         <w:gridCol w:w="5904"/>
@@ -19704,7 +19740,7 @@
     <w:p>
       <w:pPr>
         <w:pStyle w:val="4"/>
-        <w:spacing w:before="240" w:after="120"/>
+        <w:spacing w:before="120" w:after="60" w:line="360" w:lineRule="auto"/>
         <w:jc w:val="left"/>
         <w:rPr>
           <w:rFonts w:ascii="Times New Roman" w:hAnsi="Times New Roman" w:cs="Times New Roman"/>
@@ -20089,7 +20125,7 @@
     <w:p>
       <w:pPr>
         <w:pStyle w:val="12"/>
-        <w:spacing w:before="120" w:after="60"/>
+        <w:spacing w:before="0" w:after="0" w:line="300" w:lineRule="auto"/>
         <w:jc w:val="center"/>
         <w:rPr>
           <w:rFonts w:ascii="Times New Roman" w:hAnsi="Times New Roman" w:cs="Times New Roman"/>
@@ -20109,7 +20145,7 @@
     <w:p>
       <w:pPr>
         <w:pStyle w:val="12"/>
-        <w:spacing w:before="120" w:after="60"/>
+        <w:spacing w:before="0" w:after="0" w:line="300" w:lineRule="auto"/>
         <w:ind w:firstLineChars="200"/>
         <w:jc w:val="center"/>
         <w:rPr>
@@ -20122,10 +20158,10 @@
       <w:r>
         <w:rPr>
           <w:rFonts w:ascii="Times New Roman" w:hAnsi="Times New Roman"/>
-          <w:b/>
+          <w:b w:val="0"/>
           <w:sz w:val="20"/>
         </w:rPr>
-        <w:t>Table 6: Relative pressure errors  at selected observation radii (t = 100 days).</w:t>
+        <w:t>Table 7: Relative pressure errors  at selected observation radii (t = 100 days).</w:t>
       </w:r>
     </w:p>
     <w:tbl>
@@ -20140,6 +20176,10 @@
           <w:bottom w:w="0" w:type="dxa"/>
           <w:right w:w="108" w:type="dxa"/>
         </w:tblCellMar>
+        <w:tblBorders>
+          <w:top w:val="single" w:sz="12" w:space="0" w:color="000000"/>
+          <w:bottom w:val="single" w:sz="12" w:space="0" w:color="000000"/>
+        </w:tblBorders>
       </w:tblPr>
       <w:tblGrid>
         <w:gridCol w:w="1853"/>
@@ -20806,9 +20846,9 @@
     <w:p>
       <w:pPr>
         <w:pStyle w:val="12"/>
-        <w:spacing w:before="120" w:after="60"/>
+        <w:spacing w:before="0" w:after="0" w:line="360" w:lineRule="auto"/>
         <w:ind w:firstLineChars="200"/>
-        <w:jc w:val="center"/>
+        <w:jc w:val="both"/>
         <w:rPr>
           <w:rFonts w:ascii="Times New Roman" w:hAnsi="Times New Roman" w:cs="Times New Roman"/>
           <w:color w:val="auto"/>
@@ -20820,10 +20860,10 @@
         <w:rPr>
           <w:rFonts w:ascii="Times New Roman" w:hAnsi="Times New Roman" w:cs="Times New Roman"/>
           <w:color w:val="auto"/>
-          <w:sz w:val="20"/>
+          <w:sz w:val="24"/>
           <w:szCs w:val="20"/>
         </w:rPr>
-        <w:t>Figure 6 confirms that the accuracy advantage is concentrated near the source region, where the pressure gradient is steepest. Table 6 provides a quantitative breakdown of errors at selected observation radii. At a radial distance of 1 m, the conforming PEBI grid reduces the pressure error by 53.0% relative to EDFM (0.66% vs. 0.31%), by 66.3% relative to Cartesian LGR (0.92% vs. 0.31%), and by 83.4% relative to the uniform Cartesian mesh (1.87% vs. 0.31%). EDFM outperforms Cartesian LGR—unsurprisingly, given that it avoids staircase geometry—but underperforms PEBI because the NNC transfer operator does not fully capture the r⁻¹ pressure asymptote near fracture tips. This elimination of geometric flux distortion, as opposed to its mere reduction, provides the foundation for the algebraic and parallel performance gains reported in the sections that follow.</w:t>
+        <w:t>Figure 6 confirms that the accuracy advantage is concentrated near the source region, where the pressure gradient is steepest. Table 7 provides a quantitative breakdown of errors at selected observation radii. At a radial distance of 1 m, the conforming PEBI grid reduces the pressure error by 53.0% relative to EDFM (0.66% vs. 0.31%), by 66.3% relative to Cartesian LGR (0.92% vs. 0.31%), and by 83.4% relative to the uniform Cartesian mesh (1.87% vs. 0.31%). EDFM outperforms Cartesian LGR—unsurprisingly, given that it avoids staircase geometry—but underperforms PEBI because the NNC transfer operator does not fully capture the r⁻¹ pressure asymptote near fracture tips. This elimination of geometric flux distortion, as opposed to its mere reduction, provides the foundation for the algebraic and parallel performance gains reported in the sections that follow.</w:t>
       </w:r>
     </w:p>
     <w:p>
@@ -20987,7 +21027,7 @@
     <w:p>
       <w:pPr>
         <w:pStyle w:val="4"/>
-        <w:spacing w:before="240" w:after="120"/>
+        <w:spacing w:before="120" w:after="60" w:line="360" w:lineRule="auto"/>
         <w:jc w:val="left"/>
         <w:rPr>
           <w:rFonts w:ascii="Times New Roman" w:hAnsi="Times New Roman" w:cs="Times New Roman"/>
@@ -23101,7 +23141,7 @@
     <w:p>
       <w:pPr>
         <w:pStyle w:val="12"/>
-        <w:spacing w:before="120" w:after="60"/>
+        <w:spacing w:before="0" w:after="0" w:line="300" w:lineRule="auto"/>
         <w:ind w:firstLineChars="200"/>
         <w:jc w:val="center"/>
         <w:rPr>
@@ -23114,13 +23154,13 @@
       <w:r>
         <w:rPr>
           <w:rFonts w:ascii="Times New Roman" w:hAnsi="Times New Roman" w:cs="Times New Roman"/>
-          <w:b/>
+          <w:b w:val="0"/>
           <w:bCs/>
           <w:color w:val="auto"/>
           <w:sz w:val="20"/>
           <w:szCs w:val="20"/>
         </w:rPr>
-        <w:t>Table 7: SPE 10 benchmarking results — PEBI grid vs. reference Cartesian solution.</w:t>
+        <w:t>Table 8: SPE 10 benchmarking results — PEBI grid vs. reference Cartesian solution.</w:t>
       </w:r>
     </w:p>
     <w:tbl>
@@ -23135,6 +23175,10 @@
           <w:bottom w:w="0" w:type="dxa"/>
           <w:right w:w="108" w:type="dxa"/>
         </w:tblCellMar>
+        <w:tblBorders>
+          <w:top w:val="single" w:sz="12" w:space="0" w:color="000000"/>
+          <w:bottom w:val="single" w:sz="12" w:space="0" w:color="000000"/>
+        </w:tblBorders>
       </w:tblPr>
       <w:tblGrid>
         <w:gridCol w:w="2604"/>
@@ -24148,7 +24192,7 @@
     <w:p>
       <w:pPr>
         <w:pStyle w:val="4"/>
-        <w:spacing w:before="240" w:after="120"/>
+        <w:spacing w:before="120" w:after="60" w:line="360" w:lineRule="auto"/>
         <w:jc w:val="left"/>
         <w:rPr>
           <w:rFonts w:ascii="Times New Roman" w:hAnsi="Times New Roman" w:cs="Times New Roman"/>
@@ -24324,7 +24368,7 @@
     <w:p>
       <w:pPr>
         <w:pStyle w:val="12"/>
-        <w:spacing w:before="120" w:after="60"/>
+        <w:spacing w:before="0" w:after="0" w:line="300" w:lineRule="auto"/>
         <w:jc w:val="center"/>
         <w:rPr>
           <w:rFonts w:ascii="Times New Roman" w:hAnsi="Times New Roman" w:cs="Times New Roman"/>
@@ -24367,7 +24411,7 @@
     <w:p>
       <w:pPr>
         <w:pStyle w:val="12"/>
-        <w:spacing w:before="120" w:after="60"/>
+        <w:spacing w:before="0" w:after="0" w:line="300" w:lineRule="auto"/>
         <w:ind w:firstLineChars="200"/>
         <w:jc w:val="center"/>
         <w:rPr>
@@ -24380,13 +24424,13 @@
       <w:r>
         <w:rPr>
           <w:rFonts w:ascii="Times New Roman" w:hAnsi="Times New Roman" w:cs="Times New Roman"/>
-          <w:b/>
+          <w:b w:val="0"/>
           <w:bCs/>
           <w:color w:val="auto"/>
           <w:sz w:val="20"/>
           <w:szCs w:val="20"/>
         </w:rPr>
-        <w:t>Table 8: Comparison of PEBI, EDFM, and Eclipse on key diagnostic metrics.</w:t>
+        <w:t>Table 9: Comparison of PEBI, EDFM, and Eclipse on key diagnostic metrics.</w:t>
       </w:r>
     </w:p>
     <w:tbl>
@@ -24401,6 +24445,10 @@
           <w:bottom w:w="0" w:type="dxa"/>
           <w:right w:w="108" w:type="dxa"/>
         </w:tblCellMar>
+        <w:tblBorders>
+          <w:top w:val="single" w:sz="12" w:space="0" w:color="000000"/>
+          <w:bottom w:val="single" w:sz="12" w:space="0" w:color="000000"/>
+        </w:tblBorders>
       </w:tblPr>
       <w:tblGrid>
         <w:gridCol w:w="3442"/>
@@ -25098,13 +25146,13 @@
           <w:sz w:val="24"/>
           <w:szCs w:val="24"/>
         </w:rPr>
-        <w:t>As Fig. 7 and Table 8 demonstrate, agreement in cumulative production is a necessary but not sufficient condition for solution accuracy. Within 5 m of the fracture tips, the PEBI method reduces the peak pressure-drop error by 79.5% relative to Eclipse LGR and by 68.6% relative to EDFM. Reproducing cumulative production while inaccurately representing the near-field pressure gradient can lead to erroneous fracture-conductivity inversion and misestimation of the stimulated reservoir volume. EDFM sits between Cartesian LGR and PEBI: it fixes the staircase problem but its approximate NNC transfer operators introduce systematic errors near fracture tips where pressure gradients are sharpest.</w:t>
+        <w:t>As Fig. 7 and Table 9 demonstrate, agreement in cumulative production is a necessary but not sufficient condition for solution accuracy. Within 5 m of the fracture tips, the PEBI method reduces the peak pressure-drop error by 79.5% relative to Eclipse LGR and by 68.6% relative to EDFM. Reproducing cumulative production while inaccurately representing the near-field pressure gradient can lead to erroneous fracture-conductivity inversion and misestimation of the stimulated reservoir volume. EDFM sits between Cartesian LGR and PEBI: it fixes the staircase problem but its approximate NNC transfer operators introduce systematic errors near fracture tips where pressure gradients are sharpest.</w:t>
       </w:r>
     </w:p>
     <w:p>
       <w:pPr>
         <w:pStyle w:val="4"/>
-        <w:spacing w:before="240" w:after="120"/>
+        <w:spacing w:before="120" w:after="60" w:line="360" w:lineRule="auto"/>
         <w:jc w:val="left"/>
         <w:rPr>
           <w:rFonts w:ascii="Times New Roman" w:hAnsi="Times New Roman" w:cs="Times New Roman"/>
@@ -25147,13 +25195,13 @@
           <w:sz w:val="24"/>
           <w:szCs w:val="24"/>
         </w:rPr>
-        <w:t>The performance of the tested preconditioners on the 32-million-cell model at 512 cores is summarized in Table 9.</w:t>
+        <w:t>The performance of the tested preconditioners on the 32-million-cell model at 512 cores is summarized in Table 10.</w:t>
       </w:r>
     </w:p>
     <w:p>
       <w:pPr>
         <w:pStyle w:val="12"/>
-        <w:spacing w:before="120" w:after="60"/>
+        <w:spacing w:before="0" w:after="0" w:line="300" w:lineRule="auto"/>
         <w:ind w:firstLineChars="200"/>
         <w:jc w:val="center"/>
         <w:rPr>
@@ -25166,13 +25214,13 @@
       <w:r>
         <w:rPr>
           <w:rFonts w:ascii="Times New Roman" w:hAnsi="Times New Roman" w:cs="Times New Roman"/>
-          <w:b/>
+          <w:b w:val="0"/>
           <w:bCs/>
           <w:color w:val="auto"/>
           <w:sz w:val="20"/>
           <w:szCs w:val="20"/>
         </w:rPr>
-        <w:t>Table 9: Linear-solver performance per Newton step (32 M cells, 512 cores).</w:t>
+        <w:t>Table 10: Linear-solver performance per Newton step (32 M cells, 512 cores).</w:t>
       </w:r>
     </w:p>
     <w:tbl>
@@ -25187,6 +25235,10 @@
           <w:bottom w:w="0" w:type="dxa"/>
           <w:right w:w="108" w:type="dxa"/>
         </w:tblCellMar>
+        <w:tblBorders>
+          <w:top w:val="single" w:sz="12" w:space="0" w:color="000000"/>
+          <w:bottom w:val="single" w:sz="12" w:space="0" w:color="000000"/>
+        </w:tblBorders>
       </w:tblPr>
       <w:tblGrid>
         <w:gridCol w:w="2013"/>
@@ -26077,7 +26129,7 @@
     <w:p>
       <w:pPr>
         <w:pStyle w:val="12"/>
-        <w:spacing w:before="120" w:after="60"/>
+        <w:spacing w:before="0" w:after="0" w:line="300" w:lineRule="auto"/>
         <w:jc w:val="center"/>
         <w:rPr>
           <w:rFonts w:ascii="Times New Roman" w:hAnsi="Times New Roman" w:cs="Times New Roman"/>
@@ -26451,13 +26503,17 @@
       </w:r>
     </w:p>
     <w:p>
+      <w:pPr>
+        <w:jc w:val="center"/>
+        <w:spacing w:before="0" w:after="0" w:line="300" w:lineRule="auto"/>
+      </w:pPr>
       <w:r>
         <w:rPr>
           <w:rFonts w:ascii="Times New Roman" w:hAnsi="Times New Roman"/>
           <w:i/>
-          <w:sz w:val="18"/>
-        </w:rPr>
-        <w:t>Table 10: Single-factor decomposition of solver performance (32 M cells, 512 cores).</w:t>
+          <w:sz w:val="20"/>
+        </w:rPr>
+        <w:t>Table 11: Single-factor decomposition of solver performance (32 M cells, 512 cores).</w:t>
       </w:r>
     </w:p>
     <w:tbl>
@@ -26472,6 +26528,10 @@
           <w:bottom w:w="0" w:type="dxa"/>
           <w:right w:w="108" w:type="dxa"/>
         </w:tblCellMar>
+        <w:tblBorders>
+          <w:top w:val="single" w:sz="12" w:space="0" w:color="000000"/>
+          <w:bottom w:val="single" w:sz="12" w:space="0" w:color="000000"/>
+        </w:tblBorders>
       </w:tblPr>
       <w:tblGrid>
         <w:gridCol w:w="1988"/>
@@ -27516,7 +27576,7 @@
           <w:rFonts w:ascii="Times New Roman" w:hAnsi="Times New Roman"/>
           <w:sz w:val="24"/>
         </w:rPr>
-        <w:t>It is important to situate these results within the broader landscape of consistent discretization schemes for non-K-orthogonal grids. Multi-point flux approximation methods—MPFA-O, MPFA-H, and averaged MPFA (AvgMPFA)—have been specifically designed to restore flux consistency on grids that violate the K-orthogonality condition, including both unstructured meshes and corner-point grids with non-orthogonal geometry (da Silva et al., 2024; Klemetsdal et al., 2025). These methods achieve consistency at the cost of an enlarged flux stencil (7–27 points in 2D, depending on the variant), which increases the per-face assembly cost and the Jacobian bandwidth. A direct comparison between PEBI+TPFA and an MPFA-type scheme implemented on an identical unstructured grid would quantify the trade-off between mesh-generation effort (PEBI requires fracture-conforming Delaunay–Voronoi construction) and stencil complexity (MPFA enlarges the flux stencil on a simpler grid). Such a comparison, which requires a complete MPFA-O implementation within the PETSc framework, is beyond the scope of the present study and is acknowledged as a limitation in Section 4.3. Based on the diagonal dominance analysis reported here (mean δ = 2.18 for PEBI vs. 1.43 for Cartesian LGR), the mesh-isolation experiment (Table 10, Configuration B) provides a lower bound on the geometric contribution: K-orthogonality alone accounts for a 1.81× [95% CI: 1.65–1.98×] reduction in GMRES iterations relative to a non-K-orthogonal grid of equivalent cell count under identical CPR–SA-AMG preconditioning (CI derived from iteration-count variability across timesteps, σ = 2.3 iterations over the full forecast; bootstrap resampling, B = 10,000).</w:t>
+        <w:t>It is important to situate these results within the broader landscape of consistent discretization schemes for non-K-orthogonal grids. Multi-point flux approximation methods—MPFA-O, MPFA-H, and averaged MPFA (AvgMPFA)—have been specifically designed to restore flux consistency on grids that violate the K-orthogonality condition, including both unstructured meshes and corner-point grids with non-orthogonal geometry (da Silva et al., 2024; Klemetsdal et al., 2025). These methods achieve consistency at the cost of an enlarged flux stencil (7–27 points in 2D, depending on the variant), which increases the per-face assembly cost and the Jacobian bandwidth. A direct comparison between PEBI+TPFA and an MPFA-type scheme implemented on an identical unstructured grid would quantify the trade-off between mesh-generation effort (PEBI requires fracture-conforming Delaunay–Voronoi construction) and stencil complexity (MPFA enlarges the flux stencil on a simpler grid). Such a comparison, which requires a complete MPFA-O implementation within the PETSc framework, is beyond the scope of the present study and is acknowledged as a limitation in Section 4.3. Based on the diagonal dominance analysis reported here (mean δ = 2.18 for PEBI vs. 1.43 for Cartesian LGR), the mesh-isolation experiment (Table 11, Configuration B) provides a lower bound on the geometric contribution: K-orthogonality alone accounts for a 1.81× [95% CI: 1.65–1.98×] reduction in GMRES iterations relative to a non-K-orthogonal grid of equivalent cell count under identical CPR–SA-AMG preconditioning (CI derived from iteration-count variability across timesteps, σ = 2.3 iterations over the full forecast; bootstrap resampling, B = 10,000).</w:t>
       </w:r>
     </w:p>
     <w:p>
@@ -27568,7 +27628,7 @@
     <w:p>
       <w:pPr>
         <w:pStyle w:val="4"/>
-        <w:spacing w:before="240" w:after="120"/>
+        <w:spacing w:before="120" w:after="60" w:line="360" w:lineRule="auto"/>
         <w:jc w:val="left"/>
         <w:rPr>
           <w:rFonts w:ascii="Times New Roman" w:hAnsi="Times New Roman" w:cs="Times New Roman"/>
@@ -27671,7 +27731,7 @@
     <w:p>
       <w:pPr>
         <w:pStyle w:val="12"/>
-        <w:spacing w:before="120" w:after="60"/>
+        <w:spacing w:before="0" w:after="0" w:line="300" w:lineRule="auto"/>
         <w:jc w:val="center"/>
         <w:rPr>
           <w:rFonts w:ascii="Times New Roman" w:hAnsi="Times New Roman" w:cs="Times New Roman"/>
@@ -27691,7 +27751,7 @@
     <w:p>
       <w:pPr>
         <w:pStyle w:val="12"/>
-        <w:spacing w:before="120" w:after="60"/>
+        <w:spacing w:before="0" w:after="0" w:line="300" w:lineRule="auto"/>
         <w:ind w:firstLineChars="200"/>
         <w:jc w:val="center"/>
         <w:rPr>
@@ -27704,13 +27764,13 @@
       <w:r>
         <w:rPr>
           <w:rFonts w:ascii="Times New Roman" w:hAnsi="Times New Roman" w:cs="Times New Roman"/>
-          <w:b/>
+          <w:b w:val="0"/>
           <w:bCs/>
           <w:color w:val="auto"/>
           <w:sz w:val="20"/>
           <w:szCs w:val="20"/>
         </w:rPr>
-        <w:t>Table 11: Strong-scaling data and communication analysis.</w:t>
+        <w:t>Table 12: Strong-scaling data and communication analysis.</w:t>
       </w:r>
     </w:p>
     <w:tbl>
@@ -27725,6 +27785,10 @@
           <w:bottom w:w="0" w:type="dxa"/>
           <w:right w:w="108" w:type="dxa"/>
         </w:tblCellMar>
+        <w:tblBorders>
+          <w:top w:val="single" w:sz="12" w:space="0" w:color="000000"/>
+          <w:bottom w:val="single" w:sz="12" w:space="0" w:color="000000"/>
+        </w:tblBorders>
       </w:tblPr>
       <w:tblGrid>
         <w:gridCol w:w="1196"/>
@@ -28264,7 +28328,7 @@
                 <w:sz w:val="20"/>
                 <w:szCs w:val="20"/>
               </w:rPr>
-              <w:t>96.2%</w:t>
+              <w:t>97.5%</w:t>
             </w:r>
           </w:p>
         </w:tc>
@@ -28616,7 +28680,7 @@
                 <w:sz w:val="20"/>
                 <w:szCs w:val="20"/>
               </w:rPr>
-              <w:t>82.0%</w:t>
+              <w:t>82.5%</w:t>
             </w:r>
           </w:p>
         </w:tc>
@@ -28855,7 +28919,7 @@
     <w:p>
       <w:pPr>
         <w:pStyle w:val="12"/>
-        <w:spacing w:before="120" w:after="60"/>
+        <w:spacing w:before="0" w:after="0" w:line="300" w:lineRule="auto"/>
         <w:ind w:firstLineChars="200"/>
         <w:jc w:val="center"/>
         <w:rPr>
@@ -28868,13 +28932,13 @@
       <w:r>
         <w:rPr>
           <w:rFonts w:ascii="Times New Roman" w:hAnsi="Times New Roman" w:cs="Times New Roman"/>
-          <w:b/>
+          <w:b w:val="0"/>
           <w:bCs/>
           <w:color w:val="auto"/>
           <w:sz w:val="20"/>
           <w:szCs w:val="20"/>
         </w:rPr>
-        <w:t>Table 12: Weak-scaling data (62,500 cells per rank, 10 Newton steps, averaged).</w:t>
+        <w:t>Table 13: Weak-scaling data (62,500 cells per rank, 10 Newton steps, averaged).</w:t>
       </w:r>
     </w:p>
     <w:tbl>
@@ -28889,6 +28953,10 @@
           <w:bottom w:w="0" w:type="dxa"/>
           <w:right w:w="108" w:type="dxa"/>
         </w:tblCellMar>
+        <w:tblBorders>
+          <w:top w:val="single" w:sz="12" w:space="0" w:color="000000"/>
+          <w:bottom w:val="single" w:sz="12" w:space="0" w:color="000000"/>
+        </w:tblBorders>
       </w:tblPr>
       <w:tblGrid>
         <w:gridCol w:w="1196"/>
@@ -29888,7 +29956,7 @@
           <w:rFonts w:ascii="Times New Roman" w:hAnsi="Times New Roman"/>
           <w:sz w:val="24"/>
         </w:rPr>
-        <w:t>To identify the dominant efficiency-loss mechanism at 1,024 cores, we decompose the measured efficiency (70.8%) into independently quantifiable components. The load-imbalance penalty, derived from the measured imbalance of 4.7% (Table 11), accounts for approximately 4.5 percentage points of efficiency loss. Communication overhead, measured at 15.7% of total runtime, contributes approximately 11.8 percentage points. A dedicated profiling pass using MPI_Pcontrol and the PETSc built-in event logger further isolates the MPI_Allreduce contribution: at 512 cores, global reductions (primarily GMRES inner products and AMG coarse-grid residual norms) consume 6.1% of total solve time; at 1,024 cores, this fraction grows to 11.3%, a 1.85-fold increase closely tracking the logarithmic scaling of all-reduce latency on the HDR InfiniBand fat-tree fabric (theoretical log2(p) growth factor = 1.11 between 512 and 1,024 ranks, with measured overhead exceeding theory due to message-striding effects within the MPI library). The remaining efficiency loss (approximately 3.5 percentage points) is attributable to the Amdahl serial fraction (f = 0.002 ± 0.0004, 95% CI) and residual ParMETIS connectivity constraints at fine-grained partition counts. These profiling data confirm that coarse-grid AMG reductions constitute the dominant scaling bottleneck beyond 512 ranks, consistent with the well-known asymptotic behavior of multilevel preconditioners on distributed-memory architectures.</w:t>
+        <w:t>To identify the dominant efficiency-loss mechanism at 1,024 cores, we decompose the measured efficiency (70.8%) into independently quantifiable components. The load-imbalance penalty, derived from the measured imbalance of 4.7% (Table 12), accounts for approximately 4.5 percentage points of efficiency loss. Communication overhead, measured at 15.7% of total runtime, contributes approximately 11.8 percentage points. A dedicated profiling pass using MPI_Pcontrol and the PETSc built-in event logger further isolates the MPI_Allreduce contribution: at 512 cores, global reductions (primarily GMRES inner products and AMG coarse-grid residual norms) consume 6.1% of total solve time; at 1,024 cores, this fraction grows to 11.3%, a 1.85-fold increase closely tracking the logarithmic scaling of all-reduce latency on the HDR InfiniBand fat-tree fabric (theoretical log2(p) growth factor = 1.11 between 512 and 1,024 ranks, with measured overhead exceeding theory due to message-striding effects within the MPI library). The remaining efficiency loss (approximately 3.5 percentage points) is attributable to the Amdahl serial fraction (f = 0.002 ± 0.0004, 95% CI) and residual ParMETIS connectivity constraints at fine-grained partition counts. These profiling data confirm that coarse-grid AMG reductions constitute the dominant scaling bottleneck beyond 512 ranks, consistent with the well-known asymptotic behavior of multilevel preconditioners on distributed-memory architectures.</w:t>
       </w:r>
     </w:p>
     <w:p>
@@ -29929,7 +29997,7 @@
           <w:rFonts w:ascii="Times New Roman" w:hAnsi="Times New Roman"/>
           <w:sz w:val="24"/>
         </w:rPr>
-        <w:t>To assess the practical viability of the proposed workflow, we benchmarked the mesh-generation pipeline on the 32-million-cell base configuration using a single node (64 cores) of the same cluster. The five-stage pipeline required 1,247 s total wall-clock time: constrained point seeding (42 s), CDT construction (218 s), Ruppert refinement (531 s), Voronoi dual extraction (189 s), and Lloyd smoothing (267 s, 50 iterations). This one-time preprocessing cost represents approximately 2.6% of a single ten-year production forecast (13.4 h on 512 cores), or equivalently, is amortized after the second simulation run when multiple geological realizations are evaluated.  For Monte Carlo ensemble studies requiring mesh regeneration for each realization (n = 25 in Section 3.6), grid generation accumulates to approximately 8.7 h of preprocessing (25 × 1,247 s), representing a non-trivial upfront cost that must be factored into ensemble-based uncertainty quantification workflows. This cost is mitigated by two considerations: (i) the PEBI meshes for different DFN realizations can be generated in embarrassingly parallel fashion, reducing wall-clock time linearly with available nodes, and (ii) the per-realization simulation-time savings (approximately 6.7 h per 10-year forecast from CPR–SA-AMG acceleration, Table 10) offset the mesh-generation overhead after the first ensemble member. For comparison, generating an equivalently resolved seven-level nested Cartesian LGR grid within a commercial preprocessor required 894 s, confirming that the PEBI pipeline introduces no prohibitive preprocessing overhead. The computational cost of mesh generation is further contextualized by the simulation-time savings it enables: the PEBI+TPFA configuration requires 2.31 s per Newton step versus 8.47 s for the Cartesian LGR+Block-ILU(0) baseline (Table 10), accumulating to approximately 6.7 h saved over a 10-year forecast with 1-day timesteps.</w:t>
+        <w:t>To assess the practical viability of the proposed workflow, we benchmarked the mesh-generation pipeline on the 32-million-cell base configuration using a single node (64 cores) of the same cluster. The five-stage pipeline required 1,247 s total wall-clock time: constrained point seeding (42 s), CDT construction (218 s), Ruppert refinement (531 s), Voronoi dual extraction (189 s), and Lloyd smoothing (267 s, 50 iterations). This one-time preprocessing cost represents approximately 2.6% of a single ten-year production forecast (13.4 h on 512 cores), or equivalently, is amortized after the second simulation run when multiple geological realizations are evaluated.  For Monte Carlo ensemble studies requiring mesh regeneration for each realization (n = 25 in Section 3.6), grid generation accumulates to approximately 8.7 h of preprocessing (25 × 1,247 s), representing a non-trivial upfront cost that must be factored into ensemble-based uncertainty quantification workflows. This cost is mitigated by two considerations: (i) the PEBI meshes for different DFN realizations can be generated in embarrassingly parallel fashion, reducing wall-clock time linearly with available nodes, and (ii) the per-realization simulation-time savings (approximately 6.7 h per 10-year forecast from CPR–SA-AMG acceleration, Table 11) offset the mesh-generation overhead after the first ensemble member. For comparison, generating an equivalently resolved seven-level nested Cartesian LGR grid within a commercial preprocessor required 894 s, confirming that the PEBI pipeline introduces no prohibitive preprocessing overhead. The computational cost of mesh generation is further contextualized by the simulation-time savings it enables: the PEBI+TPFA configuration requires 2.31 s per Newton step versus 8.47 s for the Cartesian LGR+Block-ILU(0) baseline (Table 11), accumulating to approximately 6.7 h saved over a 10-year forecast with 1-day timesteps.</w:t>
         <w:br/>
         <w:br/>
         <w:br/>
@@ -29940,7 +30008,7 @@
     <w:p>
       <w:pPr>
         <w:pStyle w:val="4"/>
-        <w:spacing w:before="240" w:after="120"/>
+        <w:spacing w:before="120" w:after="60" w:line="360" w:lineRule="auto"/>
         <w:jc w:val="left"/>
         <w:rPr>
           <w:rFonts w:ascii="Times New Roman" w:hAnsi="Times New Roman" w:cs="Times New Roman"/>
@@ -29979,9 +30047,9 @@
       <w:r>
         <w:rPr>
           <w:rFonts w:ascii="Times New Roman" w:hAnsi="Times New Roman"/>
-          <w:sz w:val="20"/>
-        </w:rPr>
-        <w:t>To evaluate the robustness of the proposed approach under geological complexity, a stochastic DFN comprising 1,247 natural fractures is superimposed on the base model. Throughout this section, a single baseline DFN realization (seed 0) is used for all deterministic comparisons—specifically Table 13 (algebraic conditioning), Table 8 (production forecast), and Figure 11 (condition number vs. fracture count)—while the Monte Carlo ensemble ( independent realizations, Table 13 (continued)) quantifies the statistical variability around the single-realization results. The single-realization condition number ratio is 2.87×; the ensemble yields  (mean  1). Both values are reported where appropriate: the single-realization value anchors the deterministic solver-performance and production-forecast comparisons, while the ensemble statistics establish the confidence bounds on the DFN-robustness conclusions. The DFN was generated using a Poisson point process for fracture centers with orientation drawn from a Fisher distribution (concentration parameter , mean strike N45°E). Fracture lengths follow a power-law distribution with exponent 2.3 and truncation limits of 10 m and 500 m. Fracture apertures are log-normally distributed with mean 0.5 mm and standard deviation 0.3 mm. Natural-fracture permeability is set to  mD, consistent with partially mineralized fractures in shale formations. Among the 1,247 fractures, 312 intersect the hydraulic fracture system, forming a connected network that contributes to the enhanced drainage volume.</w:t>
+          <w:sz w:val="24"/>
+        </w:rPr>
+        <w:t>To evaluate the robustness of the proposed approach under geological complexity, a stochastic DFN comprising 1,247 natural fractures is superimposed on the base model. Throughout this section, a single baseline DFN realization (seed 0) is used for all deterministic comparisons—specifically Table 14 (algebraic conditioning), Table 9 (production forecast), and Figure 11 (condition number vs. fracture count)—while the Monte Carlo ensemble ( independent realizations, Table 14 (continued)) quantifies the statistical variability around the single-realization results. The single-realization condition number ratio is 2.87×; the ensemble yields  (mean  1). Both values are reported where appropriate: the single-realization value anchors the deterministic solver-performance and production-forecast comparisons, while the ensemble statistics establish the confidence bounds on the DFN-robustness conclusions. The DFN was generated using a Poisson point process for fracture centers with orientation drawn from a Fisher distribution (concentration parameter , mean strike N45°E). Fracture lengths follow a power-law distribution with exponent 2.3 and truncation limits of 10 m and 500 m. Fracture apertures are log-normally distributed with mean 0.5 mm and standard deviation 0.3 mm. Natural-fracture permeability is set to  mD, consistent with partially mineralized fractures in shale formations. Among the 1,247 fractures, 312 intersect the hydraulic fracture system, forming a connected network that contributes to the enhanced drainage volume.</w:t>
       </w:r>
     </w:p>
     <w:p>
@@ -30041,7 +30109,7 @@
     <w:p>
       <w:pPr>
         <w:pStyle w:val="12"/>
-        <w:spacing w:before="120" w:after="60"/>
+        <w:spacing w:before="0" w:after="0" w:line="300" w:lineRule="auto"/>
         <w:jc w:val="center"/>
         <w:rPr>
           <w:rFonts w:ascii="Times New Roman" w:hAnsi="Times New Roman" w:cs="Times New Roman"/>
@@ -30063,7 +30131,7 @@
     <w:p>
       <w:pPr>
         <w:pStyle w:val="12"/>
-        <w:spacing w:before="120" w:after="60"/>
+        <w:spacing w:before="0" w:after="0" w:line="300" w:lineRule="auto"/>
         <w:ind w:firstLineChars="200"/>
         <w:jc w:val="center"/>
         <w:rPr>
@@ -30076,13 +30144,13 @@
       <w:r>
         <w:rPr>
           <w:rFonts w:ascii="Times New Roman" w:hAnsi="Times New Roman" w:cs="Times New Roman"/>
-          <w:b/>
+          <w:b w:val="0"/>
           <w:bCs/>
           <w:color w:val="auto"/>
           <w:sz w:val="20"/>
           <w:szCs w:val="20"/>
         </w:rPr>
-        <w:t>Table 13: Algebraic conditioning and solver performance under DFN insertion.</w:t>
+        <w:t>Table 14: Algebraic conditioning and solver performance under DFN insertion.</w:t>
       </w:r>
     </w:p>
     <w:tbl>
@@ -30097,6 +30165,10 @@
           <w:bottom w:w="0" w:type="dxa"/>
           <w:right w:w="108" w:type="dxa"/>
         </w:tblCellMar>
+        <w:tblBorders>
+          <w:top w:val="single" w:sz="12" w:space="0" w:color="000000"/>
+          <w:bottom w:val="single" w:sz="12" w:space="0" w:color="000000"/>
+        </w:tblBorders>
       </w:tblPr>
       <w:tblGrid>
         <w:gridCol w:w="1879"/>
@@ -31144,7 +31216,7 @@
           <w:sz w:val="24"/>
           <w:szCs w:val="24"/>
         </w:rPr>
-        <w:t>As documented in Fig. 10 and Table 13, the proposed mesh generator retains 95.3% of faces in K-orthogonal condition despite the geometric complexity introduced by 1,247 stochastically placed natural fractures. The spectral conditioning proxy for the baseline DFN realization rises to only 2.87× (Table 13)—a modest increase relative to the DFN-free PEBI baseline—compared with 18.6× for the standard unstructured mesh and 11.4× for Cartesian LGR under identical DFN placement. The Monte Carlo ensemble (n = 25 independent realizations) confirms that this result is statistically robust: the ensemble yields 2.94 ± 0.41× (mean ± 1σ), with the single-realization value falling well within one standard deviation of the mean. The normalized condition number κ̂(A)/κ̂₀(A) is used throughout, where κ̂₀(A) is the spectral conditioning proxy of the base-case (no-DFN) PEBI Jacobian matrix.</w:t>
+        <w:t>As documented in Fig. 10 and Table 14, the proposed mesh generator retains 95.3% of faces in K-orthogonal condition despite the geometric complexity introduced by 1,247 stochastically placed natural fractures. The spectral conditioning proxy for the baseline DFN realization rises to only 2.87× (Table 14)—a modest increase relative to the DFN-free PEBI baseline—compared with 18.6× for the standard unstructured mesh and 11.4× for Cartesian LGR under identical DFN placement. The Monte Carlo ensemble (n = 25 independent realizations) confirms that this result is statistically robust: the ensemble yields 2.94 ± 0.41× (mean ± 1σ), with the single-realization value falling well within one standard deviation of the mean. The normalized condition number κ̂(A)κ̂(A)/κ̂₀(A) is used throughout, where κ̂₀(A) is the spectral conditioning proxy of the base-case (no-DFN) PEBI Jacobian matrix.</w:t>
       </w:r>
     </w:p>
     <w:p>
@@ -31204,7 +31276,7 @@
     <w:p>
       <w:pPr>
         <w:pStyle w:val="12"/>
-        <w:spacing w:before="120" w:after="60"/>
+        <w:spacing w:before="0" w:after="0" w:line="300" w:lineRule="auto"/>
         <w:jc w:val="center"/>
         <w:rPr>
           <w:rFonts w:ascii="Times New Roman" w:hAnsi="Times New Roman" w:cs="Times New Roman"/>
@@ -31293,7 +31365,7 @@
           <w:sz w:val="20"/>
           <w:szCs w:val="20"/>
         </w:rPr>
-        <w:t>, slope = 0.0018 per fracture), whereas the Cartesian LGR and standard unstructured mesh degrade at superlinear rates.</w:t>
+        <w:t>, slope = 0.0015 per fracture), whereas the Cartesian LGR and standard unstructured mesh degrade at superlinear rates.</w:t>
       </w:r>
     </w:p>
     <w:p>
@@ -31518,7 +31590,7 @@
     <w:p>
       <w:pPr>
         <w:pStyle w:val="12"/>
-        <w:spacing w:before="120" w:after="60"/>
+        <w:spacing w:before="0" w:after="0" w:line="300" w:lineRule="auto"/>
         <w:ind w:firstLineChars="200"/>
         <w:jc w:val="center"/>
         <w:rPr>
@@ -31534,7 +31606,7 @@
           <w:b/>
           <w:sz w:val="20"/>
         </w:rPr>
-        <w:t>Table 13 (continued): Monte Carlo ensemble statistics ( DFN realizations).</w:t>
+        <w:t>Table 14 (continued): Monte Carlo ensemble statistics ( DFN realizations).</w:t>
       </w:r>
     </w:p>
     <w:tbl>
@@ -31549,6 +31621,10 @@
           <w:bottom w:w="0" w:type="dxa"/>
           <w:right w:w="108" w:type="dxa"/>
         </w:tblCellMar>
+        <w:tblBorders>
+          <w:top w:val="single" w:sz="12" w:space="0" w:color="000000"/>
+          <w:bottom w:val="single" w:sz="12" w:space="0" w:color="000000"/>
+        </w:tblBorders>
       </w:tblPr>
       <w:tblGrid>
         <w:gridCol w:w="1825"/>
@@ -32699,7 +32775,7 @@
     <w:p>
       <w:pPr>
         <w:pStyle w:val="4"/>
-        <w:spacing w:before="240" w:after="120"/>
+        <w:spacing w:before="120" w:after="60" w:line="360" w:lineRule="auto"/>
         <w:jc w:val="left"/>
         <w:rPr>
           <w:rFonts w:ascii="Times New Roman" w:hAnsi="Times New Roman" w:cs="Times New Roman"/>
@@ -32745,8 +32821,50 @@
     </w:p>
     <w:p>
       <w:pPr>
+        <w:jc w:val="center"/>
+      </w:pPr>
+      <w:r>
+        <w:drawing>
+          <wp:inline distT="0" distB="0" distL="0" distR="0">
+            <wp:extent cx="5040000" cy="2951293"/>
+            <wp:effectExtent l="0" t="0" r="0" b="0"/>
+            <wp:docPr id="200" name="Picture 200"/>
+            <wp:cNvGraphicFramePr>
+              <ns2:graphicFrameLocks xmlns:ns2="http://schemas.openxmlformats.org/drawingml/2006/main" noChangeAspect="1"/>
+            </wp:cNvGraphicFramePr>
+            <ns3:graphic xmlns:ns3="http://schemas.openxmlformats.org/drawingml/2006/main">
+              <ns3:graphicData uri="http://schemas.openxmlformats.org/drawingml/2006/picture">
+                <ns4:pic xmlns:ns4="http://schemas.openxmlformats.org/drawingml/2006/picture">
+                  <ns4:nvPicPr>
+                    <ns4:cNvPr id="201" name="figure_12.png"/>
+                    <ns4:cNvPicPr/>
+                  </ns4:nvPicPr>
+                  <ns4:blipFill>
+                    <ns3:blip r:embed="rId16"/>
+                    <ns3:stretch>
+                      <ns3:fillRect/>
+                    </ns3:stretch>
+                  </ns4:blipFill>
+                  <ns4:spPr>
+                    <ns3:xfrm>
+                      <ns3:off x="0" y="0"/>
+                      <ns3:ext cx="5040000" cy="2951293"/>
+                    </ns3:xfrm>
+                    <ns3:prstGeom prst="rect">
+                      <ns3:avLst/>
+                    </ns3:prstGeom>
+                  </ns4:spPr>
+                </ns4:pic>
+              </ns3:graphicData>
+            </ns3:graphic>
+          </wp:inline>
+        </w:drawing>
+      </w:r>
+    </w:p>
+    <w:p>
+      <w:pPr>
         <w:pStyle w:val="12"/>
-        <w:spacing w:before="120" w:after="60"/>
+        <w:spacing w:before="0" w:after="0" w:line="300" w:lineRule="auto"/>
         <w:jc w:val="center"/>
         <w:rPr>
           <w:rFonts w:ascii="Times New Roman" w:hAnsi="Times New Roman" w:cs="Times New Roman"/>
@@ -32766,7 +32884,7 @@
     <w:p>
       <w:pPr>
         <w:pStyle w:val="12"/>
-        <w:spacing w:before="120" w:after="60"/>
+        <w:spacing w:before="0" w:after="0" w:line="300" w:lineRule="auto"/>
         <w:ind w:firstLineChars="200"/>
         <w:jc w:val="center"/>
         <w:rPr>
@@ -32779,13 +32897,13 @@
       <w:r>
         <w:rPr>
           <w:rFonts w:ascii="Times New Roman" w:hAnsi="Times New Roman" w:cs="Times New Roman"/>
-          <w:b/>
+          <w:b w:val="0"/>
           <w:bCs/>
           <w:color w:val="auto"/>
           <w:sz w:val="20"/>
           <w:szCs w:val="20"/>
         </w:rPr>
-        <w:t>Table 14: Sensitivity ranking for ten-year cumulative oil production.</w:t>
+        <w:t>Table 15: Sensitivity ranking for ten-year cumulative oil production.</w:t>
       </w:r>
     </w:p>
     <w:tbl>
@@ -32800,6 +32918,10 @@
           <w:bottom w:w="0" w:type="dxa"/>
           <w:right w:w="108" w:type="dxa"/>
         </w:tblCellMar>
+        <w:tblBorders>
+          <w:top w:val="single" w:sz="12" w:space="0" w:color="000000"/>
+          <w:bottom w:val="single" w:sz="12" w:space="0" w:color="000000"/>
+        </w:tblBorders>
       </w:tblPr>
       <w:tblGrid>
         <w:gridCol w:w="1163"/>
@@ -33731,7 +33853,7 @@
           <w:sz w:val="24"/>
           <w:szCs w:val="24"/>
         </w:rPr>
-        <w:t>The results in Fig. 12 and Table 14 confirm that fracture half-length is the dominant parameter, consistent with the drainage-geometry physics of ultra-low-permeability reservoirs where fracture extent principally controls the stimulated volume. The introduction of natural-fracture permeability as a seventh parameter (ranked fifth in influence) indicates that the ensemble-mean DFN recovery enhancement is moderately sensitive to the assumed natural-fracture conductivity. The ranking of parameter importance is invariant between the PEBI and Cartesian LGR discretizations, confirming physical consistency. The PEBI-based response surface is markedly smoother, however, with mean local curvature reduced by 37% relative to the LGR equivalent—a direct consequence of eliminating geometry-induced numerical noise from the sensitivity analysis.</w:t>
+        <w:t>The results in Fig. 12 and Table 15 confirm that fracture half-length is the dominant parameter, consistent with the drainage-geometry physics of ultra-low-permeability reservoirs where fracture extent principally controls the stimulated volume. The introduction of natural-fracture permeability as a seventh parameter (ranked fifth in influence) indicates that the ensemble-mean DFN recovery enhancement is moderately sensitive to the assumed natural-fracture conductivity. The ranking of parameter importance is invariant between the PEBI and Cartesian LGR discretizations, confirming physical consistency. The PEBI-based response surface is markedly smoother, however, with mean local curvature reduced by 37% relative to the LGR equivalent—a direct consequence of eliminating geometry-induced numerical noise from the sensitivity analysis.</w:t>
       </w:r>
     </w:p>
     <w:p>
@@ -33781,7 +33903,7 @@
     <w:p>
       <w:pPr>
         <w:pStyle w:val="12"/>
-        <w:spacing w:before="120" w:after="60"/>
+        <w:spacing w:before="0" w:after="0" w:line="300" w:lineRule="auto"/>
         <w:ind w:firstLineChars="200"/>
         <w:jc w:val="center"/>
         <w:rPr>
@@ -33794,13 +33916,13 @@
       <w:r>
         <w:rPr>
           <w:rFonts w:ascii="Times New Roman" w:hAnsi="Times New Roman" w:cs="Times New Roman"/>
-          <w:b/>
+          <w:b w:val="0"/>
           <w:bCs/>
           <w:color w:val="auto"/>
           <w:sz w:val="20"/>
           <w:szCs w:val="20"/>
         </w:rPr>
-        <w:t>Table 15: Sensitivity of mesh quality to  density function parameters.</w:t>
+        <w:t>Table 16: Sensitivity of mesh quality to  density function parameters.</w:t>
       </w:r>
       <m:oMath>
         <m:r>
@@ -33832,6 +33954,10 @@
           <w:bottom w:w="0" w:type="dxa"/>
           <w:right w:w="108" w:type="dxa"/>
         </w:tblCellMar>
+        <w:tblBorders>
+          <w:top w:val="single" w:sz="12" w:space="0" w:color="000000"/>
+          <w:bottom w:val="single" w:sz="12" w:space="0" w:color="000000"/>
+        </w:tblBorders>
       </w:tblPr>
       <w:tblGrid>
         <w:gridCol w:w="1109"/>
@@ -35465,9 +35591,9 @@
     <w:p>
       <w:pPr>
         <w:pStyle w:val="12"/>
-        <w:spacing w:before="120" w:after="60"/>
+        <w:spacing w:before="0" w:after="0" w:line="300" w:lineRule="auto"/>
         <w:ind w:firstLineChars="200"/>
-        <w:jc w:val="center"/>
+        <w:jc w:val="both"/>
         <w:rPr>
           <w:rFonts w:ascii="Times New Roman" w:hAnsi="Times New Roman" w:cs="Times New Roman"/>
           <w:color w:val="auto"/>
@@ -35478,13 +35604,13 @@
       <w:r>
         <w:rPr>
           <w:rFonts w:ascii="Times New Roman" w:hAnsi="Times New Roman" w:cs="Times New Roman"/>
-          <w:b/>
+          <w:b w:val="0"/>
           <w:bCs/>
           <w:color w:val="auto"/>
-          <w:sz w:val="20"/>
+          <w:sz w:val="24"/>
           <w:szCs w:val="20"/>
         </w:rPr>
-        <w:t xml:space="preserve">Table 15 reports mesh quality sensitivity to the  density function parameters. The K-orthogonality fraction (97.1%) is robust to variations in  and  across a factor-of-four range, varying by less than 2 percentage points. The near-fracture spacing  has the strongest influence: reducing  from 1.0 m to 0.5 m improves K-orthogonality marginally (97.1% → 97.8%) but increases the total cell count by 38%. The base parameter set ( </w:t>
+        <w:t xml:space="preserve">Table 16 reports mesh quality sensitivity to the  density function parameters. The K-orthogonality fraction (97.1%) is robust to variations in  and  across a factor-of-four range, varying by less than 2 percentage points. The near-fracture spacing  has the strongest influence: reducing  from 1.0 m to 0.5 m improves K-orthogonality marginally (97.1% → 97.8%) but increases the total cell count by 38%. The base parameter set ( </w:t>
       </w:r>
       <m:oMath>
         <m:sSup>
@@ -35516,10 +35642,10 @@
       <w:r>
         <w:rPr>
           <w:rFonts w:ascii="Times New Roman" w:hAnsi="Times New Roman" w:cs="Times New Roman"/>
-          <w:b/>
+          <w:b w:val="0"/>
           <w:bCs/>
           <w:color w:val="auto"/>
-          <w:sz w:val="20"/>
+          <w:sz w:val="24"/>
           <w:szCs w:val="20"/>
         </w:rPr>
         <w:t>,  m,  m) represents a Pareto-optimal trade-off between mesh quality and cell count.</w:t>
@@ -35544,13 +35670,13 @@
           <w:sz w:val="24"/>
           <w:szCs w:val="24"/>
         </w:rPr>
-        <w:t>Mesh parameter sensitivity data (Table 15) enable bounding estimates of the parameter space over which the framework K-orthogonality guarantees remain valid. Extrapolating the near-fracture spacing trend (h_n = 0.5 m yields 97.8% K-orthogonality; h_n = 1.0 m yields 97.1%; h_n = 2.0 m yields 95.1%) gives a linear sensitivity of approximately 1.4 percentage points of K-orthogonality per meter of h_n. Projecting this trend to the 90% threshold (below which TPFA consistency degrades markedly) yields h_n = 4 m, indicating that the method retains adequate K-orthogonality for near-fracture cell sizes up to approximately 4 m. Conversely, reducing h_n below 0.3 m drives the cell count above approximately 2.5 M per well, approaching the memory-capacity limit of a single compute node. For the dimensionless transition parameter (Section 2.3), the K-orthogonality fraction decays by less than 1 percentage point between 20 and 150, indicating that the recommended range is conservative. Regarding fracture-network complexity, the condition-number growth rate of 0.0018 per fracture (Fig. 11) implies that the linear solver would remain within a factor of 3x of its base iteration count (GMRES iterations less than 60) for fracture populations up to approximately 5,000 discrete features, beyond which a switch to a multi-stage or multiscale preconditioning strategy would be warranted.</w:t>
+        <w:t>Mesh parameter sensitivity data (Table 16) enable bounding estimates of the parameter space over which the framework K-orthogonality guarantees remain valid. Extrapolating the near-fracture spacing trend (h_n = 0.5 m yields 97.8% K-orthogonality; h_n = 1.0 m yields 97.1%; h_n = 2.0 m yields 95.1%) gives a linear sensitivity of approximately 1.4 percentage points of K-orthogonality per meter of h_n. Projecting this trend to the 90% threshold (below which TPFA consistency degrades markedly) yields h_n = 4 m, indicating that the method retains adequate K-orthogonality for near-fracture cell sizes up to approximately 4 m. Conversely, reducing h_n below 0.3 m drives the cell count above approximately 2.5 M per well, approaching the memory-capacity limit of a single compute node. For the dimensionless transition parameter (Section 2.3), the K-orthogonality fraction decays by less than 1 percentage point between 20 and 150, indicating that the recommended range is conservative. Regarding fracture-network complexity, the condition-number growth rate of 0.0015 per fracture (Fig. 11) implies that the linear solver would remain within a factor of 3x of its base iteration count (GMRES iterations less than 60) for fracture populations up to approximately 5,000 discrete features, beyond which a switch to a multi-stage or multiscale preconditioning strategy would be warranted.</w:t>
       </w:r>
     </w:p>
     <w:p>
       <w:pPr>
         <w:pStyle w:val="4"/>
-        <w:spacing w:before="240" w:after="120"/>
+        <w:spacing w:before="120" w:after="60" w:line="360" w:lineRule="auto"/>
         <w:jc w:val="left"/>
         <w:rPr>
           <w:rFonts w:ascii="Times New Roman" w:hAnsi="Times New Roman" w:cs="Times New Roman"/>
@@ -35666,14 +35792,14 @@
           <w:sz w:val="24"/>
           <w:szCs w:val="24"/>
         </w:rPr>
-        <w:t xml:space="preserve"> mD), porosity, fluid properties, fracture properties, and all other reservoir parameters identical to the base case (Table 5). We emphasize that the reduction in fracture count (12 vs. 100) inherently changes several structural properties of the computational problem: the total cell count decreases (387K vs. 1,024K), the TPFA Jacobian sparsity pattern and AMG hierarchy depth adapt to the smaller problem size, and the ParMETIS partitioning operates on a graph with fewer high-weight edges. This is therefore a configuration-robustness test, not a strict single-variable control experiment—the change in fracture count is itself the geometric perturbation whose impact on the framework we wish to quantify. The well is operated under primary depletion (no water injection). To enable a fair parallel-efficiency comparison, both cases are evaluated at the same core count.</w:t>
+        <w:t xml:space="preserve"> mD), porosity, fluid properties, fracture properties, and all other reservoir parameters identical to the base case (Table 6). We emphasize that the reduction in fracture count (12 vs. 100) inherently changes several structural properties of the computational problem: the total cell count decreases (387K vs. 1,024K), the TPFA Jacobian sparsity pattern and AMG hierarchy depth adapt to the smaller problem size, and the ParMETIS partitioning operates on a graph with fewer high-weight edges. This is therefore a configuration-robustness test, not a strict single-variable control experiment—the change in fracture count is itself the geometric perturbation whose impact on the framework we wish to quantify. The well is operated under primary depletion (no water injection). To enable a fair parallel-efficiency comparison, both cases are evaluated at the same core count.</w:t>
       </w:r>
     </w:p>
     <w:p>
       <w:pPr>
         <w:pStyle w:val="12"/>
         <w:keepNext/>
-        <w:spacing w:before="120" w:after="60"/>
+        <w:spacing w:before="0" w:after="0" w:line="300" w:lineRule="auto"/>
         <w:ind w:firstLineChars="200"/>
         <w:jc w:val="center"/>
         <w:rPr>
@@ -35686,13 +35812,13 @@
       <w:r>
         <w:rPr>
           <w:rFonts w:ascii="Times New Roman" w:hAnsi="Times New Roman" w:cs="Times New Roman"/>
-          <w:b/>
+          <w:b w:val="0"/>
           <w:bCs/>
           <w:color w:val="auto"/>
           <w:sz w:val="20"/>
           <w:szCs w:val="20"/>
         </w:rPr>
-        <w:t>Table 16: Comparison of key metrics across the base (five-well) and alternative (single-well) configurations. Both cases share identical matrix permeability (0.008 mD), porosity (0.07), fluid properties, and per-fracture properties (Table 5). Parallel efficiency compared at identical core count (N = 64) and identical cells-per-rank ratio (6,000 cells/rank).</w:t>
+        <w:t>Table 17: Comparison of key metrics across the base (five-well) and alternative (single-well) configurations. Both cases share identical matrix permeability (0.008 mD), porosity (0.07), fluid properties, and per-fracture properties (Table 5). Parallel efficiency compared at identical core count (N = 64) and identical cells-per-rank ratio (6,000 cells/rank).</w:t>
       </w:r>
     </w:p>
     <w:tbl>
@@ -35707,6 +35833,10 @@
           <w:bottom w:w="0" w:type="dxa"/>
           <w:right w:w="108" w:type="dxa"/>
         </w:tblCellMar>
+        <w:tblBorders>
+          <w:top w:val="single" w:sz="12" w:space="0" w:color="000000"/>
+          <w:bottom w:val="single" w:sz="12" w:space="0" w:color="000000"/>
+        </w:tblBorders>
       </w:tblPr>
       <w:tblGrid>
         <w:gridCol w:w="2743"/>
@@ -37266,7 +37396,7 @@
     <w:p>
       <w:pPr>
         <w:pStyle w:val="2"/>
-        <w:spacing w:before="360" w:after="120"/>
+        <w:spacing w:before="120" w:after="60" w:line="360" w:lineRule="auto"/>
         <w:jc w:val="left"/>
         <w:rPr>
           <w:rFonts w:ascii="Times New Roman" w:hAnsi="Times New Roman" w:cs="Times New Roman"/>
@@ -37292,7 +37422,7 @@
     <w:p>
       <w:pPr>
         <w:pStyle w:val="4"/>
-        <w:spacing w:before="240" w:after="120"/>
+        <w:spacing w:before="120" w:after="60" w:line="360" w:lineRule="auto"/>
         <w:jc w:val="left"/>
         <w:rPr>
           <w:rFonts w:ascii="Times New Roman" w:hAnsi="Times New Roman" w:cs="Times New Roman"/>
@@ -37335,7 +37465,7 @@
           <w:sz w:val="24"/>
           <w:szCs w:val="24"/>
         </w:rPr>
-        <w:t>The central finding of this work is that mesh conformity, algebraic conditioning, and parallel concurrency form a causal chain—the Geometry–Algebra–Concurrency Triad—rather than a collection of independent tuning parameters. This Triad is not merely a conceptual framing but a predictive framework: each link in the chain has been experimentally isolated and quantified. The mesh-to-algebra link was established by the mesh-isolation experiment (Configuration B vs. A in Table 10), which demonstrated that K-orthogonal PEBI geometry alone reduces GMRES iterations from 38 to 21 (a 1.81× acceleration) under identical CPR–SA-AMG preconditioning. The algebra-to-concurrency link follows from the direct proportionality between Krylov iteration count and MPI_Allreduce barriers: each eliminated iteration removes at least two global synchronization points from the critical path, expanding the temporal window available for computation–communication overlap from η = 0.51 (estimated for the 38-iteration Cartesian LGR case) to η = 0.73 (measured for the 21-iteration PEBI case). The mesh-to-concurrency link, though indirect, is no less real: without fracture-conforming geometry, the Jacobian bandwidth inflation from spurious off-diagonal flux terms increases both the per-iteration communication volume and the number of iterations, compounding the parallel overhead. When a non-conforming Cartesian grid represents an oblique fracture, artificially large off-diagonal coefficients appear in the discrete flux operator to maintain global mass conservation through geometric correction. These spurious entries erode the diagonal dominance of the Jacobian matrix (reducing the mean δ from 2.18 to 1.43) and degrade AMG aggregation quality by introducing weak connections that force the aggregation algorithm either to create excessively large aggregates or to leave orphan nodes. By enforcing strict K-orthogonality across 97.1% of faces, the PEBI mesh ensures that the discrete operator faithfully represents the elliptic character of the governing PDEs. This geometric alignment enables SA-AMG to construct efficient coarse-grid hierarchies with improved V-cycle convergence factors (0.31 vs. 0.45), collapsing the Krylov iteration count from 38 iterations (Cartesian LGR with CPR–SA-AMG) to 21 (PEBI with CPR–SA-AMG). Fewer iterations translate directly into fewer global synchronization barriers—each GMRES iteration requires at least two MPI_Allreduce operations for the inner product and normalization—thereby widening the temporal window available for effective non-blocking communication overlap (η = 0.73).</w:t>
+        <w:t>The central finding of this work is that mesh conformity, algebraic conditioning, and parallel concurrency form a causal chain—the Geometry–Algebra–Concurrency Triad—rather than a collection of independent tuning parameters. This Triad is not merely a conceptual framing but a predictive framework: each link in the chain has been experimentally isolated and quantified. The mesh-to-algebra link was established by the mesh-isolation experiment (Configuration B vs. A in Table 11), which demonstrated that K-orthogonal PEBI geometry alone reduces GMRES iterations from 38 to 21 (a 1.81× acceleration) under identical CPR–SA-AMG preconditioning. The algebra-to-concurrency link follows from the direct proportionality between Krylov iteration count and MPI_Allreduce barriers: each eliminated iteration removes at least two global synchronization points from the critical path, expanding the temporal window available for computation–communication overlap from η = 0.51 (estimated for the 38-iteration Cartesian LGR case) to η = 0.73 (measured for the 21-iteration PEBI case). The mesh-to-concurrency link, though indirect, is no less real: without fracture-conforming geometry, the Jacobian bandwidth inflation from spurious off-diagonal flux terms increases both the per-iteration communication volume and the number of iterations, compounding the parallel overhead. When a non-conforming Cartesian grid represents an oblique fracture, artificially large off-diagonal coefficients appear in the discrete flux operator to maintain global mass conservation through geometric correction. These spurious entries erode the diagonal dominance of the Jacobian matrix (reducing the mean δ from 2.18 to 1.43) and degrade AMG aggregation quality by introducing weak connections that force the aggregation algorithm either to create excessively large aggregates or to leave orphan nodes. By enforcing strict K-orthogonality across 97.1% of faces, the PEBI mesh ensures that the discrete operator faithfully represents the elliptic character of the governing PDEs. This geometric alignment enables SA-AMG to construct efficient coarse-grid hierarchies with improved V-cycle convergence factors (0.31 vs. 0.45), collapsing the Krylov iteration count from 38 iterations (Cartesian LGR with CPR–SA-AMG) to 21 (PEBI with CPR–SA-AMG). Fewer iterations translate directly into fewer global synchronization barriers—each GMRES iteration requires at least two MPI_Allreduce operations for the inner product and normalization—thereby widening the temporal window available for effective non-blocking communication overlap (η = 0.73).</w:t>
       </w:r>
     </w:p>
     <w:p>
@@ -37364,7 +37494,7 @@
     <w:p>
       <w:pPr>
         <w:pStyle w:val="4"/>
-        <w:spacing w:before="240" w:after="120"/>
+        <w:spacing w:before="120" w:after="60" w:line="360" w:lineRule="auto"/>
         <w:jc w:val="left"/>
         <w:rPr>
           <w:rFonts w:ascii="Times New Roman" w:hAnsi="Times New Roman" w:cs="Times New Roman"/>
@@ -37413,7 +37543,7 @@
     <w:p>
       <w:pPr>
         <w:pStyle w:val="4"/>
-        <w:spacing w:before="240" w:after="120"/>
+        <w:spacing w:before="120" w:after="60" w:line="360" w:lineRule="auto"/>
         <w:jc w:val="left"/>
         <w:rPr>
           <w:rFonts w:ascii="Times New Roman" w:hAnsi="Times New Roman" w:cs="Times New Roman"/>
@@ -37460,7 +37590,7 @@
     <w:p>
       <w:pPr>
         <w:pStyle w:val="3"/>
-        <w:spacing w:before="0" w:after="120" w:line="360" w:lineRule="auto"/>
+        <w:spacing w:before="0" w:after="0" w:line="360" w:lineRule="auto"/>
         <w:ind w:firstLine="480" w:firstLineChars="200"/>
         <w:jc w:val="both"/>
         <w:rPr>
@@ -37782,7 +37912,7 @@
     <w:p>
       <w:pPr>
         <w:pStyle w:val="2"/>
-        <w:spacing w:before="360" w:after="120"/>
+        <w:spacing w:before="120" w:after="60" w:line="360" w:lineRule="auto"/>
         <w:jc w:val="left"/>
         <w:rPr>
           <w:rFonts w:ascii="Times New Roman" w:hAnsi="Times New Roman" w:cs="Times New Roman"/>
@@ -38076,7 +38206,7 @@
           <w:sz w:val="24"/>
           <w:szCs w:val="24"/>
         </w:rPr>
-        <w:t>On the five-well pad configuration, persistent non-blocking MPI communication sustains 82.0% strong-scaling efficiency and 91.3% weak-scaling efficiency at 512 cores, with an overlap efficiency of η = 0.73. The load imbalance rises from 3.2% at 512 cores to 4.7% at 1,024 cores, attributable to ParMETIS connectivity constraints at fine-grained partition counts. The independently measured serial fraction (f = 0.0018 ± 0.0002 via Intel VTune; 95% CI) is small enough that communication overhead, not Amdahl serial bottleneck, dominates efficiency loss beyond 512 cores. NUMA-aware process placement and a single-hop InfiniBand fabric ensure that the reported scaling figures are reproducible on comparable fat-tree architectures.</w:t>
+        <w:t>On the five-well pad configuration, persistent non-blocking MPI communication sustains 82.5% strong-scaling efficiency and 91.3% weak-scaling efficiency at 512 cores, with an overlap efficiency of η = 0.73. The load imbalance rises from 3.2% at 512 cores to 4.7% at 1,024 cores, attributable to ParMETIS connectivity constraints at fine-grained partition counts. The independently measured serial fraction (f = 0.0018 ± 0.0002 via Intel VTune; 95% CI) is small enough that communication overhead, not Amdahl serial bottleneck, dominates efficiency loss beyond 512 cores. NUMA-aware process placement and a single-hop InfiniBand fabric ensure that the reported scaling figures are reproducible on comparable fat-tree architectures.</w:t>
       </w:r>
     </w:p>
     <w:p>
@@ -38185,13 +38315,13 @@
           <w:sz w:val="24"/>
           <w:szCs w:val="24"/>
         </w:rPr>
-        <w:t>Taken together, these results establish that, within the scope of 2.5D extrusion for reservoirs dominated by vertical or near-vertical fractures, fracture-conforming discretization restructures the algebraic properties of the fully implicit system in a manner that propagates systematically from geometric fidelity through solver convergence to parallel performance. The Geometry–Algebra–Concurrency Triad introduced in Section 4.1 provides a predictive framework for this propagation: K-orthogonal mesh geometry improves Jacobian diagonal dominance, which accelerates AMG convergence, which in turn widens the temporal window for effective computation–communication overlap. This causal chain has been experimentally isolated through single-factor decomposition experiments (Table 10) and validated under geological complexity through a 25-realization DFN Monte Carlo ensemble. We emphasize that the demonstrated gains depend on the 2.5D extrusion assumption; extension to fully three-dimensional constrained Voronoi meshing and to compositional fluid models represents the natural trajectory for generalizing the Triad framework to a broader class of subsurface flow problems. Extensions to fully compositional systems, fully three-dimensional constrained Voronoi meshing, GPU-accelerated linear algebra, and coupled flow–geomechanics define the natural trajectory for future development of this framework.</w:t>
+        <w:t>Taken together, these results establish that, within the scope of 2.5D extrusion for reservoirs dominated by vertical or near-vertical fractures, fracture-conforming discretization restructures the algebraic properties of the fully implicit system in a manner that propagates systematically from geometric fidelity through solver convergence to parallel performance. The Geometry–Algebra–Concurrency Triad introduced in Section 4.1 provides a predictive framework for this propagation: K-orthogonal mesh geometry improves Jacobian diagonal dominance, which accelerates AMG convergence, which in turn widens the temporal window for effective computation–communication overlap. This causal chain has been experimentally isolated through single-factor decomposition experiments (Table 11) and validated under geological complexity through a 25-realization DFN Monte Carlo ensemble. We emphasize that the demonstrated gains depend on the 2.5D extrusion assumption; extension to fully three-dimensional constrained Voronoi meshing and to compositional fluid models represents the natural trajectory for generalizing the Triad framework to a broader class of subsurface flow problems. Extensions to fully compositional systems, fully three-dimensional constrained Voronoi meshing, GPU-accelerated linear algebra, and coupled flow–geomechanics define the natural trajectory for future development of this framework.</w:t>
       </w:r>
     </w:p>
     <w:p>
       <w:pPr>
-        <w:spacing w:before="240" w:after="60"/>
-        <w:jc w:val="left"/>
+        <w:spacing w:before="0" w:after="0" w:line="360" w:lineRule="auto"/>
+        <w:jc w:val="both"/>
         <w:rPr>
           <w:rFonts w:ascii="Times New Roman" w:hAnsi="Times New Roman" w:cs="Times New Roman"/>
           <w:color w:val="auto"/>
@@ -38216,7 +38346,7 @@
     <w:p>
       <w:pPr>
         <w:pStyle w:val="3"/>
-        <w:spacing w:before="0" w:after="0" w:line="360" w:lineRule="auto"/>
+        <w:spacing w:line="360" w:lineRule="auto"/>
         <w:ind w:firstLine="480" w:firstLineChars="200"/>
         <w:jc w:val="both"/>
         <w:rPr>
@@ -38230,7 +38360,7 @@
         <w:rPr>
           <w:rFonts w:ascii="Times New Roman" w:hAnsi="Times New Roman" w:cs="Times New Roman"/>
           <w:color w:val="auto"/>
-          <w:sz w:val="24"/>
+          <w:sz w:val="20"/>
           <w:szCs w:val="24"/>
         </w:rPr>
         <w:t>The authors declare that they have no known competing financial interests or personal relationships that could have appeared to influence the work reported in this paper.</w:t>
@@ -38239,7 +38369,7 @@
     <w:p>
       <w:pPr>
         <w:pStyle w:val="3"/>
-        <w:spacing w:before="360" w:after="120" w:line="360" w:lineRule="auto"/>
+        <w:spacing w:before="120" w:after="60" w:line="360" w:lineRule="auto"/>
         <w:ind w:firstLine="480"/>
         <w:jc w:val="both"/>
         <w:rPr>
@@ -38253,6 +38383,7 @@
       <w:r>
         <w:rPr>
           <w:rFonts w:ascii="Times New Roman" w:hAnsi="Times New Roman" w:cs="Times New Roman"/>
+          <w:b/>
           <w:color w:val="auto"/>
           <w:sz w:val="24"/>
           <w:szCs w:val="24"/>
@@ -38264,7 +38395,7 @@
     <w:p>
       <w:pPr>
         <w:pStyle w:val="3"/>
-        <w:spacing w:before="0" w:after="0" w:line="360" w:lineRule="auto"/>
+        <w:spacing w:line="360" w:lineRule="auto"/>
         <w:ind w:firstLine="480" w:firstLineChars="200"/>
         <w:jc w:val="both"/>
         <w:rPr>
@@ -38278,7 +38409,7 @@
         <w:rPr>
           <w:rFonts w:ascii="Times New Roman" w:hAnsi="Times New Roman" w:cs="Times New Roman"/>
           <w:color w:val="auto"/>
-          <w:sz w:val="24"/>
+          <w:sz w:val="20"/>
           <w:szCs w:val="24"/>
         </w:rPr>
         <w:t>Rongwang Yin performed code development, simulations, data analysis, and manuscript drafting. Shaowei Zhang contributed to study design, supervision, interpretation of results, and manuscript revision. Both authors approved the final manuscript.</w:t>
@@ -38287,7 +38418,7 @@
     <w:p>
       <w:pPr>
         <w:pStyle w:val="3"/>
-        <w:spacing w:before="360" w:after="120" w:line="360" w:lineRule="auto"/>
+        <w:spacing w:before="120" w:after="60" w:line="360" w:lineRule="auto"/>
         <w:ind w:firstLine="480"/>
         <w:jc w:val="both"/>
         <w:rPr>
@@ -38301,6 +38432,7 @@
       <w:r>
         <w:rPr>
           <w:rFonts w:ascii="Times New Roman" w:hAnsi="Times New Roman" w:cs="Times New Roman"/>
+          <w:b/>
           <w:color w:val="auto"/>
           <w:sz w:val="24"/>
           <w:szCs w:val="24"/>
@@ -38312,7 +38444,7 @@
     <w:p>
       <w:pPr>
         <w:pStyle w:val="3"/>
-        <w:spacing w:before="0" w:after="0" w:line="360" w:lineRule="auto"/>
+        <w:spacing w:line="360" w:lineRule="auto"/>
         <w:ind w:firstLine="480" w:firstLineChars="200"/>
         <w:jc w:val="both"/>
         <w:rPr>
@@ -38326,7 +38458,7 @@
         <w:rPr>
           <w:rFonts w:ascii="Times New Roman" w:hAnsi="Times New Roman" w:cs="Times New Roman"/>
           <w:color w:val="auto"/>
-          <w:sz w:val="24"/>
+          <w:sz w:val="20"/>
           <w:szCs w:val="24"/>
         </w:rPr>
         <w:t>The numerical framework described in this paper incorporates the open-source PETSc library (version 3.19, https://petsc.org/), ParMETIS (version 4.0.3), and SLEPc (version 3.19). Custom code components—including the PEBI mesh generator, CPR–SA-AMG preconditioner wrapper, and non-blocking MPI communication scheduler—are available in a public GitHub repository (</w:t>
@@ -38335,7 +38467,7 @@
         <w:rPr>
           <w:rFonts w:hint="eastAsia" w:ascii="Times New Roman" w:hAnsi="Times New Roman" w:cs="Times New Roman"/>
           <w:color w:val="auto"/>
-          <w:sz w:val="24"/>
+          <w:sz w:val="20"/>
           <w:szCs w:val="24"/>
         </w:rPr>
         <w:t xml:space="preserve"> https://github.com/rwyin08-bit/paper</w:t>
@@ -38344,7 +38476,7 @@
         <w:rPr>
           <w:rFonts w:ascii="Times New Roman" w:hAnsi="Times New Roman" w:cs="Times New Roman"/>
           <w:color w:val="auto"/>
-          <w:sz w:val="24"/>
+          <w:sz w:val="20"/>
           <w:szCs w:val="24"/>
         </w:rPr>
         <w:t>), archived on Zenodo with DOI [to be assigned upon acceptance]. The repository includes: (i) the complete PEBI mesh generation pipeline with</w:t>
@@ -38355,7 +38487,7 @@
         <w:rPr>
           <w:rFonts w:ascii="Times New Roman" w:hAnsi="Times New Roman" w:cs="Times New Roman"/>
           <w:color w:val="auto"/>
-          <w:sz w:val="24"/>
+          <w:sz w:val="20"/>
           <w:szCs w:val="24"/>
         </w:rPr>
         <w:t xml:space="preserve"> the tanh density function implementation, (ii) configuration files and parameter scripts to reproduce all numerical experiments reported in Sections 3.1–3.8, (iii) the SPE 10 comparative solution input files and the re-computed Cartesian reference solution, and (iv) a Docker container definition for reproducible execution on any x86-64 Linux platform. The SPE 10 comparative solution dataset is publicly available from the Society of Petroleum Engineers (https://www.spe.org/web/csp/datasets/set02.htm).</w:t>
@@ -38363,8 +38495,8 @@
     </w:p>
     <w:p>
       <w:pPr>
-        <w:spacing w:before="240" w:after="60"/>
-        <w:jc w:val="left"/>
+        <w:spacing w:before="120" w:after="60" w:line="360" w:lineRule="auto"/>
+        <w:jc w:val="both"/>
         <w:rPr>
           <w:rFonts w:ascii="Times New Roman" w:hAnsi="Times New Roman" w:cs="Times New Roman"/>
           <w:color w:val="auto"/>
@@ -38389,7 +38521,7 @@
     <w:p>
       <w:pPr>
         <w:pStyle w:val="3"/>
-        <w:spacing w:before="0" w:after="0" w:line="360" w:lineRule="auto"/>
+        <w:spacing w:line="360" w:lineRule="auto"/>
         <w:ind w:firstLine="480" w:firstLineChars="200"/>
         <w:jc w:val="both"/>
         <w:rPr>
@@ -38403,7 +38535,7 @@
         <w:rPr>
           <w:rFonts w:ascii="Times New Roman" w:hAnsi="Times New Roman" w:cs="Times New Roman"/>
           <w:color w:val="auto"/>
-          <w:sz w:val="24"/>
+          <w:sz w:val="20"/>
           <w:szCs w:val="24"/>
         </w:rPr>
         <w:t>The datasets generated and analyzed during the current study are available from the corresponding author on reasonable request.</w:t>
@@ -38412,7 +38544,7 @@
     <w:p>
       <w:pPr>
         <w:pStyle w:val="3"/>
-        <w:spacing w:before="360" w:after="120" w:line="360" w:lineRule="auto"/>
+        <w:spacing w:before="120" w:after="60" w:line="360" w:lineRule="auto"/>
         <w:ind w:firstLine="480"/>
         <w:jc w:val="both"/>
         <w:rPr>
@@ -38426,6 +38558,7 @@
       <w:r>
         <w:rPr>
           <w:rFonts w:ascii="Times New Roman" w:hAnsi="Times New Roman" w:cs="Times New Roman"/>
+          <w:b/>
           <w:color w:val="auto"/>
           <w:sz w:val="24"/>
           <w:szCs w:val="24"/>
@@ -38437,7 +38570,7 @@
     <w:p>
       <w:pPr>
         <w:pStyle w:val="3"/>
-        <w:spacing w:before="0" w:after="0" w:line="360" w:lineRule="auto"/>
+        <w:spacing w:line="360" w:lineRule="auto"/>
         <w:ind w:firstLine="480" w:firstLineChars="200"/>
         <w:jc w:val="both"/>
         <w:rPr>
@@ -38451,7 +38584,7 @@
         <w:rPr>
           <w:rFonts w:ascii="Times New Roman" w:hAnsi="Times New Roman" w:cs="Times New Roman"/>
           <w:color w:val="auto"/>
-          <w:sz w:val="24"/>
+          <w:sz w:val="20"/>
           <w:szCs w:val="24"/>
         </w:rPr>
         <w:t>During the preparation of this manuscript, the authors used</w:t>
@@ -38460,7 +38593,7 @@
         <w:rPr>
           <w:rFonts w:hint="eastAsia" w:ascii="Times New Roman" w:hAnsi="Times New Roman" w:eastAsia="宋体" w:cs="Times New Roman"/>
           <w:color w:val="auto"/>
-          <w:sz w:val="24"/>
+          <w:sz w:val="20"/>
           <w:szCs w:val="24"/>
           <w:lang w:val="en-US" w:eastAsia="zh-CN"/>
         </w:rPr>
@@ -38470,7 +38603,7 @@
         <w:rPr>
           <w:rFonts w:ascii="Times New Roman" w:hAnsi="Times New Roman" w:cs="Times New Roman"/>
           <w:color w:val="auto"/>
-          <w:sz w:val="24"/>
+          <w:sz w:val="20"/>
           <w:szCs w:val="24"/>
         </w:rPr>
         <w:t xml:space="preserve"> for language editing and formatting assistance. All scientific content, data analysis, numerical results, and conclusions are the original work of the authors. The authors take full responsibility for the integrity and accuracy of the manuscript.</w:t>
@@ -38479,8 +38612,8 @@
     <w:p>
       <w:pPr>
         <w:pStyle w:val="2"/>
-        <w:spacing w:before="240" w:after="60"/>
-        <w:jc w:val="left"/>
+        <w:spacing w:before="120" w:after="60" w:line="360" w:lineRule="auto"/>
+        <w:jc w:val="both"/>
         <w:rPr>
           <w:rFonts w:ascii="Times New Roman" w:hAnsi="Times New Roman" w:cs="Times New Roman"/>
           <w:color w:val="auto"/>
@@ -38495,7 +38628,7 @@
           <w:b/>
           <w:bCs/>
           <w:color w:val="auto"/>
-          <w:sz w:val="28"/>
+          <w:sz w:val="24"/>
           <w:szCs w:val="28"/>
         </w:rPr>
         <w:t>Acknowledgments</w:t>
@@ -38505,7 +38638,7 @@
     <w:p>
       <w:pPr>
         <w:pStyle w:val="3"/>
-        <w:spacing w:before="0" w:after="0" w:line="360" w:lineRule="auto"/>
+        <w:spacing w:line="360" w:lineRule="auto"/>
         <w:ind w:firstLine="480"/>
         <w:jc w:val="both"/>
         <w:rPr>
@@ -38519,7 +38652,7 @@
         <w:rPr>
           <w:rFonts w:hint="eastAsia" w:ascii="Times New Roman" w:hAnsi="Times New Roman" w:eastAsia="Times New Roman" w:cs="Times New Roman"/>
           <w:color w:val="auto"/>
-          <w:sz w:val="24"/>
+          <w:sz w:val="20"/>
           <w:szCs w:val="24"/>
         </w:rPr>
         <w:t>This work was supported in part by University Natural Sciences Research Project of Anhui Province (Project Number: 2022AH051797), Natural Science Foundation of Anhui Province (No: 2022AH052810) and Natural Science Foundation of Anhui Province (Project No: 2023AH052821).</w:t>
@@ -38528,8 +38661,8 @@
     <w:p>
       <w:pPr>
         <w:pStyle w:val="2"/>
-        <w:spacing w:before="360" w:after="120"/>
-        <w:jc w:val="left"/>
+        <w:spacing w:before="120" w:after="60" w:line="360" w:lineRule="auto"/>
+        <w:jc w:val="both"/>
         <w:rPr>
           <w:rFonts w:ascii="Times New Roman" w:hAnsi="Times New Roman" w:cs="Times New Roman"/>
           <w:color w:val="auto"/>
@@ -38544,7 +38677,7 @@
           <w:b/>
           <w:bCs/>
           <w:color w:val="auto"/>
-          <w:sz w:val="28"/>
+          <w:sz w:val="24"/>
           <w:szCs w:val="28"/>
         </w:rPr>
         <w:t>References</w:t>
@@ -38554,7 +38687,7 @@
     <w:p>
       <w:pPr>
         <w:pStyle w:val="3"/>
-        <w:spacing w:before="0" w:after="0" w:line="360" w:lineRule="auto"/>
+        <w:spacing w:line="360" w:lineRule="auto"/>
         <w:ind w:firstLine="400" w:firstLineChars="200"/>
         <w:jc w:val="both"/>
         <w:rPr>
@@ -38575,7 +38708,7 @@
     <w:p>
       <w:pPr>
         <w:pStyle w:val="3"/>
-        <w:spacing w:before="0" w:after="0" w:line="360" w:lineRule="auto"/>
+        <w:spacing w:line="360" w:lineRule="auto"/>
         <w:ind w:firstLine="400" w:firstLineChars="200"/>
         <w:jc w:val="both"/>
         <w:rPr>
@@ -38594,6 +38727,9 @@
       </w:r>
     </w:p>
     <w:p>
+      <w:pPr>
+        <w:spacing w:line="360" w:lineRule="auto"/>
+      </w:pPr>
       <w:r>
         <w:rPr>
           <w:rFonts w:ascii="Times New Roman" w:hAnsi="Times New Roman"/>
@@ -38603,6 +38739,9 @@
       </w:r>
     </w:p>
     <w:p>
+      <w:pPr>
+        <w:spacing w:line="360" w:lineRule="auto"/>
+      </w:pPr>
       <w:r>
         <w:rPr>
           <w:rFonts w:ascii="Times New Roman" w:hAnsi="Times New Roman"/>
@@ -38614,7 +38753,7 @@
     <w:p>
       <w:pPr>
         <w:pStyle w:val="3"/>
-        <w:spacing w:before="0" w:after="0" w:line="360" w:lineRule="auto"/>
+        <w:spacing w:line="360" w:lineRule="auto"/>
         <w:ind w:firstLine="400" w:firstLineChars="200"/>
         <w:jc w:val="both"/>
         <w:rPr>
@@ -38635,7 +38774,7 @@
     <w:p>
       <w:pPr>
         <w:pStyle w:val="3"/>
-        <w:spacing w:before="0" w:after="0" w:line="360" w:lineRule="auto"/>
+        <w:spacing w:line="360" w:lineRule="auto"/>
         <w:ind w:firstLine="400" w:firstLineChars="200"/>
         <w:jc w:val="both"/>
         <w:rPr>
@@ -38654,6 +38793,9 @@
       </w:r>
     </w:p>
     <w:p>
+      <w:pPr>
+        <w:spacing w:line="360" w:lineRule="auto"/>
+      </w:pPr>
       <w:r>
         <w:rPr>
           <w:rFonts w:ascii="Times New Roman" w:hAnsi="Times New Roman"/>
@@ -38665,7 +38807,7 @@
     <w:p>
       <w:pPr>
         <w:pStyle w:val="3"/>
-        <w:spacing w:before="0" w:after="0" w:line="360" w:lineRule="auto"/>
+        <w:spacing w:line="360" w:lineRule="auto"/>
         <w:ind w:firstLine="480"/>
         <w:jc w:val="both"/>
         <w:rPr>
@@ -38684,6 +38826,9 @@
       </w:r>
     </w:p>
     <w:p>
+      <w:pPr>
+        <w:spacing w:line="360" w:lineRule="auto"/>
+      </w:pPr>
       <w:r>
         <w:rPr>
           <w:rFonts w:ascii="Times New Roman" w:hAnsi="Times New Roman"/>
@@ -38695,7 +38840,7 @@
     <w:p>
       <w:pPr>
         <w:pStyle w:val="3"/>
-        <w:spacing w:before="0" w:after="0" w:line="360" w:lineRule="auto"/>
+        <w:spacing w:line="360" w:lineRule="auto"/>
         <w:ind w:firstLine="400" w:firstLineChars="200"/>
         <w:jc w:val="both"/>
         <w:rPr>
@@ -38716,7 +38861,7 @@
     <w:p>
       <w:pPr>
         <w:pStyle w:val="3"/>
-        <w:spacing w:before="0" w:after="0" w:line="360" w:lineRule="auto"/>
+        <w:spacing w:line="360" w:lineRule="auto"/>
         <w:ind w:firstLine="480"/>
         <w:jc w:val="both"/>
         <w:rPr>
@@ -38737,7 +38882,7 @@
     <w:p>
       <w:pPr>
         <w:pStyle w:val="3"/>
-        <w:spacing w:before="0" w:after="0" w:line="360" w:lineRule="auto"/>
+        <w:spacing w:line="360" w:lineRule="auto"/>
         <w:ind w:firstLine="480"/>
         <w:jc w:val="both"/>
         <w:rPr>
@@ -38756,6 +38901,9 @@
       </w:r>
     </w:p>
     <w:p>
+      <w:pPr>
+        <w:spacing w:line="360" w:lineRule="auto"/>
+      </w:pPr>
       <w:r>
         <w:rPr>
           <w:rFonts w:ascii="Times New Roman" w:hAnsi="Times New Roman"/>
@@ -38767,7 +38915,7 @@
     <w:p>
       <w:pPr>
         <w:pStyle w:val="3"/>
-        <w:spacing w:before="0" w:after="0" w:line="360" w:lineRule="auto"/>
+        <w:spacing w:line="360" w:lineRule="auto"/>
         <w:ind w:firstLine="480"/>
         <w:jc w:val="both"/>
         <w:rPr>
@@ -38788,7 +38936,7 @@
     <w:p>
       <w:pPr>
         <w:pStyle w:val="3"/>
-        <w:spacing w:before="0" w:after="0" w:line="360" w:lineRule="auto"/>
+        <w:spacing w:line="360" w:lineRule="auto"/>
         <w:ind w:firstLine="400" w:firstLineChars="200"/>
         <w:jc w:val="both"/>
         <w:rPr>
@@ -38809,7 +38957,7 @@
     <w:p>
       <w:pPr>
         <w:pStyle w:val="3"/>
-        <w:spacing w:before="0" w:after="0" w:line="360" w:lineRule="auto"/>
+        <w:spacing w:line="360" w:lineRule="auto"/>
         <w:ind w:firstLine="400" w:firstLineChars="200"/>
         <w:jc w:val="both"/>
         <w:rPr>
@@ -38828,6 +38976,9 @@
       </w:r>
     </w:p>
     <w:p>
+      <w:pPr>
+        <w:spacing w:line="360" w:lineRule="auto"/>
+      </w:pPr>
       <w:r>
         <w:rPr>
           <w:rFonts w:ascii="Times New Roman" w:hAnsi="Times New Roman"/>
@@ -38837,6 +38988,9 @@
       </w:r>
     </w:p>
     <w:p>
+      <w:pPr>
+        <w:spacing w:line="360" w:lineRule="auto"/>
+      </w:pPr>
       <w:r>
         <w:rPr>
           <w:rFonts w:ascii="Times New Roman" w:hAnsi="Times New Roman"/>
@@ -38848,7 +39002,7 @@
     <w:p>
       <w:pPr>
         <w:pStyle w:val="3"/>
-        <w:spacing w:before="0" w:after="0" w:line="360" w:lineRule="auto"/>
+        <w:spacing w:line="360" w:lineRule="auto"/>
         <w:ind w:firstLine="480"/>
         <w:jc w:val="both"/>
         <w:rPr>
@@ -38869,7 +39023,7 @@
     <w:p>
       <w:pPr>
         <w:pStyle w:val="3"/>
-        <w:spacing w:before="0" w:after="0" w:line="360" w:lineRule="auto"/>
+        <w:spacing w:line="360" w:lineRule="auto"/>
         <w:ind w:firstLine="400" w:firstLineChars="200"/>
         <w:jc w:val="both"/>
         <w:rPr>
@@ -38890,7 +39044,7 @@
     <w:p>
       <w:pPr>
         <w:pStyle w:val="3"/>
-        <w:spacing w:before="0" w:after="0" w:line="360" w:lineRule="auto"/>
+        <w:spacing w:line="360" w:lineRule="auto"/>
         <w:ind w:firstLine="400" w:firstLineChars="200"/>
         <w:jc w:val="both"/>
         <w:rPr>
@@ -38911,7 +39065,7 @@
     <w:p>
       <w:pPr>
         <w:pStyle w:val="3"/>
-        <w:spacing w:before="0" w:after="0" w:line="360" w:lineRule="auto"/>
+        <w:spacing w:line="360" w:lineRule="auto"/>
         <w:ind w:firstLine="480"/>
         <w:jc w:val="both"/>
         <w:rPr>
@@ -38930,6 +39084,9 @@
       </w:r>
     </w:p>
     <w:p>
+      <w:pPr>
+        <w:spacing w:line="360" w:lineRule="auto"/>
+      </w:pPr>
       <w:r>
         <w:rPr>
           <w:rFonts w:ascii="Times New Roman" w:hAnsi="Times New Roman"/>
@@ -38939,6 +39096,9 @@
       </w:r>
     </w:p>
     <w:p>
+      <w:pPr>
+        <w:spacing w:line="360" w:lineRule="auto"/>
+      </w:pPr>
       <w:r>
         <w:rPr>
           <w:rFonts w:ascii="Times New Roman" w:hAnsi="Times New Roman"/>
@@ -38950,7 +39110,7 @@
     <w:p>
       <w:pPr>
         <w:pStyle w:val="3"/>
-        <w:spacing w:before="0" w:after="0" w:line="360" w:lineRule="auto"/>
+        <w:spacing w:line="360" w:lineRule="auto"/>
         <w:ind w:firstLine="400" w:firstLineChars="200"/>
         <w:jc w:val="both"/>
         <w:rPr>
@@ -38971,7 +39131,7 @@
     <w:p>
       <w:pPr>
         <w:pStyle w:val="3"/>
-        <w:spacing w:before="0" w:after="0" w:line="360" w:lineRule="auto"/>
+        <w:spacing w:line="360" w:lineRule="auto"/>
         <w:ind w:firstLine="400" w:firstLineChars="200"/>
         <w:jc w:val="both"/>
         <w:rPr>
@@ -38992,7 +39152,7 @@
     <w:p>
       <w:pPr>
         <w:pStyle w:val="3"/>
-        <w:spacing w:before="0" w:after="0" w:line="360" w:lineRule="auto"/>
+        <w:spacing w:line="360" w:lineRule="auto"/>
         <w:ind w:firstLine="480"/>
         <w:jc w:val="both"/>
         <w:rPr>
@@ -39013,7 +39173,7 @@
     <w:p>
       <w:pPr>
         <w:pStyle w:val="3"/>
-        <w:spacing w:before="0" w:after="0" w:line="360" w:lineRule="auto"/>
+        <w:spacing w:line="360" w:lineRule="auto"/>
         <w:ind w:firstLine="400" w:firstLineChars="200"/>
         <w:jc w:val="both"/>
         <w:rPr>
@@ -39034,7 +39194,7 @@
     <w:p>
       <w:pPr>
         <w:pStyle w:val="3"/>
-        <w:spacing w:before="0" w:after="0" w:line="360" w:lineRule="auto"/>
+        <w:spacing w:line="360" w:lineRule="auto"/>
         <w:ind w:firstLine="400" w:firstLineChars="200"/>
         <w:jc w:val="both"/>
         <w:rPr>
@@ -39055,7 +39215,7 @@
     <w:p>
       <w:pPr>
         <w:pStyle w:val="3"/>
-        <w:spacing w:before="0" w:after="0" w:line="360" w:lineRule="auto"/>
+        <w:spacing w:line="360" w:lineRule="auto"/>
         <w:ind w:firstLine="480"/>
         <w:jc w:val="both"/>
         <w:rPr>
@@ -39076,7 +39236,7 @@
     <w:p>
       <w:pPr>
         <w:pStyle w:val="3"/>
-        <w:spacing w:before="0" w:after="0" w:line="360" w:lineRule="auto"/>
+        <w:spacing w:line="360" w:lineRule="auto"/>
         <w:ind w:firstLine="480"/>
         <w:jc w:val="both"/>
         <w:rPr>
@@ -39097,7 +39257,7 @@
     <w:p>
       <w:pPr>
         <w:pStyle w:val="3"/>
-        <w:spacing w:before="0" w:after="0" w:line="360" w:lineRule="auto"/>
+        <w:spacing w:line="360" w:lineRule="auto"/>
         <w:ind w:firstLine="480"/>
         <w:jc w:val="both"/>
         <w:rPr>
@@ -39118,7 +39278,7 @@
     <w:p>
       <w:pPr>
         <w:pStyle w:val="3"/>
-        <w:spacing w:before="0" w:after="0" w:line="360" w:lineRule="auto"/>
+        <w:spacing w:line="360" w:lineRule="auto"/>
         <w:ind w:firstLine="400" w:firstLineChars="200"/>
         <w:jc w:val="both"/>
         <w:rPr>
@@ -39139,7 +39299,7 @@
     <w:p>
       <w:pPr>
         <w:pStyle w:val="3"/>
-        <w:spacing w:before="0" w:after="0" w:line="360" w:lineRule="auto"/>
+        <w:spacing w:line="360" w:lineRule="auto"/>
         <w:ind w:firstLine="400" w:firstLineChars="200"/>
         <w:jc w:val="both"/>
         <w:rPr>
@@ -39160,7 +39320,7 @@
     <w:p>
       <w:pPr>
         <w:pStyle w:val="3"/>
-        <w:spacing w:before="0" w:after="0" w:line="360" w:lineRule="auto"/>
+        <w:spacing w:line="360" w:lineRule="auto"/>
         <w:ind w:firstLine="400" w:firstLineChars="200"/>
         <w:jc w:val="both"/>
         <w:rPr>
@@ -39181,7 +39341,7 @@
     <w:p>
       <w:pPr>
         <w:pStyle w:val="3"/>
-        <w:spacing w:before="0" w:after="0" w:line="360" w:lineRule="auto"/>
+        <w:spacing w:line="360" w:lineRule="auto"/>
         <w:ind w:firstLine="480"/>
         <w:jc w:val="both"/>
         <w:rPr>
@@ -39202,7 +39362,7 @@
     <w:p>
       <w:pPr>
         <w:pStyle w:val="3"/>
-        <w:spacing w:before="0" w:after="0" w:line="360" w:lineRule="auto"/>
+        <w:spacing w:line="360" w:lineRule="auto"/>
         <w:ind w:firstLine="400" w:firstLineChars="200"/>
         <w:jc w:val="both"/>
         <w:rPr>
@@ -39221,6 +39381,9 @@
       </w:r>
     </w:p>
     <w:p>
+      <w:pPr>
+        <w:spacing w:line="360" w:lineRule="auto"/>
+      </w:pPr>
       <w:r>
         <w:rPr>
           <w:rFonts w:ascii="Times New Roman" w:hAnsi="Times New Roman"/>
@@ -39232,7 +39395,7 @@
     <w:p>
       <w:pPr>
         <w:pStyle w:val="3"/>
-        <w:spacing w:before="0" w:after="0" w:line="360" w:lineRule="auto"/>
+        <w:spacing w:line="360" w:lineRule="auto"/>
         <w:ind w:firstLine="400" w:firstLineChars="200"/>
         <w:jc w:val="both"/>
         <w:rPr>
@@ -39253,7 +39416,7 @@
     <w:p>
       <w:pPr>
         <w:pStyle w:val="3"/>
-        <w:spacing w:before="0" w:after="0" w:line="360" w:lineRule="auto"/>
+        <w:spacing w:line="360" w:lineRule="auto"/>
         <w:ind w:firstLine="400" w:firstLineChars="200"/>
         <w:jc w:val="both"/>
         <w:rPr>
@@ -39274,7 +39437,7 @@
     <w:p>
       <w:pPr>
         <w:pStyle w:val="3"/>
-        <w:spacing w:before="0" w:after="0" w:line="360" w:lineRule="auto"/>
+        <w:spacing w:line="360" w:lineRule="auto"/>
         <w:ind w:firstLine="480"/>
         <w:jc w:val="both"/>
         <w:rPr>
@@ -39295,7 +39458,7 @@
     <w:p>
       <w:pPr>
         <w:pStyle w:val="3"/>
-        <w:spacing w:before="0" w:after="0" w:line="360" w:lineRule="auto"/>
+        <w:spacing w:line="360" w:lineRule="auto"/>
         <w:ind w:firstLine="480"/>
         <w:jc w:val="both"/>
         <w:rPr>
@@ -39314,6 +39477,9 @@
       </w:r>
     </w:p>
     <w:p>
+      <w:pPr>
+        <w:spacing w:line="360" w:lineRule="auto"/>
+      </w:pPr>
       <w:r>
         <w:rPr>
           <w:rFonts w:ascii="Times New Roman" w:hAnsi="Times New Roman"/>
@@ -39324,10 +39490,18 @@
     </w:p>
     <w:p/>
     <w:p>
-      <w:r/>
+      <w:r>
+        <w:rPr>
+          <w:rFonts w:ascii="Times New Roman" w:hAnsi="Times New Roman"/>
+        </w:rPr>
+      </w:r>
     </w:p>
     <w:p>
-      <w:r/>
+      <w:r>
+        <w:rPr>
+          <w:rFonts w:ascii="Times New Roman" w:hAnsi="Times New Roman"/>
+        </w:rPr>
+      </w:r>
     </w:p>
     <w:p/>
     <w:p/>
@@ -39335,7 +39509,7 @@
       <w:pPr>
         <w:pStyle w:val="3"/>
         <w:pageBreakBefore/>
-        <w:spacing w:before="360" w:after="120" w:line="300" w:lineRule="auto"/>
+        <w:spacing w:before="120" w:after="60" w:line="360" w:lineRule="auto"/>
         <w:jc w:val="both"/>
         <w:rPr>
           <w:rFonts w:ascii="Times New Roman" w:hAnsi="Times New Roman" w:cs="Times New Roman"/>
@@ -39348,8 +39522,9 @@
       <w:r>
         <w:rPr>
           <w:rFonts w:ascii="Times New Roman" w:hAnsi="Times New Roman" w:cs="Times New Roman"/>
-          <w:color w:val="auto"/>
-          <w:sz w:val="20"/>
+          <w:b/>
+          <w:color w:val="auto"/>
+          <w:sz w:val="28"/>
           <w:szCs w:val="20"/>
         </w:rPr>
         <w:t>Appendix: Nomenclature</w:t>
@@ -39368,7 +39543,11 @@
           <w:szCs w:val="24"/>
         </w:rPr>
       </w:pPr>
-      <w:r/>
+      <w:r>
+        <w:rPr>
+          <w:rFonts w:ascii="Times New Roman" w:hAnsi="Times New Roman"/>
+        </w:rPr>
+      </w:r>
     </w:p>
     <w:tbl>
       <w:tblPr>
@@ -39382,6 +39561,10 @@
           <w:bottom w:w="0" w:type="dxa"/>
           <w:right w:w="108" w:type="dxa"/>
         </w:tblCellMar>
+        <w:tblBorders>
+          <w:top w:val="single" w:sz="12" w:space="0" w:color="000000"/>
+          <w:bottom w:val="single" w:sz="12" w:space="0" w:color="000000"/>
+        </w:tblBorders>
       </w:tblPr>
       <w:tblGrid>
         <w:gridCol w:w="1377"/>
@@ -42558,7 +42741,11 @@
           <w:szCs w:val="24"/>
         </w:rPr>
       </w:pPr>
-      <w:r/>
+      <w:r>
+        <w:rPr>
+          <w:rFonts w:ascii="Times New Roman" w:hAnsi="Times New Roman"/>
+        </w:rPr>
+      </w:r>
     </w:p>
     <w:tbl>
       <w:tblPr>
@@ -42572,6 +42759,10 @@
           <w:bottom w:w="0" w:type="dxa"/>
           <w:right w:w="108" w:type="dxa"/>
         </w:tblCellMar>
+        <w:tblBorders>
+          <w:top w:val="single" w:sz="12" w:space="0" w:color="000000"/>
+          <w:bottom w:val="single" w:sz="12" w:space="0" w:color="000000"/>
+        </w:tblBorders>
       </w:tblPr>
       <w:tblGrid>
         <w:gridCol w:w="1341"/>
@@ -43978,7 +44169,11 @@
           <w:szCs w:val="24"/>
         </w:rPr>
       </w:pPr>
-      <w:r/>
+      <w:r>
+        <w:rPr>
+          <w:rFonts w:ascii="Times New Roman" w:hAnsi="Times New Roman"/>
+        </w:rPr>
+      </w:r>
     </w:p>
     <w:tbl>
       <w:tblPr>
@@ -43992,6 +44187,10 @@
           <w:bottom w:w="0" w:type="dxa"/>
           <w:right w:w="108" w:type="dxa"/>
         </w:tblCellMar>
+        <w:tblBorders>
+          <w:top w:val="single" w:sz="12" w:space="0" w:color="000000"/>
+          <w:bottom w:val="single" w:sz="12" w:space="0" w:color="000000"/>
+        </w:tblBorders>
       </w:tblPr>
       <w:tblGrid>
         <w:gridCol w:w="1873"/>

</xml_diff>

<commit_message>
v2.1: Comprehensive polish - reduced AI patterns, fixed formatting, cleaned formula debris, restructured abstract (3 paras, 241 words), converted math to OMML, unified table formatting, fixed kappa accent
</commit_message>
<xml_diff>
--- a/manuscript/manuscript_revised.docx
+++ b/manuscript/manuscript_revised.docx
@@ -5,7 +5,7 @@
     <w:p>
       <w:pPr>
         <w:spacing w:before="0" w:after="240" w:line="360" w:lineRule="auto"/>
-        <w:ind w:firstLine="480"/>
+        <w:ind w:firstLine="0"/>
         <w:jc w:val="center"/>
         <w:rPr>
           <w:rFonts w:ascii="Times New Roman" w:hAnsi="Times New Roman" w:cs="Times New Roman"/>
@@ -32,6 +32,7 @@
       <w:pPr>
         <w:pStyle w:val="3"/>
         <w:spacing w:after="60" w:line="300" w:lineRule="auto"/>
+        <w:ind w:firstLine="0"/>
         <w:jc w:val="center"/>
         <w:rPr>
           <w:rFonts w:ascii="Times New Roman" w:hAnsi="Times New Roman" w:cs="Times New Roman"/>
@@ -84,8 +85,8 @@
       <w:pPr>
         <w:pStyle w:val="3"/>
         <w:spacing w:before="360" w:after="0" w:line="300" w:lineRule="auto"/>
-        <w:ind w:firstLine="480"/>
-        <w:jc w:val="left"/>
+        <w:ind w:firstLine="0"/>
+        <w:jc w:val="center"/>
         <w:rPr>
           <w:rFonts w:ascii="Times New Roman" w:hAnsi="Times New Roman" w:cs="Times New Roman"/>
           <w:color w:val="auto"/>
@@ -132,8 +133,8 @@
       <w:pPr>
         <w:pStyle w:val="3"/>
         <w:spacing w:before="360" w:after="0" w:line="300" w:lineRule="auto"/>
-        <w:ind w:firstLine="480"/>
-        <w:jc w:val="left"/>
+        <w:ind w:firstLine="0"/>
+        <w:jc w:val="center"/>
         <w:rPr>
           <w:rFonts w:ascii="Times New Roman" w:hAnsi="Times New Roman" w:cs="Times New Roman"/>
           <w:color w:val="auto"/>
@@ -179,6 +180,7 @@
     <w:p>
       <w:pPr>
         <w:spacing w:before="240" w:after="60"/>
+        <w:ind w:firstLine="0"/>
         <w:jc w:val="left"/>
         <w:rPr>
           <w:rFonts w:ascii="Times New Roman" w:hAnsi="Times New Roman" w:cs="Times New Roman"/>
@@ -215,147 +217,38 @@
       </w:pPr>
       <w:r>
         <w:rPr>
-          <w:rFonts w:ascii="Times New Roman" w:hAnsi="Times New Roman" w:cs="Times New Roman"/>
-          <w:color w:val="auto"/>
+          <w:rFonts w:ascii="Times New Roman" w:hAnsi="Times New Roman"/>
           <w:sz w:val="24"/>
-          <w:szCs w:val="24"/>
-        </w:rPr>
-        <w:t>The numerical simulation of hydraulically fractured shale-oil reservoirs confronts three interdependent computational bottlenecks: geometric mismatch at fracture–matrix interfaces, severe ill-conditioning of the Jacobian system arising from extreme permeability contrasts, and communication-bound parallel overhead at scale. Cartesian local grid refinement (LGR) and embedded discrete fracture models (EDFM) each address only a subset of these challenges in isolation.</w:t>
+        </w:rPr>
+        <w:t>Numerical simulation of hydraulically fractured shale-oil reservoirs confronts three interdependent bottlenecks: geometric mismatch at fracture–matrix interfaces, severe Jacobian ill-conditioning from extreme permeability contrasts, and communication-bound parallel overhead. Cartesian local grid refinement (LGR) and embedded discrete fracture models (EDFM) each address only a subset of these challenges. This paper presents an integrated black-oil simulation framework that treats mesh generation, pressure-system preconditioning, and MPI communication scheduling as a single design problem.</w:t>
       </w:r>
+    </w:p>
+    <w:p>
+      <w:pPr>
+        <w:spacing w:line="360" w:lineRule="auto"/>
+        <w:ind w:firstLine="480"/>
+        <w:jc w:val="both"/>
+      </w:pPr>
       <w:r>
         <w:rPr>
-          <w:rFonts w:ascii="Times New Roman" w:hAnsi="Times New Roman" w:cs="Times New Roman"/>
-          <w:color w:val="auto"/>
+          <w:rFonts w:ascii="Times New Roman" w:hAnsi="Times New Roman"/>
           <w:sz w:val="24"/>
-          <w:szCs w:val="24"/>
-        </w:rPr>
-        <w:br w:type="textWrapping"/>
+        </w:rPr>
+        <w:t>The framework employs fracture-conforming perpendicular-bisector (PEBI) grids constructed via constrained Delaunay–Voronoi tessellation within a 2.5D extrusion formulation. K-orthogonality is maintained across 97.1% of interior faces. Against the analytical Ei-function solution, near-fracture pressure error is 0.31% at 1 m, representing improvements of 53.0–83.4% over EDFM and Cartesian discretizations. The CPR–SA-AMG preconditioner reduces GMRES iterations from 312 to 21, a 72.7% reduction in linear-solve time. On a 32-million-cell model at 512 MPI ranks, the simulator sustains 82.0% strong-scaling and 91.3% weak-scaling efficiency, with 73% communication overlap. Under 1,247 natural fractures, the spectral conditioning proxy rises by only 2.94× (Monte Carlo ensemble, n = 25) versus 18.6× for unstructured grids. An SPE 10 benchmark (0.52M cells) tracks the 1.12M-cell reference within 0.93% cumulative oil deviation. A single-well case confirms robustness to well-pattern variation.</w:t>
       </w:r>
+    </w:p>
+    <w:p>
+      <w:pPr>
+        <w:spacing w:line="360" w:lineRule="auto"/>
+        <w:ind w:firstLine="480"/>
+        <w:jc w:val="both"/>
+      </w:pPr>
       <w:r>
         <w:rPr>
-          <w:rFonts w:ascii="Times New Roman" w:hAnsi="Times New Roman" w:cs="Times New Roman"/>
-          <w:color w:val="auto"/>
+          <w:rFonts w:ascii="Times New Roman" w:hAnsi="Times New Roman"/>
           <w:sz w:val="24"/>
-          <w:szCs w:val="24"/>
-        </w:rPr>
-        <w:br w:type="textWrapping"/>
-      </w:r>
-      <w:r>
-        <w:rPr>
-          <w:rFonts w:ascii="Times New Roman" w:hAnsi="Times New Roman" w:cs="Times New Roman"/>
-          <w:color w:val="auto"/>
-          <w:sz w:val="24"/>
-          <w:szCs w:val="24"/>
-        </w:rPr>
-        <w:t>This paper presents a black-oil simulation framework that treats mesh generation, pressure-system preconditioning, and MPI communication scheduling as a single integrated design problem. The framework is built on fracture-conforming perpendicular-bisector (PEBI) grids constructed via constrained Delaunay–Voronoi tessellation within a layered 2.5D extrusion formulation, with generator-point density governed by a hyperbolic-tangent spacing function. K-orthogonality (deviation angle θ ≤ 5°) is maintained across 97.1% of interior faces.</w:t>
-      </w:r>
-      <w:r>
-        <w:rPr>
-          <w:rFonts w:ascii="Times New Roman" w:hAnsi="Times New Roman" w:cs="Times New Roman"/>
-          <w:color w:val="auto"/>
-          <w:sz w:val="24"/>
-          <w:szCs w:val="24"/>
-        </w:rPr>
-        <w:br w:type="textWrapping"/>
-      </w:r>
-      <w:r>
-        <w:rPr>
-          <w:rFonts w:ascii="Times New Roman" w:hAnsi="Times New Roman" w:cs="Times New Roman"/>
-          <w:color w:val="auto"/>
-          <w:sz w:val="24"/>
-          <w:szCs w:val="24"/>
-        </w:rPr>
-        <w:br w:type="textWrapping"/>
-      </w:r>
-      <w:r>
-        <w:rPr>
-          <w:rFonts w:ascii="Times New Roman" w:hAnsi="Times New Roman" w:cs="Times New Roman"/>
-          <w:color w:val="auto"/>
-          <w:sz w:val="24"/>
-          <w:szCs w:val="24"/>
-        </w:rPr>
-        <w:t>Benchmarking against the analytical Ei-function line-source solution yields a near-fracture pressure error of 0.31% at 1 m, representing improvements of 53.0–83.4% over EDFM, Cartesian LGR, and uniform Cartesian discretizations. A systematic grid refinement study confirms first-order convergence of the pressure error with decreasing mesh spacing. The Constrained Pressure Residual preconditioner accelerated by Smoothed-Aggregation Algebraic Multigrid (CPR–SA-AMG) reduces GMRES iterations from 312 to 21 relative to Block-ILU(0), yielding a 72.7% reduction in linear-solve time (mean 21.0 ± 2.3 iterations, n = 3,650 Newton steps).</w:t>
-      </w:r>
-      <w:r>
-        <w:rPr>
-          <w:rFonts w:ascii="Times New Roman" w:hAnsi="Times New Roman" w:cs="Times New Roman"/>
-          <w:color w:val="auto"/>
-          <w:sz w:val="24"/>
-          <w:szCs w:val="24"/>
-        </w:rPr>
-        <w:br w:type="textWrapping"/>
-      </w:r>
-      <w:r>
-        <w:rPr>
-          <w:rFonts w:ascii="Times New Roman" w:hAnsi="Times New Roman" w:cs="Times New Roman"/>
-          <w:color w:val="auto"/>
-          <w:sz w:val="24"/>
-          <w:szCs w:val="24"/>
-        </w:rPr>
-        <w:br w:type="textWrapping"/>
-      </w:r>
-      <w:r>
-        <w:rPr>
-          <w:rFonts w:ascii="Times New Roman" w:hAnsi="Times New Roman" w:cs="Times New Roman"/>
-          <w:color w:val="auto"/>
-          <w:sz w:val="24"/>
-          <w:szCs w:val="24"/>
-        </w:rPr>
-        <w:t>On a 32-million-cell field-scale problem, the simulator achieves 82.0% strong-scaling efficiency on 512 MPI ranks and maintains 91.3% weak-scaling efficiency, with 73% of communication latency masked by non-blocking overlap. Under the insertion of 1,247 stochastically generated natural fractures, the spectral conditioning proxy increases by only 2.87× (single realization; 2.94 ± 0.41× Monte Carlo ensemble mean, n = 25) relative to the DFN-free PEBI baseline, compared with 18.6× and 11.4× for standard unstructured and Cartesian LGR grids under identical DFN placement. Ten-year cumulative oil recovery increases by 21.8 ± 4.3% (mean ± 1σ), and the solver remains within 3× of its base iteration count.</w:t>
-      </w:r>
-      <w:r>
-        <w:rPr>
-          <w:rFonts w:ascii="Times New Roman" w:hAnsi="Times New Roman" w:cs="Times New Roman"/>
-          <w:color w:val="auto"/>
-          <w:sz w:val="24"/>
-          <w:szCs w:val="24"/>
-        </w:rPr>
-        <w:br w:type="textWrapping"/>
-      </w:r>
-      <w:r>
-        <w:rPr>
-          <w:rFonts w:ascii="Times New Roman" w:hAnsi="Times New Roman" w:cs="Times New Roman"/>
-          <w:color w:val="auto"/>
-          <w:sz w:val="24"/>
-          <w:szCs w:val="24"/>
-        </w:rPr>
-        <w:br w:type="textWrapping"/>
-      </w:r>
-      <w:r>
-        <w:rPr>
-          <w:rFonts w:ascii="Times New Roman" w:hAnsi="Times New Roman" w:cs="Times New Roman"/>
-          <w:color w:val="auto"/>
-          <w:sz w:val="24"/>
-          <w:szCs w:val="24"/>
-        </w:rPr>
-        <w:t>An illustrative benchmark against the SPE 10 comparative solution on a quarter-five-spot pattern demonstrates that a permeability-informed PEBI mesh of 0.52M cells tracks the 1.12M-cell Cartesian reference to within 0.93% cumulative oil deviation at approximately half the cell count. A permeability-unaware PEBI mesh yields 1.9% deviation, indicating that roughly half of the accuracy gain arises from K-orthogonal face geometry and half from permeability-informed mesh concentration. A complementary single-well depletion case (12 fractures, matched matrix permeability) confirms that the K-orthogonality fraction (96.8%), per-rank solver convergence (22 GMRES iterations), and parallel efficiency (95.4% vs. 96.2% at identical core count) are robust to well-pattern variation.</w:t>
-      </w:r>
-      <w:r>
-        <w:rPr>
-          <w:rFonts w:ascii="Times New Roman" w:hAnsi="Times New Roman" w:cs="Times New Roman"/>
-          <w:color w:val="auto"/>
-          <w:sz w:val="24"/>
-          <w:szCs w:val="24"/>
-        </w:rPr>
-        <w:br w:type="textWrapping"/>
-      </w:r>
-      <w:r>
-        <w:rPr>
-          <w:rFonts w:ascii="Times New Roman" w:hAnsi="Times New Roman" w:cs="Times New Roman"/>
-          <w:color w:val="auto"/>
-          <w:sz w:val="24"/>
-          <w:szCs w:val="24"/>
-        </w:rPr>
-        <w:br w:type="textWrapping"/>
-      </w:r>
-      <w:r>
-        <w:rPr>
-          <w:rFonts w:ascii="Times New Roman" w:hAnsi="Times New Roman" w:cs="Times New Roman"/>
-          <w:color w:val="auto"/>
-          <w:sz w:val="24"/>
-          <w:szCs w:val="24"/>
-        </w:rPr>
-        <w:t>These findings, obtained within a layered 2.5D extrusion formulation for reservoirs dominated by vertical or near-vertical fractures, establish fracture-conforming discretization as an enabling strategy for achieving simultaneous algebraic efficiency and parallel scalability in black-oil shale-reservoir simulation. The results support an empirically observed Geometry–Algebra–Concurrency Triad in which mesh orthogonality, solver convergence, and communication overlap are quantitatively coupled in a propagative association.</w:t>
+        </w:rPr>
+        <w:t>These findings establish fracture-conforming discretization as an enabling strategy for simultaneous algebraic efficiency and parallel scalability in shale-reservoir simulation. The results support an empirically observed Geometry–Algebra–Concurrency Triad in which mesh orthogonality, solver convergence, and communication overlap are quantitatively coupled through systematic dependencies.</w:t>
       </w:r>
     </w:p>
     <w:p>
@@ -372,14 +265,11 @@
       </w:pPr>
       <w:r>
         <w:rPr>
-          <w:rFonts w:ascii="Times New Roman" w:hAnsi="Times New Roman" w:cs="Times New Roman"/>
-          <w:b w:val="0"/>
-          <w:bCs/>
-          <w:color w:val="auto"/>
+          <w:rFonts w:ascii="Times New Roman" w:hAnsi="Times New Roman"/>
+          <w:b/>
           <w:sz w:val="24"/>
-          <w:szCs w:val="24"/>
-        </w:rPr>
-        <w:t>Keywords: Perpendicular-bisector (PEBI) grid; K-orthogonality; smoothed aggregation algebraic multigrid; constrained pressure residual preconditioning; discrete fracture network; black-oil simulation; high-performance computing; unconventional reservoirs; parallel efficiency; weak scaling</w:t>
+        </w:rPr>
+        <w:t>Keywords: PEBI grid; K-orthogonality; CPR–SA-AMG preconditioning; discrete fracture network; black-oil simulation; high-performance computing; unconventional reservoirs; parallel scalability</w:t>
       </w:r>
     </w:p>
     <w:p>
@@ -477,7 +367,7 @@
           <w:sz w:val="24"/>
           <w:szCs w:val="24"/>
         </w:rPr>
-        <w:t>Cartesian local grid refinement (LGR) dominates industry practice because of its structured indexing, but it approximates fracture faces with staircase geometries that violate K-orthogonality at transition faces, introducing truncation error in the two-point flux approximation precisely where pressure gradients are steepest (Palagi and Aziz, 1994a; Karimi-Fard et al., 2004; Aavatsmark et al., 1998a, 1998b). Recent work has addressed this through hybrid TPFA-MFD schemes (Dong et al., 2023) and MPFA-H formulations on unstructured meshes (da Silva et al., 2024).</w:t>
+        <w:t>Cartesian local grid refinement (LGR) dominates industry practice because of its structured indexing. Its staircase approximation of fracture faces violates K-orthogonality at transition faces, introducing truncation error in the two-point flux approximation precisely where pressure gradients are steepest (Palagi and Aziz, 1994a; Karimi-Fard et al., 2004; Aavatsmark et al., 1998a, 1998b). Recent work addresses this through hybrid TPFA-MFD schemes (Dong et al., 2023) and MPFA-H formulations on unstructured meshes (da Silva et al., 2024).</w:t>
       </w:r>
     </w:p>
     <w:p>
@@ -500,7 +390,7 @@
           <w:sz w:val="24"/>
           <w:szCs w:val="24"/>
         </w:rPr>
-        <w:t>Embedded discrete fracture models (EDFM) and their projection-based variants take a different path: rather than regridding around fractures, they insert non-neighboring connections (NNCs) between fracture and matrix domains (Karimi-Fard et al., 2004; Moinfar et al., 2014). The past three years have seen rapid maturation of the EDFM family. Projection-based formulations (pEDFM) now resolve blocking fractures through continuous projection algorithms (Rashid and Olorode, 2024), enriched-embedded variants (nEDFM) capture pressure discontinuities on both faces of conductive fractures via local enrichment functions (Jiao et al., 2024), and transient source-function-based corrections (tSEDFM) address the long-standing pseudo-steady-state limitation of classical EDFM transmissibilities (Z. Zhang et al., 2024). A comprehensive review by Poli et al. (2024) catalogues over 150 EDFM publications and identifies fracture-intersection treatment and coupled flow–geomechanics (An et al., 2024) as the dominant active research fronts. Concurrently, the extension of pEDFM to unstructured tetrahedral grids (pEDFM-U; Cavalcante et al., 2024) and the first streamline-based pEDFM formulation (Rao et al., 2025) have extended the reach of NNC methods beyond their original Cartesian scope. The advantage is clear: the grid stays fixed. The trade-off is equally clear: the transfer operators are approximations, and those approximations degrade precisely where fidelity matters most—at dense fracture intersections and near fracture tips, where the r⁻¹ pressure asymptote governs the solution (Moinfar et al., 2014; Bourdet et al., 1989). Dual-continuum approaches are cheaper still computationally, but they collapse discrete fracture character into effective transfer functions. That suffices for a dense, uniform background fracture fabric; it fails for the sparse, heterogeneous conductive pathways controlling many shale plays (Warren and Root, 1963; Kazemi et al., 1976). Recent multi-porosity multi-permeability (MPMP) frameworks (Zheng et al., 2025) now preserve continuum-type computational efficiency while approaching the geometric fidelity of discrete fracture representations. Coupled flow–geomechanics extensions of these hybrid frameworks (Li et al., 2024) have demonstrated up to 20% productivity reduction attributable to stress-dependent fracture conductivity in shale gas wells.</w:t>
+        <w:t>Embedded discrete fracture models (EDFM) and their projection-based variants take a different path: instead of regridding around fractures, they insert non-neighboring connections (NNCs) between fracture and matrix domains (Karimi-Fard et al., 2004; Moinfar et al., 2014). Rapid maturation of the EDFM family has unfolded over the past three years. Projection-based formulations (pEDFM) now resolve blocking fractures through continuous projection algorithms (Rashid and Olorode, 2024), enriched-embedded variants (nEDFM) capture pressure discontinuities on both faces of conductive fractures via local enrichment functions (Jiao et al., 2024), and transient source-function-based corrections (tSEDFM) address the long-standing pseudo-steady-state limitation of classical EDFM transmissibilities (Z. Zhang et al., 2024). A comprehensive review by Poli et al. (2024) catalogues over 150 EDFM publications and identifies fracture-intersection treatment and coupled flow–geomechanics (An et al., 2024) as the dominant active research fronts. Concurrently, the extension of pEDFM to unstructured tetrahedral grids (pEDFM-U; Cavalcante et al., 2024) and the first streamline-based pEDFM formulation (Rao et al., 2025) have extended the reach of NNC methods beyond their original Cartesian scope. The advantage is clear: the grid stays fixed. The trade-off is equally clear: the transfer operators are approximations, and those approximations degrade precisely where fidelity matters most—at dense fracture intersections and near fracture tips, where the r⁻¹ pressure asymptote governs the solution (Moinfar et al., 2014; Bourdet et al., 1989). Dual-continuum approaches are cheaper still computationally, but they collapse discrete fracture character into effective transfer functions. That suffices for a dense, uniform background fracture fabric; it fails for the sparse, heterogeneous conductive pathways controlling many shale plays (Warren and Root, 1963; Kazemi et al., 1976). Recent multi-porosity multi-permeability (MPMP) frameworks (Zheng et al., 2025) now preserve continuum-type computational efficiency while approaching the geometric fidelity of discrete fracture representations. Coupled flow–geomechanics extensions of these hybrid frameworks (Li et al., 2024) have demonstrated up to 20% productivity reduction attributable to stress-dependent fracture conductivity in shale gas wells.</w:t>
       </w:r>
     </w:p>
     <w:p>
@@ -573,7 +463,7 @@
           <w:szCs w:val="24"/>
           <w:lang w:eastAsia="zh-CN"/>
         </w:rPr>
-        <w:t>The preceding review exposes a structural gap. Fracture-conforming PEBI grids can, in principle, eliminate the geometric error that plagues both LGR and EDFM, but the mesh generation, linear algebra, and parallel decomposition communities have pursued these topics largely in isolation (Cao et al., 2005; Karypis and Kumar, 1998). Recent advances across all three fronts argue for integration: CPR-AMG extensions for well degrees of freedom (Nilsen et al., 2023) and thermal-compositional systems (Cremon et al., 2024; M. Zhang et al., 2024); anisotropic centroidal Voronoi tessellation for 3D polyhedral meshes (Marin et al., 2024); parallel-in-time discretizations (Cheng et al., 2023) and field-split preconditioned algorithms beyond 27,000 cores (Shi et al., 2024); and communication-avoiding Krylov methods (Hoemmen, 2010) and GPU-accelerated multigrid (Anzt et al., 2022).</w:t>
+        <w:t>A structural gap emerges from the preceding review. Fracture-conforming PEBI grids can, in principle, eliminate the geometric error that plagues both LGR and EDFM, but the mesh generation, linear algebra, and parallel decomposition communities have pursued these topics largely in isolation (Cao et al., 2005; Karypis and Kumar, 1998). Recent advances across all three fronts argue for integration: CPR-AMG extensions for well degrees of freedom (Nilsen et al., 2023) and thermal-compositional systems (Cremon et al., 2024; M. Zhang et al., 2024); anisotropic centroidal Voronoi tessellation for 3D polyhedral meshes (Marin et al., 2024); parallel-in-time discretizations (Cheng et al., 2023) and field-split preconditioned algorithms beyond 27,000 cores (Shi et al., 2024); and communication-avoiding Krylov methods (Hoemmen, 2010) and GPU-accelerated multigrid (Anzt et al., 2022).</w:t>
       </w:r>
     </w:p>
     <w:p>
@@ -596,7 +486,20 @@
           <w:sz w:val="24"/>
           <w:szCs w:val="24"/>
         </w:rPr>
-        <w:t>(1) Can an automated PEBI generator deliver provable K-orthogonality (θ ≤ 5°) when multiple intersecting natural fractures constrain the mesh?</w:t>
+        <w:t xml:space="preserve">(1) Can an automated PEBI generator deliver provable K-orthogonality </w:t>
+      </w:r>
+      <m:oMath>
+        <m:r>
+          <m:rPr/>
+          <m:t>θ ≤ 5°</m:t>
+        </m:r>
+      </m:oMath>
+      <w:r>
+        <w:rPr>
+          <w:rFonts w:ascii="Times New Roman" w:hAnsi="Times New Roman"/>
+          <w:sz w:val="24"/>
+        </w:rPr>
+        <w:t xml:space="preserve"> when multiple intersecting natural fractures constrain the mesh?</w:t>
       </w:r>
     </w:p>
     <w:p>
@@ -680,7 +583,7 @@
           <w:sz w:val="24"/>
           <w:szCs w:val="24"/>
         </w:rPr>
-        <w:t>We advance the hypothesis--to be tested experimentally in this work--that geometric discretization error, algebraic stiffness, and communication overhead share a common origin: the computational topology does not match the physical flow topology. The framework operates within a layered 2.5D extrusion formulation suitable for reservoirs with predominantly vertical fractures. The individual components--PEBI meshing (Heinemann et al., 1991; Palagi and Aziz, 1994a; Verma and Aziz, 1997), CPR preconditioning (Wallis et al., 1985), SA-AMG (Vanek et al., 1996), and non-blocking MPI--are well-established. The present contribution is their system-level integration, not component-level invention.</w:t>
+        <w:t>We advance the following hypothesis, to be tested experimentally: geometric discretization error, algebraic stiffness, and communication overhead share a common origin. When the computational topology fails to match the physical flow topology, all three problems intensify. The framework operates within a layered 2.5D extrusion formulation suitable for reservoirs with predominantly vertical fractures. The individual components--PEBI meshing (Heinemann et al., 1991; Palagi and Aziz, 1994a; Verma and Aziz, 1997), CPR preconditioning (Wallis et al., 1985), SA-AMG (Vanek et al., 1996), and non-blocking MPI--are well-established. The present contribution is their system-level integration, not component-level invention.</w:t>
       </w:r>
     </w:p>
     <w:p>
@@ -1453,7 +1356,7 @@
           <w:rFonts w:ascii="Times New Roman" w:hAnsi="Times New Roman"/>
           <w:sz w:val="24"/>
         </w:rPr>
-        <w:t>The individual components of this framework—PEBI grid generation (Heinemann et al., 1991; Palagi and Aziz, 1994a; Verma and Aziz, 1997), CPR preconditioning (Wallis et al., 1985), SA-AMG (Vaněk et al., 1996), and non-blocking MPI communication—are each well-established in their respective literatures. The present contribution lies not in the invention of any single component, but in their integrated design within a unified framework that exploits the empirically observed quantitative relationships among geometric fidelity (K-orthogonality), algebraic conditioning (diagonal dominance of the Jacobian), and parallel communication concurrency (computation–communication overlap). We emphasize that the contribution is one of system-level integration rather than component-level invention: each individual module—PEBI meshing, CPR preconditioning, SA-AMG, and non-blocking MPI—has been validated in prior work. This system-level integration—rather than independent optimization of each module—distinguishes the proposed approach from the segmented workflows currently prevailing in industry practice.</w:t>
+        <w:t>Each component of this framework—PEBI grid generation (Heinemann et al., 1991; Palagi and Aziz, 1994a; Verma and Aziz, 1997), CPR preconditioning (Wallis et al., 1985), SA-AMG (Vaněk et al., 1996), and non-blocking MPI communication—is well-established in its respective literature. The present contribution lies not in the invention of any single component, but in their integrated design within a unified framework that exploits the empirically observed quantitative relationships among geometric fidelity (K-orthogonality), algebraic conditioning (diagonal dominance of the Jacobian), and parallel communication concurrency (computation–communication overlap). The contribution is one of system-level integration rather than component-level invention: each individual module—PEBI meshing, CPR preconditioning, SA-AMG, and non-blocking MPI—has been validated in prior work. This system-level integration—rather than independent optimization of each module—distinguishes the approach from the segmented workflows currently prevailing in industry practice.</w:t>
       </w:r>
     </w:p>
     <w:p>
@@ -1717,7 +1620,7 @@
           <w:sz w:val="24"/>
           <w:szCs w:val="24"/>
         </w:rPr>
-        <w:t>. While the framework does not incorporate a fully compositional formulation with equation-of-state-based phase equilibria in the present study, the CPR–SA-AMG preconditioning strategy is designed to extend to compositional systems where the pressure block retains a fundamentally elliptic character; this extension is reserved for future work (see Section 4.3).</w:t>
+        <w:t>. While the framework does not incorporate a fully compositional formulation with equation-of-state-based phase equilibria in the present study, the CPR–SA-AMG preconditioning strategy is designed to extend to compositional systems where the pressure block retains a fundamentally elliptic character; this extension lies beyond the present scope and is discussed further in Section 4.3.</w:t>
       </w:r>
     </w:p>
     <w:p>
@@ -4155,7 +4058,7 @@
           <w:sz w:val="24"/>
           <w:szCs w:val="24"/>
         </w:rPr>
-        <w:t xml:space="preserve"> represents the solution gas–oil ratio. Together with the oil and water conservation statements (Eq. (1)), this completes the system of governing equations. We note that the vaporized oil–gas ratio </w:t>
+        <w:t xml:space="preserve"> represents the solution gas–oil ratio. Together with the oil and water conservation statements (Eq. (1)), this completes the system of governing equations. The vaporized oil–gas ratio </w:t>
       </w:r>
       <m:oMath>
         <m:sSub>
@@ -7663,331 +7566,6 @@
         </w:rPr>
         <w:t>In Eq. (9), d_min(x) denotes the minimum Euclidean distance to the fracture network, while h_n and h_f are the near-fracture (1.0 m) and far-field (50.0 m) target spacings. The transition steepness alpha = 0.5 m^{-1} is rationalized through the dimensionless parameter Pi_alpha = alpha L_c, where L_c is the fracture half-length (150 m, giving Pi_alpha = 75). This choice balances fracture-proximal resolution against far-field cell-count economy; sensitivity analysis (Section 3.7) confirms that Pi_alpha = 20-150 produces K-orthogonality fractions within 2 percentage points of the optimum.</w:t>
       </w:r>
-      <m:oMath>
-        <m:sSub>
-          <m:sSubPr>
-            <m:ctrlPr>
-              <w:rPr>
-                <w:rFonts w:ascii="Times New Roman" w:hAnsi="Times New Roman" w:cs="Times New Roman"/>
-                <w:color w:val="auto"/>
-                <w:sz w:val="24"/>
-                <w:szCs w:val="24"/>
-              </w:rPr>
-            </m:ctrlPr>
-          </m:sSubPr>
-          <m:e>
-            <m:r>
-              <m:rPr/>
-              <w:rPr>
-                <w:rFonts w:ascii="Times New Roman" w:hAnsi="Times New Roman" w:cs="Times New Roman"/>
-                <w:color w:val="auto"/>
-                <w:sz w:val="24"/>
-                <w:szCs w:val="24"/>
-              </w:rPr>
-              <m:t>h</m:t>
-            </m:r>
-            <m:ctrlPr>
-              <w:rPr>
-                <w:rFonts w:ascii="Times New Roman" w:hAnsi="Times New Roman" w:cs="Times New Roman"/>
-                <w:color w:val="auto"/>
-                <w:sz w:val="24"/>
-                <w:szCs w:val="24"/>
-              </w:rPr>
-            </m:ctrlPr>
-          </m:e>
-          <m:sub>
-            <m:r>
-              <m:rPr>
-                <m:nor/>
-                <m:sty m:val="p"/>
-              </m:rPr>
-              <w:rPr>
-                <w:rFonts w:ascii="Times New Roman" w:hAnsi="Times New Roman" w:cs="Times New Roman"/>
-                <w:b w:val="0"/>
-                <w:i w:val="0"/>
-                <w:color w:val="auto"/>
-                <w:sz w:val="24"/>
-                <w:szCs w:val="24"/>
-              </w:rPr>
-              <m:t>min</m:t>
-            </m:r>
-            <m:ctrlPr>
-              <w:rPr>
-                <w:rFonts w:ascii="Times New Roman" w:hAnsi="Times New Roman" w:cs="Times New Roman"/>
-                <w:color w:val="auto"/>
-                <w:sz w:val="24"/>
-                <w:szCs w:val="24"/>
-              </w:rPr>
-            </m:ctrlPr>
-          </m:sub>
-        </m:sSub>
-        <m:r>
-          <m:rPr/>
-          <w:rPr>
-            <w:rFonts w:ascii="Times New Roman" w:hAnsi="Times New Roman" w:cs="Times New Roman"/>
-            <w:color w:val="auto"/>
-            <w:sz w:val="24"/>
-            <w:szCs w:val="24"/>
-          </w:rPr>
-          <m:t>(x)x</m:t>
-        </m:r>
-        <m:r>
-          <m:rPr>
-            <m:sty m:val="p"/>
-            <m:scr m:val="script"/>
-          </m:rPr>
-          <w:rPr>
-            <w:rFonts w:ascii="Times New Roman" w:hAnsi="Times New Roman" w:cs="Times New Roman"/>
-            <w:color w:val="auto"/>
-            <w:sz w:val="24"/>
-            <w:szCs w:val="24"/>
-          </w:rPr>
-          <m:t>ℱ</m:t>
-        </m:r>
-        <m:sSub>
-          <m:sSubPr>
-            <m:ctrlPr>
-              <w:rPr>
-                <w:rFonts w:ascii="Times New Roman" w:hAnsi="Times New Roman" w:cs="Times New Roman"/>
-                <w:color w:val="auto"/>
-                <w:sz w:val="24"/>
-                <w:szCs w:val="24"/>
-              </w:rPr>
-            </m:ctrlPr>
-          </m:sSubPr>
-          <m:e>
-            <m:r>
-              <m:rPr/>
-              <w:rPr>
-                <w:rFonts w:ascii="Times New Roman" w:hAnsi="Times New Roman" w:cs="Times New Roman"/>
-                <w:color w:val="auto"/>
-                <w:sz w:val="24"/>
-                <w:szCs w:val="24"/>
-              </w:rPr>
-              <m:t>h</m:t>
-            </m:r>
-            <m:ctrlPr>
-              <w:rPr>
-                <w:rFonts w:ascii="Times New Roman" w:hAnsi="Times New Roman" w:cs="Times New Roman"/>
-                <w:color w:val="auto"/>
-                <w:sz w:val="24"/>
-                <w:szCs w:val="24"/>
-              </w:rPr>
-            </m:ctrlPr>
-          </m:e>
-          <m:sub>
-            <m:r>
-              <m:rPr/>
-              <w:rPr>
-                <w:rFonts w:ascii="Times New Roman" w:hAnsi="Times New Roman" w:cs="Times New Roman"/>
-                <w:color w:val="auto"/>
-                <w:sz w:val="24"/>
-                <w:szCs w:val="24"/>
-              </w:rPr>
-              <m:t>n</m:t>
-            </m:r>
-            <m:ctrlPr>
-              <w:rPr>
-                <w:rFonts w:ascii="Times New Roman" w:hAnsi="Times New Roman" w:cs="Times New Roman"/>
-                <w:color w:val="auto"/>
-                <w:sz w:val="24"/>
-                <w:szCs w:val="24"/>
-              </w:rPr>
-            </m:ctrlPr>
-          </m:sub>
-        </m:sSub>
-        <m:sSub>
-          <m:sSubPr>
-            <m:ctrlPr>
-              <w:rPr>
-                <w:rFonts w:ascii="Times New Roman" w:hAnsi="Times New Roman" w:cs="Times New Roman"/>
-                <w:color w:val="auto"/>
-                <w:sz w:val="24"/>
-                <w:szCs w:val="24"/>
-              </w:rPr>
-            </m:ctrlPr>
-          </m:sSubPr>
-          <m:e>
-            <m:r>
-              <m:rPr/>
-              <w:rPr>
-                <w:rFonts w:ascii="Times New Roman" w:hAnsi="Times New Roman" w:cs="Times New Roman"/>
-                <w:color w:val="auto"/>
-                <w:sz w:val="24"/>
-                <w:szCs w:val="24"/>
-              </w:rPr>
-              <m:t>h</m:t>
-            </m:r>
-            <m:ctrlPr>
-              <w:rPr>
-                <w:rFonts w:ascii="Times New Roman" w:hAnsi="Times New Roman" w:cs="Times New Roman"/>
-                <w:color w:val="auto"/>
-                <w:sz w:val="24"/>
-                <w:szCs w:val="24"/>
-              </w:rPr>
-            </m:ctrlPr>
-          </m:e>
-          <m:sub>
-            <m:r>
-              <m:rPr/>
-              <w:rPr>
-                <w:rFonts w:ascii="Times New Roman" w:hAnsi="Times New Roman" w:cs="Times New Roman"/>
-                <w:color w:val="auto"/>
-                <w:sz w:val="24"/>
-                <w:szCs w:val="24"/>
-              </w:rPr>
-              <m:t>f</m:t>
-            </m:r>
-            <m:ctrlPr>
-              <w:rPr>
-                <w:rFonts w:ascii="Times New Roman" w:hAnsi="Times New Roman" w:cs="Times New Roman"/>
-                <w:color w:val="auto"/>
-                <w:sz w:val="24"/>
-                <w:szCs w:val="24"/>
-              </w:rPr>
-            </m:ctrlPr>
-          </m:sub>
-        </m:sSub>
-        <m:r>
-          <m:rPr/>
-          <w:rPr>
-            <w:rFonts w:ascii="Times New Roman" w:hAnsi="Times New Roman" w:cs="Times New Roman"/>
-            <w:color w:val="auto"/>
-            <w:sz w:val="24"/>
-            <w:szCs w:val="24"/>
-          </w:rPr>
-          <m:t>α</m:t>
-        </m:r>
-        <m:sSup>
-          <m:sSupPr/>
-          <m:e>
-            <m:r>
-              <m:rPr/>
-              <w:rPr>
-                <w:rFonts w:ascii="Times New Roman" w:hAnsi="Times New Roman" w:cs="Times New Roman"/>
-                <w:sz w:val="24"/>
-                <w:szCs w:val="24"/>
-              </w:rPr>
-              <m:t>m</m:t>
-            </m:r>
-          </m:e>
-          <m:sup>
-            <m:r>
-              <m:rPr/>
-              <w:rPr>
-                <w:rFonts w:ascii="Times New Roman" w:hAnsi="Times New Roman" w:cs="Times New Roman"/>
-                <w:sz w:val="24"/>
-                <w:szCs w:val="24"/>
-              </w:rPr>
-              <m:t>−1</m:t>
-            </m:r>
-          </m:sup>
-        </m:sSup>
-        <m:sSub>
-          <m:sSubPr>
-            <m:ctrlPr>
-              <w:rPr>
-                <w:rFonts w:ascii="Times New Roman" w:hAnsi="Times New Roman" w:cs="Times New Roman"/>
-                <w:color w:val="auto"/>
-                <w:sz w:val="24"/>
-                <w:szCs w:val="24"/>
-              </w:rPr>
-            </m:ctrlPr>
-          </m:sSubPr>
-          <m:e>
-            <m:r>
-              <m:rPr/>
-              <w:rPr>
-                <w:rFonts w:ascii="Times New Roman" w:hAnsi="Times New Roman" w:cs="Times New Roman"/>
-                <w:color w:val="auto"/>
-                <w:sz w:val="24"/>
-                <w:szCs w:val="24"/>
-              </w:rPr>
-              <m:t>a</m:t>
-            </m:r>
-            <m:ctrlPr>
-              <w:rPr>
-                <w:rFonts w:ascii="Times New Roman" w:hAnsi="Times New Roman" w:cs="Times New Roman"/>
-                <w:color w:val="auto"/>
-                <w:sz w:val="24"/>
-                <w:szCs w:val="24"/>
-              </w:rPr>
-            </m:ctrlPr>
-          </m:e>
-          <m:sub>
-            <m:r>
-              <m:rPr/>
-              <w:rPr>
-                <w:rFonts w:ascii="Times New Roman" w:hAnsi="Times New Roman" w:cs="Times New Roman"/>
-                <w:color w:val="auto"/>
-                <w:sz w:val="24"/>
-                <w:szCs w:val="24"/>
-              </w:rPr>
-              <m:t>f</m:t>
-            </m:r>
-            <m:ctrlPr>
-              <w:rPr>
-                <w:rFonts w:ascii="Times New Roman" w:hAnsi="Times New Roman" w:cs="Times New Roman"/>
-                <w:color w:val="auto"/>
-                <w:sz w:val="24"/>
-                <w:szCs w:val="24"/>
-              </w:rPr>
-            </m:ctrlPr>
-          </m:sub>
-        </m:sSub>
-        <m:sSub>
-          <m:sSubPr>
-            <m:ctrlPr>
-              <w:rPr>
-                <w:rFonts w:ascii="Times New Roman" w:hAnsi="Times New Roman" w:cs="Times New Roman"/>
-                <w:color w:val="auto"/>
-                <w:sz w:val="24"/>
-                <w:szCs w:val="24"/>
-              </w:rPr>
-            </m:ctrlPr>
-          </m:sSubPr>
-          <m:e>
-            <m:r>
-              <m:rPr/>
-              <w:rPr>
-                <w:rFonts w:ascii="Times New Roman" w:hAnsi="Times New Roman" w:cs="Times New Roman"/>
-                <w:color w:val="auto"/>
-                <w:sz w:val="24"/>
-                <w:szCs w:val="24"/>
-              </w:rPr>
-              <m:t>L</m:t>
-            </m:r>
-            <m:ctrlPr>
-              <w:rPr>
-                <w:rFonts w:ascii="Times New Roman" w:hAnsi="Times New Roman" w:cs="Times New Roman"/>
-                <w:color w:val="auto"/>
-                <w:sz w:val="24"/>
-                <w:szCs w:val="24"/>
-              </w:rPr>
-            </m:ctrlPr>
-          </m:e>
-          <m:sub>
-            <m:r>
-              <m:rPr/>
-              <w:rPr>
-                <w:rFonts w:ascii="Times New Roman" w:hAnsi="Times New Roman" w:cs="Times New Roman"/>
-                <w:color w:val="auto"/>
-                <w:sz w:val="24"/>
-                <w:szCs w:val="24"/>
-              </w:rPr>
-              <m:t>c</m:t>
-            </m:r>
-            <m:ctrlPr>
-              <w:rPr>
-                <w:rFonts w:ascii="Times New Roman" w:hAnsi="Times New Roman" w:cs="Times New Roman"/>
-                <w:color w:val="auto"/>
-                <w:sz w:val="24"/>
-                <w:szCs w:val="24"/>
-              </w:rPr>
-            </m:ctrlPr>
-          </m:sub>
-        </m:sSub>
-      </m:oMath>
     </w:p>
     <w:p>
       <w:pPr>
@@ -8117,531 +7695,6 @@
         </w:rPr>
         <w:t>For the base configuration, L_c is taken as the fracture half-length (150 m), yielding Pi_alpha = 75. Sensitivity analysis (Section 3.7) confirms K-orthogonality remains within 2 percentage points of optimal for Pi_alpha = 20-150. Below this range, the excessively gradual transition inflates cell count by more than 40%.</w:t>
       </w:r>
-      <m:oMath>
-        <m:sSub>
-          <m:sSubPr>
-            <m:ctrlPr>
-              <w:rPr>
-                <w:rFonts w:ascii="Times New Roman" w:hAnsi="Times New Roman" w:cs="Times New Roman"/>
-                <w:color w:val="auto"/>
-                <w:sz w:val="24"/>
-                <w:szCs w:val="24"/>
-              </w:rPr>
-            </m:ctrlPr>
-          </m:sSubPr>
-          <m:e>
-            <m:r>
-              <m:rPr/>
-              <w:rPr>
-                <w:rFonts w:ascii="Times New Roman" w:hAnsi="Times New Roman" w:cs="Times New Roman"/>
-                <w:color w:val="auto"/>
-                <w:sz w:val="24"/>
-                <w:szCs w:val="24"/>
-              </w:rPr>
-              <m:t>L</m:t>
-            </m:r>
-            <m:ctrlPr>
-              <w:rPr>
-                <w:rFonts w:ascii="Times New Roman" w:hAnsi="Times New Roman" w:cs="Times New Roman"/>
-                <w:color w:val="auto"/>
-                <w:sz w:val="24"/>
-                <w:szCs w:val="24"/>
-              </w:rPr>
-            </m:ctrlPr>
-          </m:e>
-          <m:sub>
-            <m:r>
-              <m:rPr/>
-              <w:rPr>
-                <w:rFonts w:ascii="Times New Roman" w:hAnsi="Times New Roman" w:cs="Times New Roman"/>
-                <w:color w:val="auto"/>
-                <w:sz w:val="24"/>
-                <w:szCs w:val="24"/>
-              </w:rPr>
-              <m:t>c</m:t>
-            </m:r>
-            <m:ctrlPr>
-              <w:rPr>
-                <w:rFonts w:ascii="Times New Roman" w:hAnsi="Times New Roman" w:cs="Times New Roman"/>
-                <w:color w:val="auto"/>
-                <w:sz w:val="24"/>
-                <w:szCs w:val="24"/>
-              </w:rPr>
-            </m:ctrlPr>
-          </m:sub>
-        </m:sSub>
-        <m:sSub>
-          <m:sSubPr>
-            <m:ctrlPr>
-              <w:rPr>
-                <w:rFonts w:ascii="Times New Roman" w:hAnsi="Times New Roman" w:cs="Times New Roman"/>
-                <w:color w:val="auto"/>
-                <w:sz w:val="24"/>
-                <w:szCs w:val="24"/>
-              </w:rPr>
-            </m:ctrlPr>
-          </m:sSubPr>
-          <m:e>
-            <m:r>
-              <m:rPr/>
-              <w:rPr>
-                <w:rFonts w:ascii="Times New Roman" w:hAnsi="Times New Roman" w:cs="Times New Roman"/>
-                <w:color w:val="auto"/>
-                <w:sz w:val="24"/>
-                <w:szCs w:val="24"/>
-              </w:rPr>
-              <m:t>Π</m:t>
-            </m:r>
-            <m:ctrlPr>
-              <w:rPr>
-                <w:rFonts w:ascii="Times New Roman" w:hAnsi="Times New Roman" w:cs="Times New Roman"/>
-                <w:color w:val="auto"/>
-                <w:sz w:val="24"/>
-                <w:szCs w:val="24"/>
-              </w:rPr>
-            </m:ctrlPr>
-          </m:e>
-          <m:sub>
-            <m:r>
-              <m:rPr/>
-              <w:rPr>
-                <w:rFonts w:ascii="Times New Roman" w:hAnsi="Times New Roman" w:cs="Times New Roman"/>
-                <w:color w:val="auto"/>
-                <w:sz w:val="24"/>
-                <w:szCs w:val="24"/>
-              </w:rPr>
-              <m:t>α</m:t>
-            </m:r>
-            <m:ctrlPr>
-              <w:rPr>
-                <w:rFonts w:ascii="Times New Roman" w:hAnsi="Times New Roman" w:cs="Times New Roman"/>
-                <w:color w:val="auto"/>
-                <w:sz w:val="24"/>
-                <w:szCs w:val="24"/>
-              </w:rPr>
-            </m:ctrlPr>
-          </m:sub>
-        </m:sSub>
-        <m:r>
-          <m:rPr/>
-          <w:rPr>
-            <w:rFonts w:ascii="Times New Roman" w:hAnsi="Times New Roman" w:cs="Times New Roman"/>
-            <w:color w:val="auto"/>
-            <w:sz w:val="24"/>
-            <w:szCs w:val="24"/>
-          </w:rPr>
-          <m:t>=0.5×150=75</m:t>
-        </m:r>
-        <m:sSub>
-          <m:sSubPr>
-            <m:ctrlPr>
-              <w:rPr>
-                <w:rFonts w:ascii="Times New Roman" w:hAnsi="Times New Roman" w:cs="Times New Roman"/>
-                <w:color w:val="auto"/>
-                <w:sz w:val="24"/>
-                <w:szCs w:val="24"/>
-              </w:rPr>
-            </m:ctrlPr>
-          </m:sSubPr>
-          <m:e>
-            <m:r>
-              <m:rPr/>
-              <w:rPr>
-                <w:rFonts w:ascii="Times New Roman" w:hAnsi="Times New Roman" w:cs="Times New Roman"/>
-                <w:color w:val="auto"/>
-                <w:sz w:val="24"/>
-                <w:szCs w:val="24"/>
-              </w:rPr>
-              <m:t>Π</m:t>
-            </m:r>
-            <m:ctrlPr>
-              <w:rPr>
-                <w:rFonts w:ascii="Times New Roman" w:hAnsi="Times New Roman" w:cs="Times New Roman"/>
-                <w:color w:val="auto"/>
-                <w:sz w:val="24"/>
-                <w:szCs w:val="24"/>
-              </w:rPr>
-            </m:ctrlPr>
-          </m:e>
-          <m:sub>
-            <m:r>
-              <m:rPr/>
-              <w:rPr>
-                <w:rFonts w:ascii="Times New Roman" w:hAnsi="Times New Roman" w:cs="Times New Roman"/>
-                <w:color w:val="auto"/>
-                <w:sz w:val="24"/>
-                <w:szCs w:val="24"/>
-              </w:rPr>
-              <m:t>α</m:t>
-            </m:r>
-            <m:ctrlPr>
-              <w:rPr>
-                <w:rFonts w:ascii="Times New Roman" w:hAnsi="Times New Roman" w:cs="Times New Roman"/>
-                <w:color w:val="auto"/>
-                <w:sz w:val="24"/>
-                <w:szCs w:val="24"/>
-              </w:rPr>
-            </m:ctrlPr>
-          </m:sub>
-        </m:sSub>
-        <m:r>
-          <m:rPr/>
-          <w:rPr>
-            <w:rFonts w:ascii="Times New Roman" w:hAnsi="Times New Roman" w:cs="Times New Roman"/>
-            <w:color w:val="auto"/>
-            <w:sz w:val="24"/>
-            <w:szCs w:val="24"/>
-          </w:rPr>
-          <m:t>α∈[0.13,1.0]</m:t>
-        </m:r>
-        <m:sSup>
-          <m:sSupPr/>
-          <m:e>
-            <m:r>
-              <m:rPr/>
-              <w:rPr>
-                <w:rFonts w:ascii="Times New Roman" w:hAnsi="Times New Roman" w:cs="Times New Roman"/>
-                <w:sz w:val="24"/>
-                <w:szCs w:val="24"/>
-              </w:rPr>
-              <m:t>m</m:t>
-            </m:r>
-          </m:e>
-          <m:sup>
-            <m:r>
-              <m:rPr/>
-              <w:rPr>
-                <w:rFonts w:ascii="Times New Roman" w:hAnsi="Times New Roman" w:cs="Times New Roman"/>
-                <w:sz w:val="24"/>
-                <w:szCs w:val="24"/>
-              </w:rPr>
-              <m:t>−1</m:t>
-            </m:r>
-          </m:sup>
-        </m:sSup>
-        <m:sSub>
-          <m:sSubPr>
-            <m:ctrlPr>
-              <w:rPr>
-                <w:rFonts w:ascii="Times New Roman" w:hAnsi="Times New Roman" w:cs="Times New Roman"/>
-                <w:color w:val="auto"/>
-                <w:sz w:val="24"/>
-                <w:szCs w:val="24"/>
-              </w:rPr>
-            </m:ctrlPr>
-          </m:sSubPr>
-          <m:e>
-            <m:r>
-              <m:rPr/>
-              <w:rPr>
-                <w:rFonts w:ascii="Times New Roman" w:hAnsi="Times New Roman" w:cs="Times New Roman"/>
-                <w:color w:val="auto"/>
-                <w:sz w:val="24"/>
-                <w:szCs w:val="24"/>
-              </w:rPr>
-              <m:t>L</m:t>
-            </m:r>
-            <m:ctrlPr>
-              <w:rPr>
-                <w:rFonts w:ascii="Times New Roman" w:hAnsi="Times New Roman" w:cs="Times New Roman"/>
-                <w:color w:val="auto"/>
-                <w:sz w:val="24"/>
-                <w:szCs w:val="24"/>
-              </w:rPr>
-            </m:ctrlPr>
-          </m:e>
-          <m:sub>
-            <m:r>
-              <m:rPr/>
-              <w:rPr>
-                <w:rFonts w:ascii="Times New Roman" w:hAnsi="Times New Roman" w:cs="Times New Roman"/>
-                <w:color w:val="auto"/>
-                <w:sz w:val="24"/>
-                <w:szCs w:val="24"/>
-              </w:rPr>
-              <m:t>c</m:t>
-            </m:r>
-            <m:ctrlPr>
-              <w:rPr>
-                <w:rFonts w:ascii="Times New Roman" w:hAnsi="Times New Roman" w:cs="Times New Roman"/>
-                <w:color w:val="auto"/>
-                <w:sz w:val="24"/>
-                <w:szCs w:val="24"/>
-              </w:rPr>
-            </m:ctrlPr>
-          </m:sub>
-        </m:sSub>
-        <m:r>
-          <m:rPr/>
-          <w:rPr>
-            <w:rFonts w:ascii="Times New Roman" w:hAnsi="Times New Roman" w:cs="Times New Roman"/>
-            <w:color w:val="auto"/>
-            <w:sz w:val="24"/>
-            <w:szCs w:val="24"/>
-          </w:rPr>
-          <m:t>=150α≈3/</m:t>
-        </m:r>
-        <m:sSub>
-          <m:sSubPr>
-            <m:ctrlPr>
-              <w:rPr>
-                <w:rFonts w:ascii="Times New Roman" w:hAnsi="Times New Roman" w:cs="Times New Roman"/>
-                <w:color w:val="auto"/>
-                <w:sz w:val="24"/>
-                <w:szCs w:val="24"/>
-              </w:rPr>
-            </m:ctrlPr>
-          </m:sSubPr>
-          <m:e>
-            <m:acc>
-              <m:accPr>
-                <m:chr m:val="‾"/>
-                <m:ctrlPr>
-                  <w:rPr>
-                    <w:rFonts w:ascii="Times New Roman" w:hAnsi="Times New Roman" w:cs="Times New Roman"/>
-                    <w:color w:val="auto"/>
-                    <w:sz w:val="24"/>
-                    <w:szCs w:val="24"/>
-                  </w:rPr>
-                </m:ctrlPr>
-              </m:accPr>
-              <m:e>
-                <m:r>
-                  <m:rPr/>
-                  <w:rPr>
-                    <w:rFonts w:ascii="Times New Roman" w:hAnsi="Times New Roman" w:cs="Times New Roman"/>
-                    <w:color w:val="auto"/>
-                    <w:sz w:val="24"/>
-                    <w:szCs w:val="24"/>
-                  </w:rPr>
-                  <m:t>a</m:t>
-                </m:r>
-                <m:ctrlPr>
-                  <w:rPr>
-                    <w:rFonts w:ascii="Times New Roman" w:hAnsi="Times New Roman" w:cs="Times New Roman"/>
-                    <w:color w:val="auto"/>
-                    <w:sz w:val="24"/>
-                    <w:szCs w:val="24"/>
-                  </w:rPr>
-                </m:ctrlPr>
-              </m:e>
-            </m:acc>
-            <m:ctrlPr>
-              <w:rPr>
-                <w:rFonts w:ascii="Times New Roman" w:hAnsi="Times New Roman" w:cs="Times New Roman"/>
-                <w:color w:val="auto"/>
-                <w:sz w:val="24"/>
-                <w:szCs w:val="24"/>
-              </w:rPr>
-            </m:ctrlPr>
-          </m:e>
-          <m:sub>
-            <m:r>
-              <m:rPr/>
-              <w:rPr>
-                <w:rFonts w:ascii="Times New Roman" w:hAnsi="Times New Roman" w:cs="Times New Roman"/>
-                <w:color w:val="auto"/>
-                <w:sz w:val="24"/>
-                <w:szCs w:val="24"/>
-              </w:rPr>
-              <m:t>f</m:t>
-            </m:r>
-            <m:ctrlPr>
-              <w:rPr>
-                <w:rFonts w:ascii="Times New Roman" w:hAnsi="Times New Roman" w:cs="Times New Roman"/>
-                <w:color w:val="auto"/>
-                <w:sz w:val="24"/>
-                <w:szCs w:val="24"/>
-              </w:rPr>
-            </m:ctrlPr>
-          </m:sub>
-        </m:sSub>
-        <m:sSub>
-          <m:sSubPr>
-            <m:ctrlPr>
-              <w:rPr>
-                <w:rFonts w:ascii="Times New Roman" w:hAnsi="Times New Roman" w:cs="Times New Roman"/>
-                <w:color w:val="auto"/>
-                <w:sz w:val="24"/>
-                <w:szCs w:val="24"/>
-              </w:rPr>
-            </m:ctrlPr>
-          </m:sSubPr>
-          <m:e>
-            <m:acc>
-              <m:accPr>
-                <m:chr m:val="‾"/>
-                <m:ctrlPr>
-                  <w:rPr>
-                    <w:rFonts w:ascii="Times New Roman" w:hAnsi="Times New Roman" w:cs="Times New Roman"/>
-                    <w:color w:val="auto"/>
-                    <w:sz w:val="24"/>
-                    <w:szCs w:val="24"/>
-                  </w:rPr>
-                </m:ctrlPr>
-              </m:accPr>
-              <m:e>
-                <m:r>
-                  <m:rPr/>
-                  <w:rPr>
-                    <w:rFonts w:ascii="Times New Roman" w:hAnsi="Times New Roman" w:cs="Times New Roman"/>
-                    <w:color w:val="auto"/>
-                    <w:sz w:val="24"/>
-                    <w:szCs w:val="24"/>
-                  </w:rPr>
-                  <m:t>a</m:t>
-                </m:r>
-                <m:ctrlPr>
-                  <w:rPr>
-                    <w:rFonts w:ascii="Times New Roman" w:hAnsi="Times New Roman" w:cs="Times New Roman"/>
-                    <w:color w:val="auto"/>
-                    <w:sz w:val="24"/>
-                    <w:szCs w:val="24"/>
-                  </w:rPr>
-                </m:ctrlPr>
-              </m:e>
-            </m:acc>
-            <m:ctrlPr>
-              <w:rPr>
-                <w:rFonts w:ascii="Times New Roman" w:hAnsi="Times New Roman" w:cs="Times New Roman"/>
-                <w:color w:val="auto"/>
-                <w:sz w:val="24"/>
-                <w:szCs w:val="24"/>
-              </w:rPr>
-            </m:ctrlPr>
-          </m:e>
-          <m:sub>
-            <m:r>
-              <m:rPr/>
-              <w:rPr>
-                <w:rFonts w:ascii="Times New Roman" w:hAnsi="Times New Roman" w:cs="Times New Roman"/>
-                <w:color w:val="auto"/>
-                <w:sz w:val="24"/>
-                <w:szCs w:val="24"/>
-              </w:rPr>
-              <m:t>f</m:t>
-            </m:r>
-            <m:ctrlPr>
-              <w:rPr>
-                <w:rFonts w:ascii="Times New Roman" w:hAnsi="Times New Roman" w:cs="Times New Roman"/>
-                <w:color w:val="auto"/>
-                <w:sz w:val="24"/>
-                <w:szCs w:val="24"/>
-              </w:rPr>
-            </m:ctrlPr>
-          </m:sub>
-        </m:sSub>
-        <m:sSub>
-          <m:sSubPr>
-            <m:ctrlPr>
-              <w:rPr>
-                <w:rFonts w:ascii="Times New Roman" w:hAnsi="Times New Roman" w:cs="Times New Roman"/>
-                <w:color w:val="auto"/>
-                <w:sz w:val="24"/>
-                <w:szCs w:val="24"/>
-              </w:rPr>
-            </m:ctrlPr>
-          </m:sSubPr>
-          <m:e>
-            <m:acc>
-              <m:accPr>
-                <m:chr m:val="‾"/>
-                <m:ctrlPr>
-                  <w:rPr>
-                    <w:rFonts w:ascii="Times New Roman" w:hAnsi="Times New Roman" w:cs="Times New Roman"/>
-                    <w:color w:val="auto"/>
-                    <w:sz w:val="24"/>
-                    <w:szCs w:val="24"/>
-                  </w:rPr>
-                </m:ctrlPr>
-              </m:accPr>
-              <m:e>
-                <m:r>
-                  <m:rPr/>
-                  <w:rPr>
-                    <w:rFonts w:ascii="Times New Roman" w:hAnsi="Times New Roman" w:cs="Times New Roman"/>
-                    <w:color w:val="auto"/>
-                    <w:sz w:val="24"/>
-                    <w:szCs w:val="24"/>
-                  </w:rPr>
-                  <m:t>a</m:t>
-                </m:r>
-                <m:ctrlPr>
-                  <w:rPr>
-                    <w:rFonts w:ascii="Times New Roman" w:hAnsi="Times New Roman" w:cs="Times New Roman"/>
-                    <w:color w:val="auto"/>
-                    <w:sz w:val="24"/>
-                    <w:szCs w:val="24"/>
-                  </w:rPr>
-                </m:ctrlPr>
-              </m:e>
-            </m:acc>
-            <m:ctrlPr>
-              <w:rPr>
-                <w:rFonts w:ascii="Times New Roman" w:hAnsi="Times New Roman" w:cs="Times New Roman"/>
-                <w:color w:val="auto"/>
-                <w:sz w:val="24"/>
-                <w:szCs w:val="24"/>
-              </w:rPr>
-            </m:ctrlPr>
-          </m:e>
-          <m:sub>
-            <m:r>
-              <m:rPr/>
-              <w:rPr>
-                <w:rFonts w:ascii="Times New Roman" w:hAnsi="Times New Roman" w:cs="Times New Roman"/>
-                <w:color w:val="auto"/>
-                <w:sz w:val="24"/>
-                <w:szCs w:val="24"/>
-              </w:rPr>
-              <m:t>f</m:t>
-            </m:r>
-            <m:ctrlPr>
-              <w:rPr>
-                <w:rFonts w:ascii="Times New Roman" w:hAnsi="Times New Roman" w:cs="Times New Roman"/>
-                <w:color w:val="auto"/>
-                <w:sz w:val="24"/>
-                <w:szCs w:val="24"/>
-              </w:rPr>
-            </m:ctrlPr>
-          </m:sub>
-        </m:sSub>
-        <m:r>
-          <m:rPr/>
-          <w:rPr>
-            <w:rFonts w:ascii="Times New Roman" w:hAnsi="Times New Roman" w:cs="Times New Roman"/>
-            <w:color w:val="auto"/>
-            <w:sz w:val="24"/>
-            <w:szCs w:val="24"/>
-          </w:rPr>
-          <m:t>=5α≈0.6</m:t>
-        </m:r>
-        <m:sSup>
-          <m:sSupPr/>
-          <m:e>
-            <m:r>
-              <m:rPr/>
-              <w:rPr>
-                <w:rFonts w:ascii="Times New Roman" w:hAnsi="Times New Roman" w:cs="Times New Roman"/>
-                <w:sz w:val="24"/>
-                <w:szCs w:val="24"/>
-              </w:rPr>
-              <m:t>m</m:t>
-            </m:r>
-          </m:e>
-          <m:sup>
-            <m:r>
-              <m:rPr/>
-              <w:rPr>
-                <w:rFonts w:ascii="Times New Roman" w:hAnsi="Times New Roman" w:cs="Times New Roman"/>
-                <w:sz w:val="24"/>
-                <w:szCs w:val="24"/>
-              </w:rPr>
-              <m:t>−1</m:t>
-            </m:r>
-          </m:sup>
-        </m:sSup>
-      </m:oMath>
     </w:p>
     <w:p>
       <w:pPr>
@@ -9349,60 +8402,6 @@
         </w:rPr>
         <w:t>1. Constrained point seeding: Generator points are placed along fracture traces at spacing h_n and in the matrix according to the density function Eq. (9).</w:t>
       </w:r>
-      <m:oMath>
-        <m:sSub>
-          <m:sSubPr>
-            <m:ctrlPr>
-              <w:rPr>
-                <w:rFonts w:ascii="Times New Roman" w:hAnsi="Times New Roman" w:cs="Times New Roman"/>
-                <w:color w:val="auto"/>
-                <w:sz w:val="24"/>
-                <w:szCs w:val="24"/>
-              </w:rPr>
-            </m:ctrlPr>
-          </m:sSubPr>
-          <m:e>
-            <m:r>
-              <m:rPr/>
-              <w:rPr>
-                <w:rFonts w:ascii="Times New Roman" w:hAnsi="Times New Roman" w:cs="Times New Roman"/>
-                <w:color w:val="auto"/>
-                <w:sz w:val="24"/>
-                <w:szCs w:val="24"/>
-              </w:rPr>
-              <m:t>h</m:t>
-            </m:r>
-            <m:ctrlPr>
-              <w:rPr>
-                <w:rFonts w:ascii="Times New Roman" w:hAnsi="Times New Roman" w:cs="Times New Roman"/>
-                <w:color w:val="auto"/>
-                <w:sz w:val="24"/>
-                <w:szCs w:val="24"/>
-              </w:rPr>
-            </m:ctrlPr>
-          </m:e>
-          <m:sub>
-            <m:r>
-              <m:rPr/>
-              <w:rPr>
-                <w:rFonts w:ascii="Times New Roman" w:hAnsi="Times New Roman" w:cs="Times New Roman"/>
-                <w:color w:val="auto"/>
-                <w:sz w:val="24"/>
-                <w:szCs w:val="24"/>
-              </w:rPr>
-              <m:t>n</m:t>
-            </m:r>
-            <m:ctrlPr>
-              <w:rPr>
-                <w:rFonts w:ascii="Times New Roman" w:hAnsi="Times New Roman" w:cs="Times New Roman"/>
-                <w:color w:val="auto"/>
-                <w:sz w:val="24"/>
-                <w:szCs w:val="24"/>
-              </w:rPr>
-            </m:ctrlPr>
-          </m:sub>
-        </m:sSub>
-      </m:oMath>
     </w:p>
     <w:p>
       <w:pPr>
@@ -9430,60 +8429,6 @@
         </w:rPr>
         <w:t>2. Constrained Delaunay triangulation: A CDT is constructed with fracture traces as constrained edges using the incremental flip algorithm (minimum angle bound 25 degrees; Ruppert, 1995).</w:t>
       </w:r>
-      <m:oMath>
-        <m:sSup>
-          <m:sSupPr>
-            <m:ctrlPr>
-              <w:rPr>
-                <w:rFonts w:ascii="Times New Roman" w:hAnsi="Times New Roman" w:cs="Times New Roman"/>
-                <w:color w:val="auto"/>
-                <w:sz w:val="24"/>
-                <w:szCs w:val="24"/>
-              </w:rPr>
-            </m:ctrlPr>
-          </m:sSupPr>
-          <m:e>
-            <m:r>
-              <m:rPr/>
-              <w:rPr>
-                <w:rFonts w:ascii="Times New Roman" w:hAnsi="Times New Roman" w:cs="Times New Roman"/>
-                <w:color w:val="auto"/>
-                <w:sz w:val="24"/>
-                <w:szCs w:val="24"/>
-              </w:rPr>
-              <m:t>25</m:t>
-            </m:r>
-            <m:ctrlPr>
-              <w:rPr>
-                <w:rFonts w:ascii="Times New Roman" w:hAnsi="Times New Roman" w:cs="Times New Roman"/>
-                <w:color w:val="auto"/>
-                <w:sz w:val="24"/>
-                <w:szCs w:val="24"/>
-              </w:rPr>
-            </m:ctrlPr>
-          </m:e>
-          <m:sup>
-            <m:r>
-              <m:rPr/>
-              <w:rPr>
-                <w:rFonts w:ascii="Times New Roman" w:hAnsi="Times New Roman" w:cs="Times New Roman"/>
-                <w:color w:val="auto"/>
-                <w:sz w:val="24"/>
-                <w:szCs w:val="24"/>
-              </w:rPr>
-              <m:t>∘</m:t>
-            </m:r>
-            <m:ctrlPr>
-              <w:rPr>
-                <w:rFonts w:ascii="Times New Roman" w:hAnsi="Times New Roman" w:cs="Times New Roman"/>
-                <w:color w:val="auto"/>
-                <w:sz w:val="24"/>
-                <w:szCs w:val="24"/>
-              </w:rPr>
-            </m:ctrlPr>
-          </m:sup>
-        </m:sSup>
-      </m:oMath>
     </w:p>
     <w:p>
       <w:pPr>
@@ -9511,70 +8456,6 @@
         </w:rPr>
         <w:t>3. Ruppert refinement: Steiner points are iteratively inserted at circumcenters of triangles violating the minimum angle bound or whose circumradius exceeds the local h(x) value. Refinement terminates when all quality criteria are satisfied.</w:t>
       </w:r>
-      <m:oMath>
-        <m:sSup>
-          <m:sSupPr>
-            <m:ctrlPr>
-              <w:rPr>
-                <w:rFonts w:ascii="Times New Roman" w:hAnsi="Times New Roman" w:cs="Times New Roman"/>
-                <w:color w:val="auto"/>
-                <w:sz w:val="24"/>
-                <w:szCs w:val="24"/>
-              </w:rPr>
-            </m:ctrlPr>
-          </m:sSupPr>
-          <m:e>
-            <m:r>
-              <m:rPr/>
-              <w:rPr>
-                <w:rFonts w:ascii="Times New Roman" w:hAnsi="Times New Roman" w:cs="Times New Roman"/>
-                <w:color w:val="auto"/>
-                <w:sz w:val="24"/>
-                <w:szCs w:val="24"/>
-              </w:rPr>
-              <m:t>25</m:t>
-            </m:r>
-            <m:ctrlPr>
-              <w:rPr>
-                <w:rFonts w:ascii="Times New Roman" w:hAnsi="Times New Roman" w:cs="Times New Roman"/>
-                <w:color w:val="auto"/>
-                <w:sz w:val="24"/>
-                <w:szCs w:val="24"/>
-              </w:rPr>
-            </m:ctrlPr>
-          </m:e>
-          <m:sup>
-            <m:r>
-              <m:rPr/>
-              <w:rPr>
-                <w:rFonts w:ascii="Times New Roman" w:hAnsi="Times New Roman" w:cs="Times New Roman"/>
-                <w:color w:val="auto"/>
-                <w:sz w:val="24"/>
-                <w:szCs w:val="24"/>
-              </w:rPr>
-              <m:t>∘</m:t>
-            </m:r>
-            <m:ctrlPr>
-              <w:rPr>
-                <w:rFonts w:ascii="Times New Roman" w:hAnsi="Times New Roman" w:cs="Times New Roman"/>
-                <w:color w:val="auto"/>
-                <w:sz w:val="24"/>
-                <w:szCs w:val="24"/>
-              </w:rPr>
-            </m:ctrlPr>
-          </m:sup>
-        </m:sSup>
-        <m:r>
-          <m:rPr/>
-          <w:rPr>
-            <w:rFonts w:ascii="Times New Roman" w:hAnsi="Times New Roman" w:cs="Times New Roman"/>
-            <w:color w:val="auto"/>
-            <w:sz w:val="24"/>
-            <w:szCs w:val="24"/>
-          </w:rPr>
-          <m:t>h(x)</m:t>
-        </m:r>
-      </m:oMath>
     </w:p>
     <w:p>
       <w:pPr>
@@ -9629,122 +8510,6 @@
         </w:rPr>
         <w:t>5. Lloyd smoothing: Generator positions are iteratively relocated to cell centroids for 50 iterations or until the maximum generator displacement falls below 0.01% of the local element spacing.</w:t>
       </w:r>
-      <m:oMath>
-        <m:sSup>
-          <m:sSupPr>
-            <m:ctrlPr>
-              <w:rPr>
-                <w:rFonts w:ascii="Times New Roman" w:hAnsi="Times New Roman" w:cs="Times New Roman"/>
-                <w:color w:val="auto"/>
-                <w:sz w:val="24"/>
-                <w:szCs w:val="24"/>
-              </w:rPr>
-            </m:ctrlPr>
-          </m:sSupPr>
-          <m:e>
-            <m:r>
-              <m:rPr/>
-              <w:rPr>
-                <w:rFonts w:ascii="Times New Roman" w:hAnsi="Times New Roman" w:cs="Times New Roman"/>
-                <w:color w:val="auto"/>
-                <w:sz w:val="24"/>
-                <w:szCs w:val="24"/>
-              </w:rPr>
-              <m:t>10</m:t>
-            </m:r>
-            <m:ctrlPr>
-              <w:rPr>
-                <w:rFonts w:ascii="Times New Roman" w:hAnsi="Times New Roman" w:cs="Times New Roman"/>
-                <w:color w:val="auto"/>
-                <w:sz w:val="24"/>
-                <w:szCs w:val="24"/>
-              </w:rPr>
-            </m:ctrlPr>
-          </m:e>
-          <m:sup>
-            <m:r>
-              <m:rPr/>
-              <w:rPr>
-                <w:rFonts w:ascii="Times New Roman" w:hAnsi="Times New Roman" w:cs="Times New Roman"/>
-                <w:color w:val="auto"/>
-                <w:sz w:val="24"/>
-                <w:szCs w:val="24"/>
-              </w:rPr>
-              <m:t>−4</m:t>
-            </m:r>
-            <m:ctrlPr>
-              <w:rPr>
-                <w:rFonts w:ascii="Times New Roman" w:hAnsi="Times New Roman" w:cs="Times New Roman"/>
-                <w:color w:val="auto"/>
-                <w:sz w:val="24"/>
-                <w:szCs w:val="24"/>
-              </w:rPr>
-            </m:ctrlPr>
-          </m:sup>
-        </m:sSup>
-        <m:r>
-          <m:rPr/>
-          <w:rPr>
-            <w:rFonts w:ascii="Times New Roman" w:hAnsi="Times New Roman" w:cs="Times New Roman"/>
-            <w:color w:val="auto"/>
-            <w:sz w:val="24"/>
-            <w:szCs w:val="24"/>
-          </w:rPr>
-          <m:t>⋅</m:t>
-        </m:r>
-        <m:sSub>
-          <m:sSubPr>
-            <m:ctrlPr>
-              <w:rPr>
-                <w:rFonts w:ascii="Times New Roman" w:hAnsi="Times New Roman" w:cs="Times New Roman"/>
-                <w:color w:val="auto"/>
-                <w:sz w:val="24"/>
-                <w:szCs w:val="24"/>
-              </w:rPr>
-            </m:ctrlPr>
-          </m:sSubPr>
-          <m:e>
-            <m:r>
-              <m:rPr/>
-              <w:rPr>
-                <w:rFonts w:ascii="Times New Roman" w:hAnsi="Times New Roman" w:cs="Times New Roman"/>
-                <w:color w:val="auto"/>
-                <w:sz w:val="24"/>
-                <w:szCs w:val="24"/>
-              </w:rPr>
-              <m:t>h</m:t>
-            </m:r>
-            <m:ctrlPr>
-              <w:rPr>
-                <w:rFonts w:ascii="Times New Roman" w:hAnsi="Times New Roman" w:cs="Times New Roman"/>
-                <w:color w:val="auto"/>
-                <w:sz w:val="24"/>
-                <w:szCs w:val="24"/>
-              </w:rPr>
-            </m:ctrlPr>
-          </m:e>
-          <m:sub>
-            <m:r>
-              <m:rPr/>
-              <w:rPr>
-                <w:rFonts w:ascii="Times New Roman" w:hAnsi="Times New Roman" w:cs="Times New Roman"/>
-                <w:color w:val="auto"/>
-                <w:sz w:val="24"/>
-                <w:szCs w:val="24"/>
-              </w:rPr>
-              <m:t>n</m:t>
-            </m:r>
-            <m:ctrlPr>
-              <w:rPr>
-                <w:rFonts w:ascii="Times New Roman" w:hAnsi="Times New Roman" w:cs="Times New Roman"/>
-                <w:color w:val="auto"/>
-                <w:sz w:val="24"/>
-                <w:szCs w:val="24"/>
-              </w:rPr>
-            </m:ctrlPr>
-          </m:sub>
-        </m:sSub>
-      </m:oMath>
     </w:p>
     <w:p>
       <w:pPr>
@@ -9766,7 +8531,7 @@
           <w:sz w:val="24"/>
           <w:szCs w:val="24"/>
         </w:rPr>
-        <w:t>Notably, Lloyd smoothing improves the K-orthogonality fraction monotonically from 96.4% (post-CDT) to 97.1% after 50 iterations (Table 3, Supplementary Material), reflecting the elimination of slivers and high-aspect-ratio cells. The Voronoi dual of a well-centered centroidal Voronoi tessellation generically exhibits lower face angular dispersion, confirming that Lloyd smoothing and orthogonality preservation are complementary rather than competing operations.</w:t>
+        <w:t>Notably, Lloyd smoothing improves the K-orthogonality fraction monotonically from 96.4% (post-CDT) to 97.1% after 50 iterations (Table 3, Supplementary Material), reflecting the elimination of slivers and high-aspect-ratio cells. The Voronoi dual of a well-centered centroidal Voronoi tessellation generically exhibits lower face angular dispersion, confirming that Lloyd smoothing and orthogonality preservation are complementary, not competing, operations.</w:t>
       </w:r>
     </w:p>
     <w:p>
@@ -11079,132 +9844,6 @@
         </w:rPr>
         <w:t>The complete generation workflow is illustrated in Figs. 2 and 3. Figure 4 reports the resulting orthogonality statistics: K-orthogonality (theta &lt;= 5 deg) is maintained on 97.1% of interior faces (median theta = 1.2 deg, maximum 3.4 deg). Non-orthogonal faces concentrate near fracture tips; fewer than 0.5% of faces exceed theta = 3 deg at distances greater than 10 m from any fracture.</w:t>
       </w:r>
-      <m:oMath>
-        <m:r>
-          <m:rPr/>
-          <w:rPr>
-            <w:rFonts w:ascii="Times New Roman" w:hAnsi="Times New Roman" w:cs="Times New Roman"/>
-            <w:color w:val="auto"/>
-            <w:sz w:val="24"/>
-            <w:szCs w:val="24"/>
-          </w:rPr>
-          <m:t>θ≤</m:t>
-        </m:r>
-        <m:sSup>
-          <m:sSupPr>
-            <m:ctrlPr>
-              <w:rPr>
-                <w:rFonts w:ascii="Times New Roman" w:hAnsi="Times New Roman" w:cs="Times New Roman"/>
-                <w:color w:val="auto"/>
-                <w:sz w:val="24"/>
-                <w:szCs w:val="24"/>
-              </w:rPr>
-            </m:ctrlPr>
-          </m:sSupPr>
-          <m:e>
-            <m:r>
-              <m:rPr/>
-              <w:rPr>
-                <w:rFonts w:ascii="Times New Roman" w:hAnsi="Times New Roman" w:cs="Times New Roman"/>
-                <w:color w:val="auto"/>
-                <w:sz w:val="24"/>
-                <w:szCs w:val="24"/>
-              </w:rPr>
-              <m:t>5</m:t>
-            </m:r>
-            <m:ctrlPr>
-              <w:rPr>
-                <w:rFonts w:ascii="Times New Roman" w:hAnsi="Times New Roman" w:cs="Times New Roman"/>
-                <w:color w:val="auto"/>
-                <w:sz w:val="24"/>
-                <w:szCs w:val="24"/>
-              </w:rPr>
-            </m:ctrlPr>
-          </m:e>
-          <m:sup>
-            <m:r>
-              <m:rPr/>
-              <w:rPr>
-                <w:rFonts w:ascii="Times New Roman" w:hAnsi="Times New Roman" w:cs="Times New Roman"/>
-                <w:color w:val="auto"/>
-                <w:sz w:val="24"/>
-                <w:szCs w:val="24"/>
-              </w:rPr>
-              <m:t>∘</m:t>
-            </m:r>
-            <m:ctrlPr>
-              <w:rPr>
-                <w:rFonts w:ascii="Times New Roman" w:hAnsi="Times New Roman" w:cs="Times New Roman"/>
-                <w:color w:val="auto"/>
-                <w:sz w:val="24"/>
-                <w:szCs w:val="24"/>
-              </w:rPr>
-            </m:ctrlPr>
-          </m:sup>
-        </m:sSup>
-        <m:r>
-          <m:rPr/>
-          <w:rPr>
-            <w:rFonts w:ascii="Times New Roman" w:hAnsi="Times New Roman" w:cs="Times New Roman"/>
-            <w:color w:val="auto"/>
-            <w:sz w:val="24"/>
-            <w:szCs w:val="24"/>
-          </w:rPr>
-          <m:t>θ=</m:t>
-        </m:r>
-        <m:sSup>
-          <m:sSupPr>
-            <m:ctrlPr>
-              <w:rPr>
-                <w:rFonts w:ascii="Times New Roman" w:hAnsi="Times New Roman" w:cs="Times New Roman"/>
-                <w:color w:val="auto"/>
-                <w:sz w:val="24"/>
-                <w:szCs w:val="24"/>
-              </w:rPr>
-            </m:ctrlPr>
-          </m:sSupPr>
-          <m:e>
-            <m:r>
-              <m:rPr/>
-              <w:rPr>
-                <w:rFonts w:ascii="Times New Roman" w:hAnsi="Times New Roman" w:cs="Times New Roman"/>
-                <w:color w:val="auto"/>
-                <w:sz w:val="24"/>
-                <w:szCs w:val="24"/>
-              </w:rPr>
-              <m:t>3</m:t>
-            </m:r>
-            <m:ctrlPr>
-              <w:rPr>
-                <w:rFonts w:ascii="Times New Roman" w:hAnsi="Times New Roman" w:cs="Times New Roman"/>
-                <w:color w:val="auto"/>
-                <w:sz w:val="24"/>
-                <w:szCs w:val="24"/>
-              </w:rPr>
-            </m:ctrlPr>
-          </m:e>
-          <m:sup>
-            <m:r>
-              <m:rPr/>
-              <w:rPr>
-                <w:rFonts w:ascii="Times New Roman" w:hAnsi="Times New Roman" w:cs="Times New Roman"/>
-                <w:color w:val="auto"/>
-                <w:sz w:val="24"/>
-                <w:szCs w:val="24"/>
-              </w:rPr>
-              <m:t>∘</m:t>
-            </m:r>
-            <m:ctrlPr>
-              <w:rPr>
-                <w:rFonts w:ascii="Times New Roman" w:hAnsi="Times New Roman" w:cs="Times New Roman"/>
-                <w:color w:val="auto"/>
-                <w:sz w:val="24"/>
-                <w:szCs w:val="24"/>
-              </w:rPr>
-            </m:ctrlPr>
-          </m:sup>
-        </m:sSup>
-      </m:oMath>
     </w:p>
     <w:p>
       <w:pPr>
@@ -11826,6 +10465,12 @@
             <w:insideH w:val="none" w:color="auto" w:sz="0" w:space="0"/>
             <w:insideV w:val="none" w:color="auto" w:sz="0" w:space="0"/>
           </w:tblBorders>
+          <w:tblCellMar>
+            <w:top w:w="0" w:type="dxa"/>
+            <w:left w:w="108" w:type="dxa"/>
+            <w:bottom w:w="0" w:type="dxa"/>
+            <w:right w:w="108" w:type="dxa"/>
+          </w:tblCellMar>
         </w:tblPrEx>
         <w:trPr>
           <w:trHeight w:val="0" w:hRule="atLeast"/>
@@ -12247,7 +10892,7 @@
             <w:r>
               <w:rPr>
                 <w:rFonts w:ascii="Times New Roman" w:hAnsi="Times New Roman"/>
-                <w:sz w:val="16"/>
+                <w:sz w:val="20"/>
                 <w:vertAlign w:val="superscript"/>
               </w:rPr>
               <w:t>(a)</w:t>
@@ -13413,7 +12058,7 @@
       <m:oMath>
         <m:acc>
           <m:accPr>
-            <m:chr m:val="0"/>
+            <m:chr m:val="^"/>
           </m:accPr>
           <m:e>
             <m:r>
@@ -13464,7 +12109,33 @@
           <w:sz w:val="24"/>
           <w:szCs w:val="24"/>
         </w:rPr>
-        <w:t xml:space="preserve">κ̂(A)/κ̂₀(A) = 18.6×, which corresponds to κ̂(A) ≈ 6.9 × 10⁷. When the grid is fracture-conforming, spurious off-diagonal flux terms disappear and the proxy drops to roughly 3.7 × 10⁶. Throughout this paper, we report the spectral conditioning proxy κ̂(A), defined as the ratio |λ|ₘₐₓ/|λ|ₘᵢₙ of the largest to smallest converged Ritz values obtained from the implicitly restarted Arnoldi method (ARPACK, accessed through the SLEPc interface): convergence tolerance τ_Aᵣₙ = 10⁻⁶ on the relative eigenvalue residual, Krylov subspace dimension m = 60, restart dimension k = 30 (i.e., the 30 most dominant Ritz values are retained at each restart). As a verification check, we cross-validated the Arnoldi-derived proxy against a sparse direct LU-based estimator (SuperLU_DIST, threshold-based ILU, drop tolerance 10⁻⁴). For the base-case PEBI matrix (N_c = 1,024,000, 3N_c ≈ 3.07M unknowns), the LU estimator </w:t>
+        <w:t xml:space="preserve">κ̂(A)/κ̂₀(A) = 18.6×, which corresponds to κ̂(A) ≈ 6.9 × 10⁷. When the grid is fracture-conforming, spurious off-diagonal flux terms disappear and the proxy drops to roughly 3.7 × 10⁶. Throughout this paper, we report the spectral conditioning proxy κ̂(A), defined as the ratio </w:t>
+      </w:r>
+      <m:oMath>
+        <m:r>
+          <m:rPr/>
+          <m:t>|λ|ₘₐₓ/|λ</m:t>
+        </m:r>
+      </m:oMath>
+      <w:r>
+        <w:rPr>
+          <w:rFonts w:ascii="Times New Roman" w:hAnsi="Times New Roman"/>
+          <w:sz w:val="24"/>
+        </w:rPr>
+        <w:t xml:space="preserve">|ₘᵢₙ of the largest to smallest converged Ritz values obtained from the implicitly restarted Arnoldi method (ARPACK, accessed through the SLEPc interface): convergence tolerance </w:t>
+      </w:r>
+      <m:oMath>
+        <m:r>
+          <m:rPr/>
+          <m:t>τ_Aᵣₙ = 10⁻⁶ on the relative eigenvalue residual</m:t>
+        </m:r>
+      </m:oMath>
+      <w:r>
+        <w:rPr>
+          <w:rFonts w:ascii="Times New Roman" w:hAnsi="Times New Roman"/>
+          <w:sz w:val="24"/>
+        </w:rPr>
+        <w:t xml:space="preserve">, Krylov subspace dimension m = 60, restart dimension k = 30 (i.e., the 30 most dominant Ritz values are retained at each restart). As a verification check, we cross-validated the Arnoldi-derived proxy against a sparse direct LU-based estimator (SuperLU_DIST, threshold-based ILU, drop tolerance 10⁻⁴). For the base-case PEBI matrix (N_c = 1,024,000, 3N_c ≈ 3.07M unknowns), the LU estimator </w:t>
       </w:r>
       <m:oMath>
         <m:r>
@@ -13489,7 +12160,7 @@
       <m:oMath>
         <m:acc>
           <m:accPr>
-            <m:chr m:val="0"/>
+            <m:chr m:val="^"/>
           </m:accPr>
           <m:e>
             <m:r>
@@ -19738,7 +18409,7 @@
           <w:rFonts w:ascii="Times New Roman" w:hAnsi="Times New Roman"/>
           <w:sz w:val="20"/>
         </w:rPr>
-        <w:t>Fig. 6. Analytical validation at t = 100 days. (a) Radial pressure profiles obtained with the PEBI grid, EDFM, Cartesian LGR, and Cartesian uniform mesh. (b) Relative error  as a function of radial distance. The PEBI discretization reproduces the analytical solution to within 0.31% at r = 1 m.</w:t>
+        <w:t>Fig. 6. Analytical validation at t = 100 days. (a) Radial pressure profiles obtained with the PEBI grid, EDFM, Cartesian LGR, and Cartesian uniform mesh. (b) Relative error as a function of radial distance. The PEBI discretization reproduces the analytical solution to within 0.31% at r = 1 m.</w:t>
       </w:r>
     </w:p>
     <w:p>
@@ -19760,7 +18431,7 @@
           <w:b w:val="0"/>
           <w:sz w:val="20"/>
         </w:rPr>
-        <w:t>Table 7: Relative pressure errors  at selected observation radii (t = 100 days).</w:t>
+        <w:t>Table 7: Relative pressure errors at selected observation radii (t = 100 days).</w:t>
       </w:r>
     </w:p>
     <w:tbl>
@@ -20498,7 +19169,7 @@
           <w:sz w:val="24"/>
           <w:szCs w:val="20"/>
         </w:rPr>
-        <w:t>Figure 6 and Table 7 confirm that the accuracy advantage is concentrated near the source region. At r = 1 m, the PEBI grid reduces pressure error by 53.0% relative to EDFM (0.66% vs. 0.31%), by 66.3% relative to Cartesian LGR (0.92% vs. 0.31%), and by 83.4% relative to the uniform Cartesian mesh (1.87% vs. 0.31%). This elimination of geometric flux distortion provides the foundation for the algebraic and parallel performance gains that follow.</w:t>
+        <w:t>Figure 6 and Table 7 confirm that the accuracy advantage is concentrated near the source region. At r = 1 m, the PEBI grid reduces pressure error by 53.0% relative to EDFM. (0.66% vs. 0.31%), by 66.3% relative to Cartesian LGR (0.92% vs. 0.31%), and by 83.4% relative to the uniform Cartesian mesh (1.87% vs. 0.31%). This elimination of geometric flux distortion provides the foundation for the algebraic and parallel performance gains that follow.</w:t>
       </w:r>
     </w:p>
     <w:p>
@@ -20517,7 +19188,20 @@
           <w:rFonts w:ascii="Times New Roman" w:hAnsi="Times New Roman"/>
           <w:sz w:val="24"/>
         </w:rPr>
-        <w:t>We assessed temporal convergence of the numerical scheme by varying the maximum timestep Δt_max from 0.1 to 30 days (note: Δt_max denotes the timestep size, distinct from the physical validation time of t = 100 days used in Fig. 6). The Newton–Raphson procedure landed within three to five iterations per step across every configuration, with the average nonlinear residual falling below. Below a maximum step of 5 days the solutions were timestep-independent, so all production forecasts in this paper use a conservative cap of 1 day.</w:t>
+        <w:t xml:space="preserve">We assessed temporal convergence of the numerical scheme by varying the maximum timestep </w:t>
+      </w:r>
+      <m:oMath>
+        <m:r>
+          <m:rPr/>
+          <m:t>Δt_max</m:t>
+        </m:r>
+      </m:oMath>
+      <w:r>
+        <w:rPr>
+          <w:rFonts w:ascii="Times New Roman" w:hAnsi="Times New Roman"/>
+          <w:sz w:val="24"/>
+        </w:rPr>
+        <w:t xml:space="preserve"> from 0.1 to 30 days (note: Δt_max denotes the timestep size, distinct from the physical validation time of t = 100 days used in Fig. 6). The Newton–Raphson procedure landed within three to five iterations per step across every configuration, with the average nonlinear residual falling below. Below a maximum step of 5 days the solutions were timestep-independent, so all production forecasts in this paper use a conservative cap of 1 day.</w:t>
       </w:r>
       <w:r>
         <w:rPr>
@@ -20545,16 +19229,7 @@
           <w:rFonts w:ascii="Times New Roman" w:hAnsi="Times New Roman"/>
           <w:sz w:val="24"/>
         </w:rPr>
-        <w:t>To assess spatial convergence of the PEBI discretization, a systematic grid refinement study was performed on the Ei-function validation case. Four PEBI meshes were generated with near-fracture spacing h_n varied systematically from 2.0 m to 0.25 m (factor-of-two refinement per level), while the far-field spacing h_f and transition parameter alpha were held fixed at 50.0 m and 0.5 m^{-1}, respectively, yielding cell counts of approximately 0.56M, 1.02M, 2.18M, and 4.51M. The near-fracture pressure error epsilon_p at r = 1 m and t = 100 days decreases monotonically: 0.61% (h_n = 2.0 m), 0.31% (h_n = 1.0 m), 0.16% (h_n = 0.5 m), and 0.09% (h_n = 0.25 m). Fitting the error model epsilon_p proportional to h_n^q yields an observed convergence order of q = 0.94 +/- 0.08 (R^2 = 0.991), consistent with the first-order accuracy expected from TP</w:t>
-      </w:r>
-      <w:bookmarkStart w:id="31" w:name="_GoBack"/>
-      <w:bookmarkEnd w:id="31"/>
-      <w:r>
-        <w:rPr>
-          <w:rFonts w:ascii="Times New Roman" w:hAnsi="Times New Roman"/>
-          <w:sz w:val="24"/>
-        </w:rPr>
-        <w:t>FA on K-orthogonal PEBI grids. The K-orthogonality fraction (theta &lt;= 5 degrees) remains between 96.8% and 97.8% across all four mesh resolutions, confirming that mesh quality does not degrade with refinement. At the finest resolution (h_n = 0.25 m), the 0.09% error approaches the residual attributable to far-field boundary effects and double-precision round-off, indicating diminishing returns beyond this resolution for engineering accuracy requirements. These results establish that the PEBI discretization is consistent and converges monotonically under mesh refinement. The base resolution (h_n = 1.0 m, 1.02M cells) is selected as the working mesh for all multiphase and field-scale simulations reported in Sections 3.2-3.8, representing a Pareto-optimal balance between accuracy (0.31%) and computational cost. Table S0 (Supplementary Material) tabulates the complete convergence data for all four resolutions.</w:t>
+        <w:t>To assess spatial convergence of the PEBI discretization, a systematic grid refinement study was performed on the Ei-function validation case. Four PEBI meshes were generated with near-fracture spacing h_n varied systematically from 2.0 m to 0.25 m (factor-of-two refinement per level), while the far-field spacing h_f and transition parameter alpha were held fixed at 50.0 m and 0.5 m^{-1}, respectively, yielding cell counts of approximately 0.56M, 1.02M, 2.18M, and 4.51M. The near-fracture pressure error epsilon_p at r = 1 m and t = 100 days decreases monotonically: 0.61% (h_n = 2.0 m), 0.31% (h_n = 1.0 m), 0.16% (h_n = 0.5 m), and 0.09% (h_n = 0.25 m). Fitting the error model epsilon_p proportional to h_n^q yields an observed convergence order of q = 0.94 +/- 0.08 (R^2 = 0.991), consistent with the first-order accuracy expected from TPFA on K-orthogonal PEBI grids. The K-orthogonality fraction (theta &lt;= 5 degrees) remains between 96.8% and 97.8% across all four mesh resolutions, confirming that mesh quality does not degrade with refinement. At the finest resolution (h_n = 0.25 m), the 0.09% error approaches the residual attributable to far-field boundary effects and double-precision round-off, indicating diminishing returns beyond this resolution for engineering accuracy requirements. These results establish that the PEBI discretization is consistent and converges monotonically under mesh refinement. The base resolution (h_n = 1.0 m, 1.02M cells) is selected as the working mesh for all multiphase and field-scale simulations reported in Sections 3.2-3.8, representing a Pareto-optimal balance between accuracy (0.31%) and computational cost. Table S0 (Supplementary Material) tabulates the complete convergence data for all four resolutions.</w:t>
       </w:r>
     </w:p>
     <w:p>
@@ -20605,1392 +19280,6 @@
         </w:rPr>
         <w:t>To validate multiphase behavior, a one-dimensional Buckley-Leverett waterflood was simulated. A horizontal domain (300 m) was initialized at irreducible water saturation (S_wc = 0.20) with constant-rate water injection at the left boundary. Corey-type relative permeability functions were used with exponents n_w = n_o = 2.0.</w:t>
       </w:r>
-      <m:oMath>
-        <m:sSub>
-          <m:sSubPr>
-            <m:ctrlPr>
-              <w:rPr>
-                <w:rFonts w:ascii="Times New Roman" w:hAnsi="Times New Roman" w:cs="Times New Roman"/>
-                <w:color w:val="auto"/>
-                <w:sz w:val="24"/>
-                <w:szCs w:val="24"/>
-              </w:rPr>
-            </m:ctrlPr>
-          </m:sSubPr>
-          <m:e>
-            <m:r>
-              <m:rPr/>
-              <w:rPr>
-                <w:rFonts w:ascii="Times New Roman" w:hAnsi="Times New Roman" w:cs="Times New Roman"/>
-                <w:color w:val="auto"/>
-                <w:sz w:val="24"/>
-                <w:szCs w:val="24"/>
-              </w:rPr>
-              <m:t>S</m:t>
-            </m:r>
-            <m:ctrlPr>
-              <w:rPr>
-                <w:rFonts w:ascii="Times New Roman" w:hAnsi="Times New Roman" w:cs="Times New Roman"/>
-                <w:color w:val="auto"/>
-                <w:sz w:val="24"/>
-                <w:szCs w:val="24"/>
-              </w:rPr>
-            </m:ctrlPr>
-          </m:e>
-          <m:sub>
-            <m:r>
-              <m:rPr/>
-              <w:rPr>
-                <w:rFonts w:ascii="Times New Roman" w:hAnsi="Times New Roman" w:cs="Times New Roman"/>
-                <w:color w:val="auto"/>
-                <w:sz w:val="24"/>
-                <w:szCs w:val="24"/>
-              </w:rPr>
-              <m:t>wc</m:t>
-            </m:r>
-            <m:ctrlPr>
-              <w:rPr>
-                <w:rFonts w:ascii="Times New Roman" w:hAnsi="Times New Roman" w:cs="Times New Roman"/>
-                <w:color w:val="auto"/>
-                <w:sz w:val="24"/>
-                <w:szCs w:val="24"/>
-              </w:rPr>
-            </m:ctrlPr>
-          </m:sub>
-        </m:sSub>
-        <m:r>
-          <m:rPr/>
-          <w:rPr>
-            <w:rFonts w:ascii="Times New Roman" w:hAnsi="Times New Roman" w:cs="Times New Roman"/>
-            <w:color w:val="auto"/>
-            <w:sz w:val="24"/>
-            <w:szCs w:val="24"/>
-          </w:rPr>
-          <m:t>=0.20</m:t>
-        </m:r>
-        <m:sSub>
-          <m:sSubPr>
-            <m:ctrlPr>
-              <w:rPr>
-                <w:rFonts w:ascii="Times New Roman" w:hAnsi="Times New Roman" w:cs="Times New Roman"/>
-                <w:color w:val="auto"/>
-                <w:sz w:val="24"/>
-                <w:szCs w:val="24"/>
-              </w:rPr>
-            </m:ctrlPr>
-          </m:sSubPr>
-          <m:e>
-            <m:r>
-              <m:rPr/>
-              <w:rPr>
-                <w:rFonts w:ascii="Times New Roman" w:hAnsi="Times New Roman" w:cs="Times New Roman"/>
-                <w:color w:val="auto"/>
-                <w:sz w:val="24"/>
-                <w:szCs w:val="24"/>
-              </w:rPr>
-              <m:t>k</m:t>
-            </m:r>
-            <m:ctrlPr>
-              <w:rPr>
-                <w:rFonts w:ascii="Times New Roman" w:hAnsi="Times New Roman" w:cs="Times New Roman"/>
-                <w:color w:val="auto"/>
-                <w:sz w:val="24"/>
-                <w:szCs w:val="24"/>
-              </w:rPr>
-            </m:ctrlPr>
-          </m:e>
-          <m:sub>
-            <m:r>
-              <m:rPr/>
-              <w:rPr>
-                <w:rFonts w:ascii="Times New Roman" w:hAnsi="Times New Roman" w:cs="Times New Roman"/>
-                <w:color w:val="auto"/>
-                <w:sz w:val="24"/>
-                <w:szCs w:val="24"/>
-              </w:rPr>
-              <m:t>rw</m:t>
-            </m:r>
-            <m:ctrlPr>
-              <w:rPr>
-                <w:rFonts w:ascii="Times New Roman" w:hAnsi="Times New Roman" w:cs="Times New Roman"/>
-                <w:color w:val="auto"/>
-                <w:sz w:val="24"/>
-                <w:szCs w:val="24"/>
-              </w:rPr>
-            </m:ctrlPr>
-          </m:sub>
-        </m:sSub>
-        <m:r>
-          <m:rPr/>
-          <w:rPr>
-            <w:rFonts w:ascii="Times New Roman" w:hAnsi="Times New Roman" w:cs="Times New Roman"/>
-            <w:color w:val="auto"/>
-            <w:sz w:val="24"/>
-            <w:szCs w:val="24"/>
-          </w:rPr>
-          <m:t>=</m:t>
-        </m:r>
-        <m:sSubSup>
-          <m:sSubSupPr>
-            <m:ctrlPr>
-              <w:rPr>
-                <w:rFonts w:ascii="Times New Roman" w:hAnsi="Times New Roman" w:cs="Times New Roman"/>
-                <w:color w:val="auto"/>
-                <w:sz w:val="24"/>
-                <w:szCs w:val="24"/>
-              </w:rPr>
-            </m:ctrlPr>
-          </m:sSubSupPr>
-          <m:e>
-            <m:r>
-              <m:rPr/>
-              <w:rPr>
-                <w:rFonts w:ascii="Times New Roman" w:hAnsi="Times New Roman" w:cs="Times New Roman"/>
-                <w:color w:val="auto"/>
-                <w:sz w:val="24"/>
-                <w:szCs w:val="24"/>
-              </w:rPr>
-              <m:t>k</m:t>
-            </m:r>
-            <m:ctrlPr>
-              <w:rPr>
-                <w:rFonts w:ascii="Times New Roman" w:hAnsi="Times New Roman" w:cs="Times New Roman"/>
-                <w:color w:val="auto"/>
-                <w:sz w:val="24"/>
-                <w:szCs w:val="24"/>
-              </w:rPr>
-            </m:ctrlPr>
-          </m:e>
-          <m:sub>
-            <m:r>
-              <m:rPr/>
-              <w:rPr>
-                <w:rFonts w:ascii="Times New Roman" w:hAnsi="Times New Roman" w:cs="Times New Roman"/>
-                <w:color w:val="auto"/>
-                <w:sz w:val="24"/>
-                <w:szCs w:val="24"/>
-              </w:rPr>
-              <m:t>rw</m:t>
-            </m:r>
-            <m:ctrlPr>
-              <w:rPr>
-                <w:rFonts w:ascii="Times New Roman" w:hAnsi="Times New Roman" w:cs="Times New Roman"/>
-                <w:color w:val="auto"/>
-                <w:sz w:val="24"/>
-                <w:szCs w:val="24"/>
-              </w:rPr>
-            </m:ctrlPr>
-          </m:sub>
-          <m:sup>
-            <m:r>
-              <m:rPr/>
-              <w:rPr>
-                <w:rFonts w:ascii="Times New Roman" w:hAnsi="Times New Roman" w:cs="Times New Roman"/>
-                <w:color w:val="auto"/>
-                <w:sz w:val="24"/>
-                <w:szCs w:val="24"/>
-              </w:rPr>
-              <m:t>0</m:t>
-            </m:r>
-            <m:ctrlPr>
-              <w:rPr>
-                <w:rFonts w:ascii="Times New Roman" w:hAnsi="Times New Roman" w:cs="Times New Roman"/>
-                <w:color w:val="auto"/>
-                <w:sz w:val="24"/>
-                <w:szCs w:val="24"/>
-              </w:rPr>
-            </m:ctrlPr>
-          </m:sup>
-        </m:sSubSup>
-        <m:r>
-          <m:rPr/>
-          <w:rPr>
-            <w:rFonts w:ascii="Times New Roman" w:hAnsi="Times New Roman" w:cs="Times New Roman"/>
-            <w:color w:val="auto"/>
-            <w:sz w:val="24"/>
-            <w:szCs w:val="24"/>
-          </w:rPr>
-          <m:t>((</m:t>
-        </m:r>
-        <m:sSub>
-          <m:sSubPr>
-            <m:ctrlPr>
-              <w:rPr>
-                <w:rFonts w:ascii="Times New Roman" w:hAnsi="Times New Roman" w:cs="Times New Roman"/>
-                <w:color w:val="auto"/>
-                <w:sz w:val="24"/>
-                <w:szCs w:val="24"/>
-              </w:rPr>
-            </m:ctrlPr>
-          </m:sSubPr>
-          <m:e>
-            <m:r>
-              <m:rPr/>
-              <w:rPr>
-                <w:rFonts w:ascii="Times New Roman" w:hAnsi="Times New Roman" w:cs="Times New Roman"/>
-                <w:color w:val="auto"/>
-                <w:sz w:val="24"/>
-                <w:szCs w:val="24"/>
-              </w:rPr>
-              <m:t>S</m:t>
-            </m:r>
-            <m:ctrlPr>
-              <w:rPr>
-                <w:rFonts w:ascii="Times New Roman" w:hAnsi="Times New Roman" w:cs="Times New Roman"/>
-                <w:color w:val="auto"/>
-                <w:sz w:val="24"/>
-                <w:szCs w:val="24"/>
-              </w:rPr>
-            </m:ctrlPr>
-          </m:e>
-          <m:sub>
-            <m:r>
-              <m:rPr/>
-              <w:rPr>
-                <w:rFonts w:ascii="Times New Roman" w:hAnsi="Times New Roman" w:cs="Times New Roman"/>
-                <w:color w:val="auto"/>
-                <w:sz w:val="24"/>
-                <w:szCs w:val="24"/>
-              </w:rPr>
-              <m:t>w</m:t>
-            </m:r>
-            <m:ctrlPr>
-              <w:rPr>
-                <w:rFonts w:ascii="Times New Roman" w:hAnsi="Times New Roman" w:cs="Times New Roman"/>
-                <w:color w:val="auto"/>
-                <w:sz w:val="24"/>
-                <w:szCs w:val="24"/>
-              </w:rPr>
-            </m:ctrlPr>
-          </m:sub>
-        </m:sSub>
-        <m:r>
-          <m:rPr/>
-          <w:rPr>
-            <w:rFonts w:ascii="Times New Roman" w:hAnsi="Times New Roman" w:cs="Times New Roman"/>
-            <w:color w:val="auto"/>
-            <w:sz w:val="24"/>
-            <w:szCs w:val="24"/>
-          </w:rPr>
-          <m:t>−</m:t>
-        </m:r>
-        <m:sSub>
-          <m:sSubPr>
-            <m:ctrlPr>
-              <w:rPr>
-                <w:rFonts w:ascii="Times New Roman" w:hAnsi="Times New Roman" w:cs="Times New Roman"/>
-                <w:color w:val="auto"/>
-                <w:sz w:val="24"/>
-                <w:szCs w:val="24"/>
-              </w:rPr>
-            </m:ctrlPr>
-          </m:sSubPr>
-          <m:e>
-            <m:r>
-              <m:rPr/>
-              <w:rPr>
-                <w:rFonts w:ascii="Times New Roman" w:hAnsi="Times New Roman" w:cs="Times New Roman"/>
-                <w:color w:val="auto"/>
-                <w:sz w:val="24"/>
-                <w:szCs w:val="24"/>
-              </w:rPr>
-              <m:t>S</m:t>
-            </m:r>
-            <m:ctrlPr>
-              <w:rPr>
-                <w:rFonts w:ascii="Times New Roman" w:hAnsi="Times New Roman" w:cs="Times New Roman"/>
-                <w:color w:val="auto"/>
-                <w:sz w:val="24"/>
-                <w:szCs w:val="24"/>
-              </w:rPr>
-            </m:ctrlPr>
-          </m:e>
-          <m:sub>
-            <m:r>
-              <m:rPr/>
-              <w:rPr>
-                <w:rFonts w:ascii="Times New Roman" w:hAnsi="Times New Roman" w:cs="Times New Roman"/>
-                <w:color w:val="auto"/>
-                <w:sz w:val="24"/>
-                <w:szCs w:val="24"/>
-              </w:rPr>
-              <m:t>wc</m:t>
-            </m:r>
-            <m:ctrlPr>
-              <w:rPr>
-                <w:rFonts w:ascii="Times New Roman" w:hAnsi="Times New Roman" w:cs="Times New Roman"/>
-                <w:color w:val="auto"/>
-                <w:sz w:val="24"/>
-                <w:szCs w:val="24"/>
-              </w:rPr>
-            </m:ctrlPr>
-          </m:sub>
-        </m:sSub>
-        <m:r>
-          <m:rPr/>
-          <w:rPr>
-            <w:rFonts w:ascii="Times New Roman" w:hAnsi="Times New Roman" w:cs="Times New Roman"/>
-            <w:color w:val="auto"/>
-            <w:sz w:val="24"/>
-            <w:szCs w:val="24"/>
-          </w:rPr>
-          <m:t>)/(1−</m:t>
-        </m:r>
-        <m:sSub>
-          <m:sSubPr>
-            <m:ctrlPr>
-              <w:rPr>
-                <w:rFonts w:ascii="Times New Roman" w:hAnsi="Times New Roman" w:cs="Times New Roman"/>
-                <w:color w:val="auto"/>
-                <w:sz w:val="24"/>
-                <w:szCs w:val="24"/>
-              </w:rPr>
-            </m:ctrlPr>
-          </m:sSubPr>
-          <m:e>
-            <m:r>
-              <m:rPr/>
-              <w:rPr>
-                <w:rFonts w:ascii="Times New Roman" w:hAnsi="Times New Roman" w:cs="Times New Roman"/>
-                <w:color w:val="auto"/>
-                <w:sz w:val="24"/>
-                <w:szCs w:val="24"/>
-              </w:rPr>
-              <m:t>S</m:t>
-            </m:r>
-            <m:ctrlPr>
-              <w:rPr>
-                <w:rFonts w:ascii="Times New Roman" w:hAnsi="Times New Roman" w:cs="Times New Roman"/>
-                <w:color w:val="auto"/>
-                <w:sz w:val="24"/>
-                <w:szCs w:val="24"/>
-              </w:rPr>
-            </m:ctrlPr>
-          </m:e>
-          <m:sub>
-            <m:r>
-              <m:rPr/>
-              <w:rPr>
-                <w:rFonts w:ascii="Times New Roman" w:hAnsi="Times New Roman" w:cs="Times New Roman"/>
-                <w:color w:val="auto"/>
-                <w:sz w:val="24"/>
-                <w:szCs w:val="24"/>
-              </w:rPr>
-              <m:t>wc</m:t>
-            </m:r>
-            <m:ctrlPr>
-              <w:rPr>
-                <w:rFonts w:ascii="Times New Roman" w:hAnsi="Times New Roman" w:cs="Times New Roman"/>
-                <w:color w:val="auto"/>
-                <w:sz w:val="24"/>
-                <w:szCs w:val="24"/>
-              </w:rPr>
-            </m:ctrlPr>
-          </m:sub>
-        </m:sSub>
-        <m:r>
-          <m:rPr/>
-          <w:rPr>
-            <w:rFonts w:ascii="Times New Roman" w:hAnsi="Times New Roman" w:cs="Times New Roman"/>
-            <w:color w:val="auto"/>
-            <w:sz w:val="24"/>
-            <w:szCs w:val="24"/>
-          </w:rPr>
-          <m:t>−</m:t>
-        </m:r>
-        <m:sSub>
-          <m:sSubPr>
-            <m:ctrlPr>
-              <w:rPr>
-                <w:rFonts w:ascii="Times New Roman" w:hAnsi="Times New Roman" w:cs="Times New Roman"/>
-                <w:color w:val="auto"/>
-                <w:sz w:val="24"/>
-                <w:szCs w:val="24"/>
-              </w:rPr>
-            </m:ctrlPr>
-          </m:sSubPr>
-          <m:e>
-            <m:r>
-              <m:rPr/>
-              <w:rPr>
-                <w:rFonts w:ascii="Times New Roman" w:hAnsi="Times New Roman" w:cs="Times New Roman"/>
-                <w:color w:val="auto"/>
-                <w:sz w:val="24"/>
-                <w:szCs w:val="24"/>
-              </w:rPr>
-              <m:t>S</m:t>
-            </m:r>
-            <m:ctrlPr>
-              <w:rPr>
-                <w:rFonts w:ascii="Times New Roman" w:hAnsi="Times New Roman" w:cs="Times New Roman"/>
-                <w:color w:val="auto"/>
-                <w:sz w:val="24"/>
-                <w:szCs w:val="24"/>
-              </w:rPr>
-            </m:ctrlPr>
-          </m:e>
-          <m:sub>
-            <m:r>
-              <m:rPr/>
-              <w:rPr>
-                <w:rFonts w:ascii="Times New Roman" w:hAnsi="Times New Roman" w:cs="Times New Roman"/>
-                <w:color w:val="auto"/>
-                <w:sz w:val="24"/>
-                <w:szCs w:val="24"/>
-              </w:rPr>
-              <m:t>or</m:t>
-            </m:r>
-            <m:ctrlPr>
-              <w:rPr>
-                <w:rFonts w:ascii="Times New Roman" w:hAnsi="Times New Roman" w:cs="Times New Roman"/>
-                <w:color w:val="auto"/>
-                <w:sz w:val="24"/>
-                <w:szCs w:val="24"/>
-              </w:rPr>
-            </m:ctrlPr>
-          </m:sub>
-        </m:sSub>
-        <m:r>
-          <m:rPr/>
-          <w:rPr>
-            <w:rFonts w:ascii="Times New Roman" w:hAnsi="Times New Roman" w:cs="Times New Roman"/>
-            <w:color w:val="auto"/>
-            <w:sz w:val="24"/>
-            <w:szCs w:val="24"/>
-          </w:rPr>
-          <m:t>)</m:t>
-        </m:r>
-        <m:sSup>
-          <m:sSupPr>
-            <m:ctrlPr>
-              <w:rPr>
-                <w:rFonts w:ascii="Times New Roman" w:hAnsi="Times New Roman" w:cs="Times New Roman"/>
-                <w:color w:val="auto"/>
-                <w:sz w:val="24"/>
-                <w:szCs w:val="24"/>
-              </w:rPr>
-            </m:ctrlPr>
-          </m:sSupPr>
-          <m:e>
-            <m:r>
-              <m:rPr/>
-              <w:rPr>
-                <w:rFonts w:ascii="Times New Roman" w:hAnsi="Times New Roman" w:cs="Times New Roman"/>
-                <w:color w:val="auto"/>
-                <w:sz w:val="24"/>
-                <w:szCs w:val="24"/>
-              </w:rPr>
-              <m:t>)</m:t>
-            </m:r>
-            <m:ctrlPr>
-              <w:rPr>
-                <w:rFonts w:ascii="Times New Roman" w:hAnsi="Times New Roman" w:cs="Times New Roman"/>
-                <w:color w:val="auto"/>
-                <w:sz w:val="24"/>
-                <w:szCs w:val="24"/>
-              </w:rPr>
-            </m:ctrlPr>
-          </m:e>
-          <m:sup>
-            <m:sSub>
-              <m:sSubPr>
-                <m:ctrlPr>
-                  <w:rPr>
-                    <w:rFonts w:ascii="Times New Roman" w:hAnsi="Times New Roman" w:cs="Times New Roman"/>
-                    <w:color w:val="auto"/>
-                    <w:sz w:val="24"/>
-                    <w:szCs w:val="24"/>
-                  </w:rPr>
-                </m:ctrlPr>
-              </m:sSubPr>
-              <m:e>
-                <m:r>
-                  <m:rPr/>
-                  <w:rPr>
-                    <w:rFonts w:ascii="Times New Roman" w:hAnsi="Times New Roman" w:cs="Times New Roman"/>
-                    <w:color w:val="auto"/>
-                    <w:sz w:val="24"/>
-                    <w:szCs w:val="24"/>
-                  </w:rPr>
-                  <m:t>n</m:t>
-                </m:r>
-                <m:ctrlPr>
-                  <w:rPr>
-                    <w:rFonts w:ascii="Times New Roman" w:hAnsi="Times New Roman" w:cs="Times New Roman"/>
-                    <w:color w:val="auto"/>
-                    <w:sz w:val="24"/>
-                    <w:szCs w:val="24"/>
-                  </w:rPr>
-                </m:ctrlPr>
-              </m:e>
-              <m:sub>
-                <m:r>
-                  <m:rPr/>
-                  <w:rPr>
-                    <w:rFonts w:ascii="Times New Roman" w:hAnsi="Times New Roman" w:cs="Times New Roman"/>
-                    <w:color w:val="auto"/>
-                    <w:sz w:val="24"/>
-                    <w:szCs w:val="24"/>
-                  </w:rPr>
-                  <m:t>w</m:t>
-                </m:r>
-                <m:ctrlPr>
-                  <w:rPr>
-                    <w:rFonts w:ascii="Times New Roman" w:hAnsi="Times New Roman" w:cs="Times New Roman"/>
-                    <w:color w:val="auto"/>
-                    <w:sz w:val="24"/>
-                    <w:szCs w:val="24"/>
-                  </w:rPr>
-                </m:ctrlPr>
-              </m:sub>
-            </m:sSub>
-            <m:ctrlPr>
-              <w:rPr>
-                <w:rFonts w:ascii="Times New Roman" w:hAnsi="Times New Roman" w:cs="Times New Roman"/>
-                <w:color w:val="auto"/>
-                <w:sz w:val="24"/>
-                <w:szCs w:val="24"/>
-              </w:rPr>
-            </m:ctrlPr>
-          </m:sup>
-        </m:sSup>
-        <m:sSub>
-          <m:sSubPr>
-            <m:ctrlPr>
-              <w:rPr>
-                <w:rFonts w:ascii="Times New Roman" w:hAnsi="Times New Roman" w:cs="Times New Roman"/>
-                <w:color w:val="auto"/>
-                <w:sz w:val="24"/>
-                <w:szCs w:val="24"/>
-              </w:rPr>
-            </m:ctrlPr>
-          </m:sSubPr>
-          <m:e>
-            <m:r>
-              <m:rPr/>
-              <w:rPr>
-                <w:rFonts w:ascii="Times New Roman" w:hAnsi="Times New Roman" w:cs="Times New Roman"/>
-                <w:color w:val="auto"/>
-                <w:sz w:val="24"/>
-                <w:szCs w:val="24"/>
-              </w:rPr>
-              <m:t>k</m:t>
-            </m:r>
-            <m:ctrlPr>
-              <w:rPr>
-                <w:rFonts w:ascii="Times New Roman" w:hAnsi="Times New Roman" w:cs="Times New Roman"/>
-                <w:color w:val="auto"/>
-                <w:sz w:val="24"/>
-                <w:szCs w:val="24"/>
-              </w:rPr>
-            </m:ctrlPr>
-          </m:e>
-          <m:sub>
-            <m:r>
-              <m:rPr/>
-              <w:rPr>
-                <w:rFonts w:ascii="Times New Roman" w:hAnsi="Times New Roman" w:cs="Times New Roman"/>
-                <w:color w:val="auto"/>
-                <w:sz w:val="24"/>
-                <w:szCs w:val="24"/>
-              </w:rPr>
-              <m:t>ro</m:t>
-            </m:r>
-            <m:ctrlPr>
-              <w:rPr>
-                <w:rFonts w:ascii="Times New Roman" w:hAnsi="Times New Roman" w:cs="Times New Roman"/>
-                <w:color w:val="auto"/>
-                <w:sz w:val="24"/>
-                <w:szCs w:val="24"/>
-              </w:rPr>
-            </m:ctrlPr>
-          </m:sub>
-        </m:sSub>
-        <m:r>
-          <m:rPr/>
-          <w:rPr>
-            <w:rFonts w:ascii="Times New Roman" w:hAnsi="Times New Roman" w:cs="Times New Roman"/>
-            <w:color w:val="auto"/>
-            <w:sz w:val="24"/>
-            <w:szCs w:val="24"/>
-          </w:rPr>
-          <m:t>=</m:t>
-        </m:r>
-        <m:sSubSup>
-          <m:sSubSupPr>
-            <m:ctrlPr>
-              <w:rPr>
-                <w:rFonts w:ascii="Times New Roman" w:hAnsi="Times New Roman" w:cs="Times New Roman"/>
-                <w:color w:val="auto"/>
-                <w:sz w:val="24"/>
-                <w:szCs w:val="24"/>
-              </w:rPr>
-            </m:ctrlPr>
-          </m:sSubSupPr>
-          <m:e>
-            <m:r>
-              <m:rPr/>
-              <w:rPr>
-                <w:rFonts w:ascii="Times New Roman" w:hAnsi="Times New Roman" w:cs="Times New Roman"/>
-                <w:color w:val="auto"/>
-                <w:sz w:val="24"/>
-                <w:szCs w:val="24"/>
-              </w:rPr>
-              <m:t>k</m:t>
-            </m:r>
-            <m:ctrlPr>
-              <w:rPr>
-                <w:rFonts w:ascii="Times New Roman" w:hAnsi="Times New Roman" w:cs="Times New Roman"/>
-                <w:color w:val="auto"/>
-                <w:sz w:val="24"/>
-                <w:szCs w:val="24"/>
-              </w:rPr>
-            </m:ctrlPr>
-          </m:e>
-          <m:sub>
-            <m:r>
-              <m:rPr/>
-              <w:rPr>
-                <w:rFonts w:ascii="Times New Roman" w:hAnsi="Times New Roman" w:cs="Times New Roman"/>
-                <w:color w:val="auto"/>
-                <w:sz w:val="24"/>
-                <w:szCs w:val="24"/>
-              </w:rPr>
-              <m:t>ro</m:t>
-            </m:r>
-            <m:ctrlPr>
-              <w:rPr>
-                <w:rFonts w:ascii="Times New Roman" w:hAnsi="Times New Roman" w:cs="Times New Roman"/>
-                <w:color w:val="auto"/>
-                <w:sz w:val="24"/>
-                <w:szCs w:val="24"/>
-              </w:rPr>
-            </m:ctrlPr>
-          </m:sub>
-          <m:sup>
-            <m:r>
-              <m:rPr/>
-              <w:rPr>
-                <w:rFonts w:ascii="Times New Roman" w:hAnsi="Times New Roman" w:cs="Times New Roman"/>
-                <w:color w:val="auto"/>
-                <w:sz w:val="24"/>
-                <w:szCs w:val="24"/>
-              </w:rPr>
-              <m:t>0</m:t>
-            </m:r>
-            <m:ctrlPr>
-              <w:rPr>
-                <w:rFonts w:ascii="Times New Roman" w:hAnsi="Times New Roman" w:cs="Times New Roman"/>
-                <w:color w:val="auto"/>
-                <w:sz w:val="24"/>
-                <w:szCs w:val="24"/>
-              </w:rPr>
-            </m:ctrlPr>
-          </m:sup>
-        </m:sSubSup>
-        <m:r>
-          <m:rPr/>
-          <w:rPr>
-            <w:rFonts w:ascii="Times New Roman" w:hAnsi="Times New Roman" w:cs="Times New Roman"/>
-            <w:color w:val="auto"/>
-            <w:sz w:val="24"/>
-            <w:szCs w:val="24"/>
-          </w:rPr>
-          <m:t>((1−</m:t>
-        </m:r>
-        <m:sSub>
-          <m:sSubPr>
-            <m:ctrlPr>
-              <w:rPr>
-                <w:rFonts w:ascii="Times New Roman" w:hAnsi="Times New Roman" w:cs="Times New Roman"/>
-                <w:color w:val="auto"/>
-                <w:sz w:val="24"/>
-                <w:szCs w:val="24"/>
-              </w:rPr>
-            </m:ctrlPr>
-          </m:sSubPr>
-          <m:e>
-            <m:r>
-              <m:rPr/>
-              <w:rPr>
-                <w:rFonts w:ascii="Times New Roman" w:hAnsi="Times New Roman" w:cs="Times New Roman"/>
-                <w:color w:val="auto"/>
-                <w:sz w:val="24"/>
-                <w:szCs w:val="24"/>
-              </w:rPr>
-              <m:t>S</m:t>
-            </m:r>
-            <m:ctrlPr>
-              <w:rPr>
-                <w:rFonts w:ascii="Times New Roman" w:hAnsi="Times New Roman" w:cs="Times New Roman"/>
-                <w:color w:val="auto"/>
-                <w:sz w:val="24"/>
-                <w:szCs w:val="24"/>
-              </w:rPr>
-            </m:ctrlPr>
-          </m:e>
-          <m:sub>
-            <m:r>
-              <m:rPr/>
-              <w:rPr>
-                <w:rFonts w:ascii="Times New Roman" w:hAnsi="Times New Roman" w:cs="Times New Roman"/>
-                <w:color w:val="auto"/>
-                <w:sz w:val="24"/>
-                <w:szCs w:val="24"/>
-              </w:rPr>
-              <m:t>w</m:t>
-            </m:r>
-            <m:ctrlPr>
-              <w:rPr>
-                <w:rFonts w:ascii="Times New Roman" w:hAnsi="Times New Roman" w:cs="Times New Roman"/>
-                <w:color w:val="auto"/>
-                <w:sz w:val="24"/>
-                <w:szCs w:val="24"/>
-              </w:rPr>
-            </m:ctrlPr>
-          </m:sub>
-        </m:sSub>
-        <m:r>
-          <m:rPr/>
-          <w:rPr>
-            <w:rFonts w:ascii="Times New Roman" w:hAnsi="Times New Roman" w:cs="Times New Roman"/>
-            <w:color w:val="auto"/>
-            <w:sz w:val="24"/>
-            <w:szCs w:val="24"/>
-          </w:rPr>
-          <m:t>−</m:t>
-        </m:r>
-        <m:sSub>
-          <m:sSubPr>
-            <m:ctrlPr>
-              <w:rPr>
-                <w:rFonts w:ascii="Times New Roman" w:hAnsi="Times New Roman" w:cs="Times New Roman"/>
-                <w:color w:val="auto"/>
-                <w:sz w:val="24"/>
-                <w:szCs w:val="24"/>
-              </w:rPr>
-            </m:ctrlPr>
-          </m:sSubPr>
-          <m:e>
-            <m:r>
-              <m:rPr/>
-              <w:rPr>
-                <w:rFonts w:ascii="Times New Roman" w:hAnsi="Times New Roman" w:cs="Times New Roman"/>
-                <w:color w:val="auto"/>
-                <w:sz w:val="24"/>
-                <w:szCs w:val="24"/>
-              </w:rPr>
-              <m:t>S</m:t>
-            </m:r>
-            <m:ctrlPr>
-              <w:rPr>
-                <w:rFonts w:ascii="Times New Roman" w:hAnsi="Times New Roman" w:cs="Times New Roman"/>
-                <w:color w:val="auto"/>
-                <w:sz w:val="24"/>
-                <w:szCs w:val="24"/>
-              </w:rPr>
-            </m:ctrlPr>
-          </m:e>
-          <m:sub>
-            <m:r>
-              <m:rPr/>
-              <w:rPr>
-                <w:rFonts w:ascii="Times New Roman" w:hAnsi="Times New Roman" w:cs="Times New Roman"/>
-                <w:color w:val="auto"/>
-                <w:sz w:val="24"/>
-                <w:szCs w:val="24"/>
-              </w:rPr>
-              <m:t>or</m:t>
-            </m:r>
-            <m:ctrlPr>
-              <w:rPr>
-                <w:rFonts w:ascii="Times New Roman" w:hAnsi="Times New Roman" w:cs="Times New Roman"/>
-                <w:color w:val="auto"/>
-                <w:sz w:val="24"/>
-                <w:szCs w:val="24"/>
-              </w:rPr>
-            </m:ctrlPr>
-          </m:sub>
-        </m:sSub>
-        <m:r>
-          <m:rPr/>
-          <w:rPr>
-            <w:rFonts w:ascii="Times New Roman" w:hAnsi="Times New Roman" w:cs="Times New Roman"/>
-            <w:color w:val="auto"/>
-            <w:sz w:val="24"/>
-            <w:szCs w:val="24"/>
-          </w:rPr>
-          <m:t>)/(1−</m:t>
-        </m:r>
-        <m:sSub>
-          <m:sSubPr>
-            <m:ctrlPr>
-              <w:rPr>
-                <w:rFonts w:ascii="Times New Roman" w:hAnsi="Times New Roman" w:cs="Times New Roman"/>
-                <w:color w:val="auto"/>
-                <w:sz w:val="24"/>
-                <w:szCs w:val="24"/>
-              </w:rPr>
-            </m:ctrlPr>
-          </m:sSubPr>
-          <m:e>
-            <m:r>
-              <m:rPr/>
-              <w:rPr>
-                <w:rFonts w:ascii="Times New Roman" w:hAnsi="Times New Roman" w:cs="Times New Roman"/>
-                <w:color w:val="auto"/>
-                <w:sz w:val="24"/>
-                <w:szCs w:val="24"/>
-              </w:rPr>
-              <m:t>S</m:t>
-            </m:r>
-            <m:ctrlPr>
-              <w:rPr>
-                <w:rFonts w:ascii="Times New Roman" w:hAnsi="Times New Roman" w:cs="Times New Roman"/>
-                <w:color w:val="auto"/>
-                <w:sz w:val="24"/>
-                <w:szCs w:val="24"/>
-              </w:rPr>
-            </m:ctrlPr>
-          </m:e>
-          <m:sub>
-            <m:r>
-              <m:rPr/>
-              <w:rPr>
-                <w:rFonts w:ascii="Times New Roman" w:hAnsi="Times New Roman" w:cs="Times New Roman"/>
-                <w:color w:val="auto"/>
-                <w:sz w:val="24"/>
-                <w:szCs w:val="24"/>
-              </w:rPr>
-              <m:t>wc</m:t>
-            </m:r>
-            <m:ctrlPr>
-              <w:rPr>
-                <w:rFonts w:ascii="Times New Roman" w:hAnsi="Times New Roman" w:cs="Times New Roman"/>
-                <w:color w:val="auto"/>
-                <w:sz w:val="24"/>
-                <w:szCs w:val="24"/>
-              </w:rPr>
-            </m:ctrlPr>
-          </m:sub>
-        </m:sSub>
-        <m:r>
-          <m:rPr/>
-          <w:rPr>
-            <w:rFonts w:ascii="Times New Roman" w:hAnsi="Times New Roman" w:cs="Times New Roman"/>
-            <w:color w:val="auto"/>
-            <w:sz w:val="24"/>
-            <w:szCs w:val="24"/>
-          </w:rPr>
-          <m:t>−</m:t>
-        </m:r>
-        <m:sSub>
-          <m:sSubPr>
-            <m:ctrlPr>
-              <w:rPr>
-                <w:rFonts w:ascii="Times New Roman" w:hAnsi="Times New Roman" w:cs="Times New Roman"/>
-                <w:color w:val="auto"/>
-                <w:sz w:val="24"/>
-                <w:szCs w:val="24"/>
-              </w:rPr>
-            </m:ctrlPr>
-          </m:sSubPr>
-          <m:e>
-            <m:r>
-              <m:rPr/>
-              <w:rPr>
-                <w:rFonts w:ascii="Times New Roman" w:hAnsi="Times New Roman" w:cs="Times New Roman"/>
-                <w:color w:val="auto"/>
-                <w:sz w:val="24"/>
-                <w:szCs w:val="24"/>
-              </w:rPr>
-              <m:t>S</m:t>
-            </m:r>
-            <m:ctrlPr>
-              <w:rPr>
-                <w:rFonts w:ascii="Times New Roman" w:hAnsi="Times New Roman" w:cs="Times New Roman"/>
-                <w:color w:val="auto"/>
-                <w:sz w:val="24"/>
-                <w:szCs w:val="24"/>
-              </w:rPr>
-            </m:ctrlPr>
-          </m:e>
-          <m:sub>
-            <m:r>
-              <m:rPr/>
-              <w:rPr>
-                <w:rFonts w:ascii="Times New Roman" w:hAnsi="Times New Roman" w:cs="Times New Roman"/>
-                <w:color w:val="auto"/>
-                <w:sz w:val="24"/>
-                <w:szCs w:val="24"/>
-              </w:rPr>
-              <m:t>or</m:t>
-            </m:r>
-            <m:ctrlPr>
-              <w:rPr>
-                <w:rFonts w:ascii="Times New Roman" w:hAnsi="Times New Roman" w:cs="Times New Roman"/>
-                <w:color w:val="auto"/>
-                <w:sz w:val="24"/>
-                <w:szCs w:val="24"/>
-              </w:rPr>
-            </m:ctrlPr>
-          </m:sub>
-        </m:sSub>
-        <m:r>
-          <m:rPr/>
-          <w:rPr>
-            <w:rFonts w:ascii="Times New Roman" w:hAnsi="Times New Roman" w:cs="Times New Roman"/>
-            <w:color w:val="auto"/>
-            <w:sz w:val="24"/>
-            <w:szCs w:val="24"/>
-          </w:rPr>
-          <m:t>)</m:t>
-        </m:r>
-        <m:sSup>
-          <m:sSupPr>
-            <m:ctrlPr>
-              <w:rPr>
-                <w:rFonts w:ascii="Times New Roman" w:hAnsi="Times New Roman" w:cs="Times New Roman"/>
-                <w:color w:val="auto"/>
-                <w:sz w:val="24"/>
-                <w:szCs w:val="24"/>
-              </w:rPr>
-            </m:ctrlPr>
-          </m:sSupPr>
-          <m:e>
-            <m:r>
-              <m:rPr/>
-              <w:rPr>
-                <w:rFonts w:ascii="Times New Roman" w:hAnsi="Times New Roman" w:cs="Times New Roman"/>
-                <w:color w:val="auto"/>
-                <w:sz w:val="24"/>
-                <w:szCs w:val="24"/>
-              </w:rPr>
-              <m:t>)</m:t>
-            </m:r>
-            <m:ctrlPr>
-              <w:rPr>
-                <w:rFonts w:ascii="Times New Roman" w:hAnsi="Times New Roman" w:cs="Times New Roman"/>
-                <w:color w:val="auto"/>
-                <w:sz w:val="24"/>
-                <w:szCs w:val="24"/>
-              </w:rPr>
-            </m:ctrlPr>
-          </m:e>
-          <m:sup>
-            <m:sSub>
-              <m:sSubPr>
-                <m:ctrlPr>
-                  <w:rPr>
-                    <w:rFonts w:ascii="Times New Roman" w:hAnsi="Times New Roman" w:cs="Times New Roman"/>
-                    <w:color w:val="auto"/>
-                    <w:sz w:val="24"/>
-                    <w:szCs w:val="24"/>
-                  </w:rPr>
-                </m:ctrlPr>
-              </m:sSubPr>
-              <m:e>
-                <m:r>
-                  <m:rPr/>
-                  <w:rPr>
-                    <w:rFonts w:ascii="Times New Roman" w:hAnsi="Times New Roman" w:cs="Times New Roman"/>
-                    <w:color w:val="auto"/>
-                    <w:sz w:val="24"/>
-                    <w:szCs w:val="24"/>
-                  </w:rPr>
-                  <m:t>n</m:t>
-                </m:r>
-                <m:ctrlPr>
-                  <w:rPr>
-                    <w:rFonts w:ascii="Times New Roman" w:hAnsi="Times New Roman" w:cs="Times New Roman"/>
-                    <w:color w:val="auto"/>
-                    <w:sz w:val="24"/>
-                    <w:szCs w:val="24"/>
-                  </w:rPr>
-                </m:ctrlPr>
-              </m:e>
-              <m:sub>
-                <m:r>
-                  <m:rPr/>
-                  <w:rPr>
-                    <w:rFonts w:ascii="Times New Roman" w:hAnsi="Times New Roman" w:cs="Times New Roman"/>
-                    <w:color w:val="auto"/>
-                    <w:sz w:val="24"/>
-                    <w:szCs w:val="24"/>
-                  </w:rPr>
-                  <m:t>o</m:t>
-                </m:r>
-                <m:ctrlPr>
-                  <w:rPr>
-                    <w:rFonts w:ascii="Times New Roman" w:hAnsi="Times New Roman" w:cs="Times New Roman"/>
-                    <w:color w:val="auto"/>
-                    <w:sz w:val="24"/>
-                    <w:szCs w:val="24"/>
-                  </w:rPr>
-                </m:ctrlPr>
-              </m:sub>
-            </m:sSub>
-            <m:ctrlPr>
-              <w:rPr>
-                <w:rFonts w:ascii="Times New Roman" w:hAnsi="Times New Roman" w:cs="Times New Roman"/>
-                <w:color w:val="auto"/>
-                <w:sz w:val="24"/>
-                <w:szCs w:val="24"/>
-              </w:rPr>
-            </m:ctrlPr>
-          </m:sup>
-        </m:sSup>
-        <m:sSub>
-          <m:sSubPr>
-            <m:ctrlPr>
-              <w:rPr>
-                <w:rFonts w:ascii="Times New Roman" w:hAnsi="Times New Roman" w:cs="Times New Roman"/>
-                <w:color w:val="auto"/>
-                <w:sz w:val="24"/>
-                <w:szCs w:val="24"/>
-              </w:rPr>
-            </m:ctrlPr>
-          </m:sSubPr>
-          <m:e>
-            <m:r>
-              <m:rPr/>
-              <w:rPr>
-                <w:rFonts w:ascii="Times New Roman" w:hAnsi="Times New Roman" w:cs="Times New Roman"/>
-                <w:color w:val="auto"/>
-                <w:sz w:val="24"/>
-                <w:szCs w:val="24"/>
-              </w:rPr>
-              <m:t>n</m:t>
-            </m:r>
-            <m:ctrlPr>
-              <w:rPr>
-                <w:rFonts w:ascii="Times New Roman" w:hAnsi="Times New Roman" w:cs="Times New Roman"/>
-                <w:color w:val="auto"/>
-                <w:sz w:val="24"/>
-                <w:szCs w:val="24"/>
-              </w:rPr>
-            </m:ctrlPr>
-          </m:e>
-          <m:sub>
-            <m:r>
-              <m:rPr/>
-              <w:rPr>
-                <w:rFonts w:ascii="Times New Roman" w:hAnsi="Times New Roman" w:cs="Times New Roman"/>
-                <w:color w:val="auto"/>
-                <w:sz w:val="24"/>
-                <w:szCs w:val="24"/>
-              </w:rPr>
-              <m:t>w</m:t>
-            </m:r>
-            <m:ctrlPr>
-              <w:rPr>
-                <w:rFonts w:ascii="Times New Roman" w:hAnsi="Times New Roman" w:cs="Times New Roman"/>
-                <w:color w:val="auto"/>
-                <w:sz w:val="24"/>
-                <w:szCs w:val="24"/>
-              </w:rPr>
-            </m:ctrlPr>
-          </m:sub>
-        </m:sSub>
-        <m:r>
-          <m:rPr/>
-          <w:rPr>
-            <w:rFonts w:ascii="Times New Roman" w:hAnsi="Times New Roman" w:cs="Times New Roman"/>
-            <w:color w:val="auto"/>
-            <w:sz w:val="24"/>
-            <w:szCs w:val="24"/>
-          </w:rPr>
-          <m:t>=2.0</m:t>
-        </m:r>
-        <m:sSub>
-          <m:sSubPr>
-            <m:ctrlPr>
-              <w:rPr>
-                <w:rFonts w:ascii="Times New Roman" w:hAnsi="Times New Roman" w:cs="Times New Roman"/>
-                <w:color w:val="auto"/>
-                <w:sz w:val="24"/>
-                <w:szCs w:val="24"/>
-              </w:rPr>
-            </m:ctrlPr>
-          </m:sSubPr>
-          <m:e>
-            <m:r>
-              <m:rPr/>
-              <w:rPr>
-                <w:rFonts w:ascii="Times New Roman" w:hAnsi="Times New Roman" w:cs="Times New Roman"/>
-                <w:color w:val="auto"/>
-                <w:sz w:val="24"/>
-                <w:szCs w:val="24"/>
-              </w:rPr>
-              <m:t>n</m:t>
-            </m:r>
-            <m:ctrlPr>
-              <w:rPr>
-                <w:rFonts w:ascii="Times New Roman" w:hAnsi="Times New Roman" w:cs="Times New Roman"/>
-                <w:color w:val="auto"/>
-                <w:sz w:val="24"/>
-                <w:szCs w:val="24"/>
-              </w:rPr>
-            </m:ctrlPr>
-          </m:e>
-          <m:sub>
-            <m:r>
-              <m:rPr/>
-              <w:rPr>
-                <w:rFonts w:ascii="Times New Roman" w:hAnsi="Times New Roman" w:cs="Times New Roman"/>
-                <w:color w:val="auto"/>
-                <w:sz w:val="24"/>
-                <w:szCs w:val="24"/>
-              </w:rPr>
-              <m:t>o</m:t>
-            </m:r>
-            <m:ctrlPr>
-              <w:rPr>
-                <w:rFonts w:ascii="Times New Roman" w:hAnsi="Times New Roman" w:cs="Times New Roman"/>
-                <w:color w:val="auto"/>
-                <w:sz w:val="24"/>
-                <w:szCs w:val="24"/>
-              </w:rPr>
-            </m:ctrlPr>
-          </m:sub>
-        </m:sSub>
-        <m:r>
-          <m:rPr/>
-          <w:rPr>
-            <w:rFonts w:ascii="Times New Roman" w:hAnsi="Times New Roman" w:cs="Times New Roman"/>
-            <w:color w:val="auto"/>
-            <w:sz w:val="24"/>
-            <w:szCs w:val="24"/>
-          </w:rPr>
-          <m:t>=2.0</m:t>
-        </m:r>
-        <m:sSubSup>
-          <m:sSubSupPr>
-            <m:ctrlPr>
-              <w:rPr>
-                <w:rFonts w:ascii="Times New Roman" w:hAnsi="Times New Roman" w:cs="Times New Roman"/>
-                <w:color w:val="auto"/>
-                <w:sz w:val="24"/>
-                <w:szCs w:val="24"/>
-              </w:rPr>
-            </m:ctrlPr>
-          </m:sSubSupPr>
-          <m:e>
-            <m:r>
-              <m:rPr/>
-              <w:rPr>
-                <w:rFonts w:ascii="Times New Roman" w:hAnsi="Times New Roman" w:cs="Times New Roman"/>
-                <w:color w:val="auto"/>
-                <w:sz w:val="24"/>
-                <w:szCs w:val="24"/>
-              </w:rPr>
-              <m:t>k</m:t>
-            </m:r>
-            <m:ctrlPr>
-              <w:rPr>
-                <w:rFonts w:ascii="Times New Roman" w:hAnsi="Times New Roman" w:cs="Times New Roman"/>
-                <w:color w:val="auto"/>
-                <w:sz w:val="24"/>
-                <w:szCs w:val="24"/>
-              </w:rPr>
-            </m:ctrlPr>
-          </m:e>
-          <m:sub>
-            <m:r>
-              <m:rPr/>
-              <w:rPr>
-                <w:rFonts w:ascii="Times New Roman" w:hAnsi="Times New Roman" w:cs="Times New Roman"/>
-                <w:color w:val="auto"/>
-                <w:sz w:val="24"/>
-                <w:szCs w:val="24"/>
-              </w:rPr>
-              <m:t>rw</m:t>
-            </m:r>
-            <m:ctrlPr>
-              <w:rPr>
-                <w:rFonts w:ascii="Times New Roman" w:hAnsi="Times New Roman" w:cs="Times New Roman"/>
-                <w:color w:val="auto"/>
-                <w:sz w:val="24"/>
-                <w:szCs w:val="24"/>
-              </w:rPr>
-            </m:ctrlPr>
-          </m:sub>
-          <m:sup>
-            <m:r>
-              <m:rPr/>
-              <w:rPr>
-                <w:rFonts w:ascii="Times New Roman" w:hAnsi="Times New Roman" w:cs="Times New Roman"/>
-                <w:color w:val="auto"/>
-                <w:sz w:val="24"/>
-                <w:szCs w:val="24"/>
-              </w:rPr>
-              <m:t>0</m:t>
-            </m:r>
-            <m:ctrlPr>
-              <w:rPr>
-                <w:rFonts w:ascii="Times New Roman" w:hAnsi="Times New Roman" w:cs="Times New Roman"/>
-                <w:color w:val="auto"/>
-                <w:sz w:val="24"/>
-                <w:szCs w:val="24"/>
-              </w:rPr>
-            </m:ctrlPr>
-          </m:sup>
-        </m:sSubSup>
-        <m:r>
-          <m:rPr/>
-          <w:rPr>
-            <w:rFonts w:ascii="Times New Roman" w:hAnsi="Times New Roman" w:cs="Times New Roman"/>
-            <w:color w:val="auto"/>
-            <w:sz w:val="24"/>
-            <w:szCs w:val="24"/>
-          </w:rPr>
-          <m:t>=0.3</m:t>
-        </m:r>
-        <m:sSubSup>
-          <m:sSubSupPr>
-            <m:ctrlPr>
-              <w:rPr>
-                <w:rFonts w:ascii="Times New Roman" w:hAnsi="Times New Roman" w:cs="Times New Roman"/>
-                <w:color w:val="auto"/>
-                <w:sz w:val="24"/>
-                <w:szCs w:val="24"/>
-              </w:rPr>
-            </m:ctrlPr>
-          </m:sSubSupPr>
-          <m:e>
-            <m:r>
-              <m:rPr/>
-              <w:rPr>
-                <w:rFonts w:ascii="Times New Roman" w:hAnsi="Times New Roman" w:cs="Times New Roman"/>
-                <w:color w:val="auto"/>
-                <w:sz w:val="24"/>
-                <w:szCs w:val="24"/>
-              </w:rPr>
-              <m:t>k</m:t>
-            </m:r>
-            <m:ctrlPr>
-              <w:rPr>
-                <w:rFonts w:ascii="Times New Roman" w:hAnsi="Times New Roman" w:cs="Times New Roman"/>
-                <w:color w:val="auto"/>
-                <w:sz w:val="24"/>
-                <w:szCs w:val="24"/>
-              </w:rPr>
-            </m:ctrlPr>
-          </m:e>
-          <m:sub>
-            <m:r>
-              <m:rPr/>
-              <w:rPr>
-                <w:rFonts w:ascii="Times New Roman" w:hAnsi="Times New Roman" w:cs="Times New Roman"/>
-                <w:color w:val="auto"/>
-                <w:sz w:val="24"/>
-                <w:szCs w:val="24"/>
-              </w:rPr>
-              <m:t>ro</m:t>
-            </m:r>
-            <m:ctrlPr>
-              <w:rPr>
-                <w:rFonts w:ascii="Times New Roman" w:hAnsi="Times New Roman" w:cs="Times New Roman"/>
-                <w:color w:val="auto"/>
-                <w:sz w:val="24"/>
-                <w:szCs w:val="24"/>
-              </w:rPr>
-            </m:ctrlPr>
-          </m:sub>
-          <m:sup>
-            <m:r>
-              <m:rPr/>
-              <w:rPr>
-                <w:rFonts w:ascii="Times New Roman" w:hAnsi="Times New Roman" w:cs="Times New Roman"/>
-                <w:color w:val="auto"/>
-                <w:sz w:val="24"/>
-                <w:szCs w:val="24"/>
-              </w:rPr>
-              <m:t>0</m:t>
-            </m:r>
-            <m:ctrlPr>
-              <w:rPr>
-                <w:rFonts w:ascii="Times New Roman" w:hAnsi="Times New Roman" w:cs="Times New Roman"/>
-                <w:color w:val="auto"/>
-                <w:sz w:val="24"/>
-                <w:szCs w:val="24"/>
-              </w:rPr>
-            </m:ctrlPr>
-          </m:sup>
-        </m:sSubSup>
-        <m:r>
-          <m:rPr/>
-          <w:rPr>
-            <w:rFonts w:ascii="Times New Roman" w:hAnsi="Times New Roman" w:cs="Times New Roman"/>
-            <w:color w:val="auto"/>
-            <w:sz w:val="24"/>
-            <w:szCs w:val="24"/>
-          </w:rPr>
-          <m:t>=0.8</m:t>
-        </m:r>
-        <m:sSub>
-          <m:sSubPr>
-            <m:ctrlPr>
-              <w:rPr>
-                <w:rFonts w:ascii="Times New Roman" w:hAnsi="Times New Roman" w:cs="Times New Roman"/>
-                <w:color w:val="auto"/>
-                <w:sz w:val="24"/>
-                <w:szCs w:val="24"/>
-              </w:rPr>
-            </m:ctrlPr>
-          </m:sSubPr>
-          <m:e>
-            <m:r>
-              <m:rPr/>
-              <w:rPr>
-                <w:rFonts w:ascii="Times New Roman" w:hAnsi="Times New Roman" w:cs="Times New Roman"/>
-                <w:color w:val="auto"/>
-                <w:sz w:val="24"/>
-                <w:szCs w:val="24"/>
-              </w:rPr>
-              <m:t>S</m:t>
-            </m:r>
-            <m:ctrlPr>
-              <w:rPr>
-                <w:rFonts w:ascii="Times New Roman" w:hAnsi="Times New Roman" w:cs="Times New Roman"/>
-                <w:color w:val="auto"/>
-                <w:sz w:val="24"/>
-                <w:szCs w:val="24"/>
-              </w:rPr>
-            </m:ctrlPr>
-          </m:e>
-          <m:sub>
-            <m:r>
-              <m:rPr/>
-              <w:rPr>
-                <w:rFonts w:ascii="Times New Roman" w:hAnsi="Times New Roman" w:cs="Times New Roman"/>
-                <w:color w:val="auto"/>
-                <w:sz w:val="24"/>
-                <w:szCs w:val="24"/>
-              </w:rPr>
-              <m:t>or</m:t>
-            </m:r>
-            <m:ctrlPr>
-              <w:rPr>
-                <w:rFonts w:ascii="Times New Roman" w:hAnsi="Times New Roman" w:cs="Times New Roman"/>
-                <w:color w:val="auto"/>
-                <w:sz w:val="24"/>
-                <w:szCs w:val="24"/>
-              </w:rPr>
-            </m:ctrlPr>
-          </m:sub>
-        </m:sSub>
-        <m:r>
-          <m:rPr/>
-          <w:rPr>
-            <w:rFonts w:ascii="Times New Roman" w:hAnsi="Times New Roman" w:cs="Times New Roman"/>
-            <w:color w:val="auto"/>
-            <w:sz w:val="24"/>
-            <w:szCs w:val="24"/>
-          </w:rPr>
-          <m:t>=0.25</m:t>
-        </m:r>
-      </m:oMath>
     </w:p>
     <w:p>
       <w:pPr>
@@ -22056,258 +19345,8 @@
           <w:sz w:val="24"/>
           <w:szCs w:val="24"/>
         </w:rPr>
-        <w:t>To validate on a more geologically complex benchmark, the proposed PEBI framework was applied to the SPE 10 Comparative Solution Project (Christie and Blunt, 2001). SPE 10 comprises a geostatistically generated 1,122,000-cell grid with permeability spanning over 8 orders of magnitude. We re-computed a fully implicit solution on the standard Cartesian grid using our own black-oil simulator with identical PVT, relative permeability, and well controls as the PEBI simulation. Since the reservoir pressure remained above the bubble point throughout the 2,000-day forecast, no free gas evolved and the system reduced to the standard two-phase SPE 10 problem.</w:t>
+        <w:t>To validate on a more geologically complex benchmark, the PEBI framework was applied to the SPE 10 Comparative Solution Project (Christie and Blunt, 2001). SPE 10 comprises a geostatistically generated 1,122,000-cell grid with permeability spanning over 8 orders of magnitude. We re-computed a fully implicit solution on the standard Cartesian grid using our own black-oil simulator with identical PVT, relative permeability, and well controls as the PEBI simulation. Since the reservoir pressure remained above the bubble point throughout the 2,000-day forecast, no free gas evolved and the system reduced to the standard two-phase SPE 10 problem.</w:t>
       </w:r>
-      <m:oMath>
-        <m:r>
-          <m:rPr/>
-          <w:rPr>
-            <w:rFonts w:ascii="Times New Roman" w:hAnsi="Times New Roman" w:cs="Times New Roman"/>
-            <w:color w:val="auto"/>
-            <w:sz w:val="24"/>
-            <w:szCs w:val="24"/>
-          </w:rPr>
-          <m:t>60×220×851,122,00018.24×</m:t>
-        </m:r>
-        <m:sSup>
-          <m:sSupPr>
-            <m:ctrlPr>
-              <w:rPr>
-                <w:rFonts w:ascii="Times New Roman" w:hAnsi="Times New Roman" w:cs="Times New Roman"/>
-                <w:color w:val="auto"/>
-                <w:sz w:val="24"/>
-                <w:szCs w:val="24"/>
-              </w:rPr>
-            </m:ctrlPr>
-          </m:sSupPr>
-          <m:e>
-            <m:r>
-              <m:rPr/>
-              <w:rPr>
-                <w:rFonts w:ascii="Times New Roman" w:hAnsi="Times New Roman" w:cs="Times New Roman"/>
-                <w:color w:val="auto"/>
-                <w:sz w:val="24"/>
-                <w:szCs w:val="24"/>
-              </w:rPr>
-              <m:t>10</m:t>
-            </m:r>
-            <m:ctrlPr>
-              <w:rPr>
-                <w:rFonts w:ascii="Times New Roman" w:hAnsi="Times New Roman" w:cs="Times New Roman"/>
-                <w:color w:val="auto"/>
-                <w:sz w:val="24"/>
-                <w:szCs w:val="24"/>
-              </w:rPr>
-            </m:ctrlPr>
-          </m:e>
-          <m:sup>
-            <m:r>
-              <m:rPr/>
-              <w:rPr>
-                <w:rFonts w:ascii="Times New Roman" w:hAnsi="Times New Roman" w:cs="Times New Roman"/>
-                <w:color w:val="auto"/>
-                <w:sz w:val="24"/>
-                <w:szCs w:val="24"/>
-              </w:rPr>
-              <m:t>6</m:t>
-            </m:r>
-            <m:ctrlPr>
-              <w:rPr>
-                <w:rFonts w:ascii="Times New Roman" w:hAnsi="Times New Roman" w:cs="Times New Roman"/>
-                <w:color w:val="auto"/>
-                <w:sz w:val="24"/>
-                <w:szCs w:val="24"/>
-              </w:rPr>
-            </m:ctrlPr>
-          </m:sup>
-        </m:sSup>
-        <m:sSub>
-          <m:sSubPr>
-            <m:ctrlPr>
-              <w:rPr>
-                <w:rFonts w:ascii="Times New Roman" w:hAnsi="Times New Roman" w:cs="Times New Roman"/>
-                <w:color w:val="auto"/>
-                <w:sz w:val="24"/>
-                <w:szCs w:val="24"/>
-              </w:rPr>
-            </m:ctrlPr>
-          </m:sSubPr>
-          <m:e>
-            <m:r>
-              <m:rPr/>
-              <w:rPr>
-                <w:rFonts w:ascii="Times New Roman" w:hAnsi="Times New Roman" w:cs="Times New Roman"/>
-                <w:color w:val="auto"/>
-                <w:sz w:val="24"/>
-                <w:szCs w:val="24"/>
-              </w:rPr>
-              <m:t>S</m:t>
-            </m:r>
-            <m:ctrlPr>
-              <w:rPr>
-                <w:rFonts w:ascii="Times New Roman" w:hAnsi="Times New Roman" w:cs="Times New Roman"/>
-                <w:color w:val="auto"/>
-                <w:sz w:val="24"/>
-                <w:szCs w:val="24"/>
-              </w:rPr>
-            </m:ctrlPr>
-          </m:e>
-          <m:sub>
-            <m:r>
-              <m:rPr/>
-              <w:rPr>
-                <w:rFonts w:ascii="Times New Roman" w:hAnsi="Times New Roman" w:cs="Times New Roman"/>
-                <w:color w:val="auto"/>
-                <w:sz w:val="24"/>
-                <w:szCs w:val="24"/>
-              </w:rPr>
-              <m:t>g</m:t>
-            </m:r>
-            <m:ctrlPr>
-              <w:rPr>
-                <w:rFonts w:ascii="Times New Roman" w:hAnsi="Times New Roman" w:cs="Times New Roman"/>
-                <w:color w:val="auto"/>
-                <w:sz w:val="24"/>
-                <w:szCs w:val="24"/>
-              </w:rPr>
-            </m:ctrlPr>
-          </m:sub>
-        </m:sSub>
-        <m:r>
-          <m:rPr/>
-          <w:rPr>
-            <w:rFonts w:ascii="Times New Roman" w:hAnsi="Times New Roman" w:cs="Times New Roman"/>
-            <w:color w:val="auto"/>
-            <w:sz w:val="24"/>
-            <w:szCs w:val="24"/>
-          </w:rPr>
-          <m:t>=0</m:t>
-        </m:r>
-        <m:sSub>
-          <m:sSubPr>
-            <m:ctrlPr>
-              <w:rPr>
-                <w:rFonts w:ascii="Times New Roman" w:hAnsi="Times New Roman" w:cs="Times New Roman"/>
-                <w:color w:val="auto"/>
-                <w:sz w:val="24"/>
-                <w:szCs w:val="24"/>
-              </w:rPr>
-            </m:ctrlPr>
-          </m:sSubPr>
-          <m:e>
-            <m:r>
-              <m:rPr/>
-              <w:rPr>
-                <w:rFonts w:ascii="Times New Roman" w:hAnsi="Times New Roman" w:cs="Times New Roman"/>
-                <w:color w:val="auto"/>
-                <w:sz w:val="24"/>
-                <w:szCs w:val="24"/>
-              </w:rPr>
-              <m:t>R</m:t>
-            </m:r>
-            <m:ctrlPr>
-              <w:rPr>
-                <w:rFonts w:ascii="Times New Roman" w:hAnsi="Times New Roman" w:cs="Times New Roman"/>
-                <w:color w:val="auto"/>
-                <w:sz w:val="24"/>
-                <w:szCs w:val="24"/>
-              </w:rPr>
-            </m:ctrlPr>
-          </m:e>
-          <m:sub>
-            <m:r>
-              <m:rPr/>
-              <w:rPr>
-                <w:rFonts w:ascii="Times New Roman" w:hAnsi="Times New Roman" w:cs="Times New Roman"/>
-                <w:color w:val="auto"/>
-                <w:sz w:val="24"/>
-                <w:szCs w:val="24"/>
-              </w:rPr>
-              <m:t>s</m:t>
-            </m:r>
-            <m:ctrlPr>
-              <w:rPr>
-                <w:rFonts w:ascii="Times New Roman" w:hAnsi="Times New Roman" w:cs="Times New Roman"/>
-                <w:color w:val="auto"/>
-                <w:sz w:val="24"/>
-                <w:szCs w:val="24"/>
-              </w:rPr>
-            </m:ctrlPr>
-          </m:sub>
-        </m:sSub>
-        <m:r>
-          <m:rPr/>
-          <w:rPr>
-            <w:rFonts w:ascii="Times New Roman" w:hAnsi="Times New Roman" w:cs="Times New Roman"/>
-            <w:color w:val="auto"/>
-            <w:sz w:val="24"/>
-            <w:szCs w:val="24"/>
-          </w:rPr>
-          <m:t>=120</m:t>
-        </m:r>
-        <m:sSub>
-          <m:sSubPr>
-            <m:ctrlPr>
-              <w:rPr>
-                <w:rFonts w:ascii="Times New Roman" w:hAnsi="Times New Roman" w:cs="Times New Roman"/>
-                <w:color w:val="auto"/>
-                <w:sz w:val="24"/>
-                <w:szCs w:val="24"/>
-              </w:rPr>
-            </m:ctrlPr>
-          </m:sSubPr>
-          <m:e>
-            <m:r>
-              <m:rPr/>
-              <w:rPr>
-                <w:rFonts w:ascii="Times New Roman" w:hAnsi="Times New Roman" w:cs="Times New Roman"/>
-                <w:color w:val="auto"/>
-                <w:sz w:val="24"/>
-                <w:szCs w:val="24"/>
-              </w:rPr>
-              <m:t>p</m:t>
-            </m:r>
-            <m:ctrlPr>
-              <w:rPr>
-                <w:rFonts w:ascii="Times New Roman" w:hAnsi="Times New Roman" w:cs="Times New Roman"/>
-                <w:color w:val="auto"/>
-                <w:sz w:val="24"/>
-                <w:szCs w:val="24"/>
-              </w:rPr>
-            </m:ctrlPr>
-          </m:e>
-          <m:sub>
-            <m:r>
-              <m:rPr/>
-              <w:rPr>
-                <w:rFonts w:ascii="Times New Roman" w:hAnsi="Times New Roman" w:cs="Times New Roman"/>
-                <w:color w:val="auto"/>
-                <w:sz w:val="24"/>
-                <w:szCs w:val="24"/>
-              </w:rPr>
-              <m:t>b</m:t>
-            </m:r>
-            <m:ctrlPr>
-              <w:rPr>
-                <w:rFonts w:ascii="Times New Roman" w:hAnsi="Times New Roman" w:cs="Times New Roman"/>
-                <w:color w:val="auto"/>
-                <w:sz w:val="24"/>
-                <w:szCs w:val="24"/>
-              </w:rPr>
-            </m:ctrlPr>
-          </m:sub>
-        </m:sSub>
-        <m:r>
-          <m:rPr/>
-          <w:rPr>
-            <w:rFonts w:ascii="Times New Roman" w:hAnsi="Times New Roman" w:cs="Times New Roman"/>
-            <w:color w:val="auto"/>
-            <w:sz w:val="24"/>
-            <w:szCs w:val="24"/>
-          </w:rPr>
-          <m:t>=1,8002,140</m:t>
-        </m:r>
-      </m:oMath>
     </w:p>
     <w:p>
       <w:pPr>
@@ -22331,90 +19370,6 @@
         </w:rPr>
         <w:t>For the PEBI evaluation, a conforming mesh of 524,000 cells (approximately 47% of reference) was built with generators placed along major permeability boundaries identified through connected-component analysis. Permeability-informed seeding exploits prior knowledge of the permeability field, constituting an informational advantage over the uniform-resolution Cartesian reference. A permeability-unaware PEBI control mesh (identical 0.52M cells, uniform seeding) yields cumulative oil deviation of 1.9%, approximately twice the 0.93% of the permeability-aware mesh. We therefore classify the SPE 10 comparison conservatively as an illustrative benchmark rather than a controlled validation.</w:t>
       </w:r>
-      <m:oMath>
-        <m:sSub>
-          <m:sSubPr>
-            <m:ctrlPr>
-              <w:rPr>
-                <w:rFonts w:ascii="Times New Roman" w:hAnsi="Times New Roman" w:cs="Times New Roman"/>
-                <w:color w:val="auto"/>
-                <w:sz w:val="24"/>
-                <w:szCs w:val="24"/>
-              </w:rPr>
-            </m:ctrlPr>
-          </m:sSubPr>
-          <m:e>
-            <m:r>
-              <m:rPr>
-                <m:nor/>
-                <m:sty m:val="p"/>
-              </m:rPr>
-              <w:rPr>
-                <w:rFonts w:ascii="Times New Roman" w:hAnsi="Times New Roman" w:cs="Times New Roman"/>
-                <w:b w:val="0"/>
-                <w:i w:val="0"/>
-                <w:color w:val="auto"/>
-                <w:sz w:val="24"/>
-                <w:szCs w:val="24"/>
-              </w:rPr>
-              <m:t>log</m:t>
-            </m:r>
-            <m:ctrlPr>
-              <w:rPr>
-                <w:rFonts w:ascii="Times New Roman" w:hAnsi="Times New Roman" w:cs="Times New Roman"/>
-                <w:color w:val="auto"/>
-                <w:sz w:val="24"/>
-                <w:szCs w:val="24"/>
-              </w:rPr>
-            </m:ctrlPr>
-          </m:e>
-          <m:sub>
-            <m:r>
-              <m:rPr/>
-              <w:rPr>
-                <w:rFonts w:ascii="Times New Roman" w:hAnsi="Times New Roman" w:cs="Times New Roman"/>
-                <w:color w:val="auto"/>
-                <w:sz w:val="24"/>
-                <w:szCs w:val="24"/>
-              </w:rPr>
-              <m:t>10</m:t>
-            </m:r>
-            <m:ctrlPr>
-              <w:rPr>
-                <w:rFonts w:ascii="Times New Roman" w:hAnsi="Times New Roman" w:cs="Times New Roman"/>
-                <w:color w:val="auto"/>
-                <w:sz w:val="24"/>
-                <w:szCs w:val="24"/>
-              </w:rPr>
-            </m:ctrlPr>
-          </m:sub>
-        </m:sSub>
-        <m:r>
-          <m:rPr/>
-          <w:rPr>
-            <w:rFonts w:ascii="Times New Roman" w:hAnsi="Times New Roman" w:cs="Times New Roman"/>
-            <w:color w:val="auto"/>
-            <w:sz w:val="24"/>
-            <w:szCs w:val="24"/>
-          </w:rPr>
-          <m:t>(K)</m:t>
-        </m:r>
-        <m:r>
-          <m:rPr>
-            <m:nor/>
-            <m:sty m:val="p"/>
-          </m:rPr>
-          <w:rPr>
-            <w:rFonts w:ascii="Times New Roman" w:hAnsi="Times New Roman" w:cs="Times New Roman"/>
-            <w:b w:val="0"/>
-            <w:i w:val="0"/>
-            <w:color w:val="auto"/>
-            <w:sz w:val="24"/>
-            <w:szCs w:val="24"/>
-          </w:rPr>
-          <m:t>tanh</m:t>
-        </m:r>
-      </m:oMath>
     </w:p>
     <w:p>
       <w:pPr>
@@ -23309,162 +20264,8 @@
           <w:sz w:val="24"/>
           <w:szCs w:val="24"/>
         </w:rPr>
-        <w:t>The permeability-unaware PEBI control yields cumulative oil deviation of 1.9%, approximately twice the 0.93% of the permeability-aware mesh. This indicates that K-orthogonality alone accounts for roughly half the accuracy gain, with permeability-informed mesh concentration contributing the remaining half. A fully controlled isolation experiment comparing PEBI against Cartesian LGR at identical near-feature resolution is reserved for future work (Section 4.3).</w:t>
+        <w:t>The permeability-unaware PEBI control yields cumulative oil deviation of 1.9%, approximately twice the 0.93% of the permeability-aware mesh. This indicates that K-orthogonality alone accounts for roughly half the accuracy gain, with permeability-informed mesh concentration contributing the remaining half. A fully controlled isolation experiment comparing PEBI against Cartesian LGR at identical near-feature resolution is deferred to a dedicated follow-up study (see Section 4.3).</w:t>
       </w:r>
-      <m:oMath>
-        <m:r>
-          <m:rPr>
-            <m:nor/>
-            <m:sty m:val="p"/>
-          </m:rPr>
-          <w:rPr>
-            <w:rFonts w:ascii="Times New Roman" w:hAnsi="Times New Roman" w:cs="Times New Roman"/>
-            <w:b w:val="0"/>
-            <w:i w:val="0"/>
-            <w:color w:val="auto"/>
-            <w:sz w:val="24"/>
-            <w:szCs w:val="24"/>
-          </w:rPr>
-          <m:t>tanh</m:t>
-        </m:r>
-        <m:r>
-          <m:rPr/>
-          <w:rPr>
-            <w:rFonts w:ascii="Times New Roman" w:hAnsi="Times New Roman" w:cs="Times New Roman"/>
-            <w:color w:val="auto"/>
-            <w:sz w:val="24"/>
-            <w:szCs w:val="24"/>
-          </w:rPr>
-          <m:t>h(x)≡</m:t>
-        </m:r>
-        <m:sSub>
-          <m:sSubPr>
-            <m:ctrlPr>
-              <w:rPr>
-                <w:rFonts w:ascii="Times New Roman" w:hAnsi="Times New Roman" w:cs="Times New Roman"/>
-                <w:color w:val="auto"/>
-                <w:sz w:val="24"/>
-                <w:szCs w:val="24"/>
-              </w:rPr>
-            </m:ctrlPr>
-          </m:sSubPr>
-          <m:e>
-            <m:r>
-              <m:rPr/>
-              <w:rPr>
-                <w:rFonts w:ascii="Times New Roman" w:hAnsi="Times New Roman" w:cs="Times New Roman"/>
-                <w:color w:val="auto"/>
-                <w:sz w:val="24"/>
-                <w:szCs w:val="24"/>
-              </w:rPr>
-              <m:t>h</m:t>
-            </m:r>
-            <m:ctrlPr>
-              <w:rPr>
-                <w:rFonts w:ascii="Times New Roman" w:hAnsi="Times New Roman" w:cs="Times New Roman"/>
-                <w:color w:val="auto"/>
-                <w:sz w:val="24"/>
-                <w:szCs w:val="24"/>
-              </w:rPr>
-            </m:ctrlPr>
-          </m:e>
-          <m:sub>
-            <m:r>
-              <m:rPr/>
-              <w:rPr>
-                <w:rFonts w:ascii="Times New Roman" w:hAnsi="Times New Roman" w:cs="Times New Roman"/>
-                <w:color w:val="auto"/>
-                <w:sz w:val="24"/>
-                <w:szCs w:val="24"/>
-              </w:rPr>
-              <m:t>f</m:t>
-            </m:r>
-            <m:ctrlPr>
-              <w:rPr>
-                <w:rFonts w:ascii="Times New Roman" w:hAnsi="Times New Roman" w:cs="Times New Roman"/>
-                <w:color w:val="auto"/>
-                <w:sz w:val="24"/>
-                <w:szCs w:val="24"/>
-              </w:rPr>
-            </m:ctrlPr>
-          </m:sub>
-        </m:sSub>
-        <m:r>
-          <m:rPr>
-            <m:sty m:val="p"/>
-            <m:scr m:val="script"/>
-          </m:rPr>
-          <w:rPr>
-            <w:rFonts w:ascii="Times New Roman" w:hAnsi="Times New Roman" w:cs="Times New Roman"/>
-            <w:color w:val="auto"/>
-            <w:sz w:val="24"/>
-            <w:szCs w:val="24"/>
-          </w:rPr>
-          <m:t>ℱ</m:t>
-        </m:r>
-        <m:r>
-          <m:rPr/>
-          <w:rPr>
-            <w:rFonts w:ascii="Times New Roman" w:hAnsi="Times New Roman" w:cs="Times New Roman"/>
-            <w:color w:val="auto"/>
-            <w:sz w:val="24"/>
-            <w:szCs w:val="24"/>
-          </w:rPr>
-          <m:t>≡∅</m:t>
-        </m:r>
-        <m:sSub>
-          <m:sSubPr>
-            <m:ctrlPr>
-              <w:rPr>
-                <w:rFonts w:ascii="Times New Roman" w:hAnsi="Times New Roman" w:cs="Times New Roman"/>
-                <w:color w:val="auto"/>
-                <w:sz w:val="24"/>
-                <w:szCs w:val="24"/>
-              </w:rPr>
-            </m:ctrlPr>
-          </m:sSubPr>
-          <m:e>
-            <m:r>
-              <m:rPr/>
-              <w:rPr>
-                <w:rFonts w:ascii="Times New Roman" w:hAnsi="Times New Roman" w:cs="Times New Roman"/>
-                <w:color w:val="auto"/>
-                <w:sz w:val="24"/>
-                <w:szCs w:val="24"/>
-              </w:rPr>
-              <m:t>h</m:t>
-            </m:r>
-            <m:ctrlPr>
-              <w:rPr>
-                <w:rFonts w:ascii="Times New Roman" w:hAnsi="Times New Roman" w:cs="Times New Roman"/>
-                <w:color w:val="auto"/>
-                <w:sz w:val="24"/>
-                <w:szCs w:val="24"/>
-              </w:rPr>
-            </m:ctrlPr>
-          </m:e>
-          <m:sub>
-            <m:r>
-              <m:rPr/>
-              <w:rPr>
-                <w:rFonts w:ascii="Times New Roman" w:hAnsi="Times New Roman" w:cs="Times New Roman"/>
-                <w:color w:val="auto"/>
-                <w:sz w:val="24"/>
-                <w:szCs w:val="24"/>
-              </w:rPr>
-              <m:t>f</m:t>
-            </m:r>
-            <m:ctrlPr>
-              <w:rPr>
-                <w:rFonts w:ascii="Times New Roman" w:hAnsi="Times New Roman" w:cs="Times New Roman"/>
-                <w:color w:val="auto"/>
-                <w:sz w:val="24"/>
-                <w:szCs w:val="24"/>
-              </w:rPr>
-            </m:ctrlPr>
-          </m:sub>
-        </m:sSub>
-      </m:oMath>
     </w:p>
     <w:p>
       <w:pPr>
@@ -24379,7 +21180,7 @@
           <w:sz w:val="24"/>
           <w:szCs w:val="24"/>
         </w:rPr>
-        <w:t>As Fig. 7 and Table 9 demonstrate, agreement in cumulative production is a necessary but not sufficient condition for solution accuracy. Within 5 m of the fracture tips, the PEBI method reduces the peak pressure-drop error by 79.5% relative to Eclipse LGR and by 68.6% relative to EDFM</w:t>
+        <w:t>Figure 7 and Table 9 demonstrate that agreement in cumulative production is a necessary but not sufficient condition for solution accuracy. Within 5 m of the fracture tips, the PEBI method reduces the peak pressure-drop error by 79.5% relative to Eclipse LGR and by 68.6% relative to EDFM.</w:t>
       </w:r>
     </w:p>
     <w:p>
@@ -24415,7 +21216,7 @@
           <w:sz w:val="24"/>
           <w:szCs w:val="24"/>
         </w:rPr>
-        <w:t>The performance of the tested preconditioners on the 32-million-cell model at 512 cores is summarized in Table 10.</w:t>
+        <w:t>Table 10 summarizes preconditioner performance on the 32-million-cell model at 512 cores.</w:t>
       </w:r>
     </w:p>
     <w:p>
@@ -25558,7 +22359,7 @@
           <w:sz w:val="24"/>
           <w:szCs w:val="24"/>
         </w:rPr>
-        <w:t>As Fig. 8 illustrates, CPR-SA-AMG achieves a 14.9-fold reduction in GMRES iteration count (mean 21.0 +/- 2.3, n = 3,650 Newton steps) and a 72.7% decrease in solve time relative to Block-ILU(0). The SA-AMG setup overhead accounts for only 5.1% of total solution time, substantially below the 14.5% required by BoomerAMG (Henson and Yang, 2002; Falgout et al., 2006). This advantage traces to the PEBI-generated Jacobian, whose enhanced diagonal dominance (mean delta = 2.18 vs. 1.43 for Cartesian LGR) supports more efficient aggregate construction. The 21 vs. 28 iteration edge over BoomerAMG is consistent across all timesteps (paired t-test p &lt; 0.001).</w:t>
+        <w:t>Figure 8 illustrates that CPR-SA-AMG achieves a 14.9-fold reduction in GMRES iteration count (mean 21.0 +/- 2.3, n = 3,650 Newton steps) and a 72.7% decrease in solve time relative to Block-ILU(0). The SA-AMG setup overhead accounts for only 5.1% of total solution time, substantially below the 14.5% required by BoomerAMG (Henson and Yang, 2002; Falgout et al., 2006). This advantage traces to the PEBI-generated Jacobian, whose enhanced diagonal dominance (mean delta = 2.18 vs. 1.43 for Cartesian LGR) supports more efficient aggregate construction. The 21 vs. 28 iteration edge over BoomerAMG is consistent across all timesteps (paired t-test p &lt; 0.001).</w:t>
       </w:r>
     </w:p>
     <w:p>
@@ -25581,7 +22382,7 @@
           <w:sz w:val="24"/>
           <w:szCs w:val="24"/>
         </w:rPr>
-        <w:t>To isolate the effect of the PEBI mesh on solver performance, two single-factor decomposition experiments were conducted:</w:t>
+        <w:t>Two single-factor decomposition experiments isolate the effect of the PEBI mesh on solver performance:</w:t>
       </w:r>
     </w:p>
     <w:p>
@@ -25613,108 +22414,6 @@
         </w:rPr>
         <w:t>Mesh-isolation experiment (CPR-SA-AMG on Cartesian LGR): Running the identical CPR-SA-AMG solver on a Cartesian LGR grid covering the same spatial domain with matched total cell count (32 million cells) yields 38 GMRES iterations and a solve time of 3.87 s, 67.5% slower than the PEBI configuration. The increase from 21 to 38 iterations is attributable to the degraded diagonal dominance of the Cartesian LGR Jacobian (delta = 1.43 vs. 2.18 for PEBI).</w:t>
       </w:r>
-      <m:oMath>
-        <m:r>
-          <m:rPr>
-            <m:nor/>
-            <m:sty m:val="p"/>
-          </m:rPr>
-          <w:rPr>
-            <w:rFonts w:ascii="Times New Roman" w:hAnsi="Times New Roman" w:cs="Times New Roman"/>
-            <w:b w:val="0"/>
-            <w:i w:val="0"/>
-            <w:color w:val="auto"/>
-            <w:sz w:val="24"/>
-            <w:szCs w:val="24"/>
-          </w:rPr>
-          <m:t>tanh</m:t>
-        </m:r>
-        <m:sSub>
-          <m:sSubPr>
-            <m:ctrlPr>
-              <w:rPr>
-                <w:rFonts w:ascii="Times New Roman" w:hAnsi="Times New Roman" w:cs="Times New Roman"/>
-                <w:color w:val="auto"/>
-                <w:sz w:val="24"/>
-                <w:szCs w:val="24"/>
-              </w:rPr>
-            </m:ctrlPr>
-          </m:sSubPr>
-          <m:e>
-            <m:acc>
-              <m:accPr>
-                <m:chr m:val="‾"/>
-                <m:ctrlPr>
-                  <w:rPr>
-                    <w:rFonts w:ascii="Times New Roman" w:hAnsi="Times New Roman" w:cs="Times New Roman"/>
-                    <w:color w:val="auto"/>
-                    <w:sz w:val="24"/>
-                    <w:szCs w:val="24"/>
-                  </w:rPr>
-                </m:ctrlPr>
-              </m:accPr>
-              <m:e>
-                <m:r>
-                  <m:rPr/>
-                  <w:rPr>
-                    <w:rFonts w:ascii="Times New Roman" w:hAnsi="Times New Roman" w:cs="Times New Roman"/>
-                    <w:color w:val="auto"/>
-                    <w:sz w:val="24"/>
-                    <w:szCs w:val="24"/>
-                  </w:rPr>
-                  <m:t>δ</m:t>
-                </m:r>
-                <m:ctrlPr>
-                  <w:rPr>
-                    <w:rFonts w:ascii="Times New Roman" w:hAnsi="Times New Roman" w:cs="Times New Roman"/>
-                    <w:color w:val="auto"/>
-                    <w:sz w:val="24"/>
-                    <w:szCs w:val="24"/>
-                  </w:rPr>
-                </m:ctrlPr>
-              </m:e>
-            </m:acc>
-            <m:ctrlPr>
-              <w:rPr>
-                <w:rFonts w:ascii="Times New Roman" w:hAnsi="Times New Roman" w:cs="Times New Roman"/>
-                <w:color w:val="auto"/>
-                <w:sz w:val="24"/>
-                <w:szCs w:val="24"/>
-              </w:rPr>
-            </m:ctrlPr>
-          </m:e>
-          <m:sub>
-            <m:r>
-              <m:rPr/>
-              <w:rPr>
-                <w:rFonts w:ascii="Times New Roman" w:hAnsi="Times New Roman" w:cs="Times New Roman"/>
-                <w:color w:val="auto"/>
-                <w:sz w:val="24"/>
-                <w:szCs w:val="24"/>
-              </w:rPr>
-              <m:t>i</m:t>
-            </m:r>
-            <m:ctrlPr>
-              <w:rPr>
-                <w:rFonts w:ascii="Times New Roman" w:hAnsi="Times New Roman" w:cs="Times New Roman"/>
-                <w:color w:val="auto"/>
-                <w:sz w:val="24"/>
-                <w:szCs w:val="24"/>
-              </w:rPr>
-            </m:ctrlPr>
-          </m:sub>
-        </m:sSub>
-        <m:r>
-          <m:rPr/>
-          <w:rPr>
-            <w:rFonts w:ascii="Times New Roman" w:hAnsi="Times New Roman" w:cs="Times New Roman"/>
-            <w:color w:val="auto"/>
-            <w:sz w:val="24"/>
-            <w:szCs w:val="24"/>
-          </w:rPr>
-          <m:t>=1.43</m:t>
-        </m:r>
-      </m:oMath>
     </w:p>
     <w:p>
       <w:pPr>
@@ -26887,7 +23586,7 @@
           <w:sz w:val="24"/>
           <w:szCs w:val="24"/>
         </w:rPr>
-        <w:t>The factorial analysis reveals that both the mesh contribution (B - A = +17 iterations, +1.56 s) and the solver contribution (C - A = +291 iterations, +6.16 s) are substantial, but the solver improvement accounts for the larger share of total speedup. Importantly, the mesh improvement is a prerequisite for maximizing the solver benefit: the PEBI mesh reduces the diagonal dominance deficit, enabling SA-AMG to achieve a convergence factor of 0.31 versus 0.45 on Cartesian LGR. Eclipse-100 (Schlumberger, 2023) employs Nested Factorization (NF) rather than AMG-type preconditioning, so the Cartesian LGR + CPR-SA-AMG configuration (Configuration B) serves as the closest available proxy for Eclipse + CPR-SA-AMG.</w:t>
+        <w:t>Factorial analysis reveals that both the mesh contribution (B - A = +17 iterations, +1.56 s) and the solver contribution (C - A = +291 iterations, +6.16 s) are substantial, but the solver improvement accounts for the larger share of total speedup. Importantly, the mesh improvement is a prerequisite for maximizing the solver benefit: the PEBI mesh reduces the diagonal dominance deficit, enabling SA-AMG to achieve a convergence factor of 0.31 versus 0.45 on Cartesian LGR. Eclipse-100 (Schlumberger, 2023) employs Nested Factorization (NF) rather than AMG-type preconditioning, so the Cartesian LGR + CPR-SA-AMG configuration (Configuration B) serves as the closest available proxy for Eclipse + CPR-SA-AMG.</w:t>
       </w:r>
     </w:p>
     <w:p>
@@ -29325,7 +26024,7 @@
           <w:rFonts w:ascii="Times New Roman" w:hAnsi="Times New Roman"/>
           <w:sz w:val="24"/>
         </w:rPr>
-        <w:t>The data in Fig. 9 and Tables 12-13 show that physics-weighted partitioning reduces load imbalance from 18.5% (unweighted ParMETIS) to 3.2% at 512 cores. The strong-scaling efficiency loss beyond 512 cores is attributable to global MPI_Allreduce operations on the coarsest AMG levels (Amdahl, 1967; Gustafson, 1988). Under weak scaling, GMRES iterations remain stable at 21-23 across all tested core counts.</w:t>
+        <w:t>Physics-weighted partitioning reduces load imbalance from 18.5% (unweighted ParMETIS) to 3.2% at 512 cores. The strong-scaling efficiency loss beyond 512 cores is attributable to global MPI_Allreduce operations on the coarsest AMG levels (Amdahl, 1967; Gustafson, 1988). Under weak scaling, GMRES iterations remain stable at 21-23 across all tested core counts.</w:t>
       </w:r>
     </w:p>
     <w:p>
@@ -29407,7 +26106,7 @@
           <w:rFonts w:ascii="Times New Roman" w:hAnsi="Times New Roman"/>
           <w:sz w:val="24"/>
         </w:rPr>
-        <w:t>To evaluate robustness under geological complexity, a stochastic DFN comprising 1,247 natural fractures is superimposed on the base model. A single baseline DFN realization (seed 0) is used for all deterministic comparisons; the Monte Carlo ensemble (n = 25) quantifies statistical variability. The single-realization condition number ratio is 2.87x; the ensemble yields 2.94 +/- 0.41x (mean +/- 1 sigma, n = 25).</w:t>
+        <w:t>To evaluate robustness under complex geological conditions, a stochastic DFN comprising 1,247 natural fractures is superimposed on the base model. A single baseline DFN realization (seed 0) is used for all deterministic comparisons; the Monte Carlo ensemble (n = 25) quantifies statistical variability. The single-realization condition number ratio is 2.87x; the ensemble yields 2.94 +/- 0.41x (mean +/- 1 sigma, n = 25).</w:t>
       </w:r>
     </w:p>
     <w:p>
@@ -30626,7 +27325,7 @@
           <w:sz w:val="24"/>
           <w:szCs w:val="24"/>
         </w:rPr>
-        <w:t>As documented in Fig. 10 and Table 14, the proposed mesh generator retains 95.3% of faces in K-orthogonal condition despite the geometric complexity introduced by 1,247 stochastically placed natural fractures. The spectral conditioning proxy rises to only 2.87x--a modest increase relative to the DFN-free PEBI baseline--compared with 18.6x for the standard unstructured mesh and 11.4x for Cartesian LGR under identical DFN placement.</w:t>
+        <w:t>Figure 10 and Table 14 document that the mesh generator retains 95.3% of faces in K-orthogonal condition despite the geometric complexity introduced by 1,247 stochastically placed natural fractures. The spectral conditioning proxy rises to only 2.87x--a modest increase relative to the DFN-free PEBI baseline--compared with 18.6x for the standard unstructured mesh and 11.4x for Cartesian LGR under identical DFN placement.</w:t>
       </w:r>
     </w:p>
     <w:p>
@@ -30798,25 +27497,8 @@
           <w:sz w:val="24"/>
           <w:szCs w:val="24"/>
         </w:rPr>
-        <w:t>The mechanisms underlying this divergent behavior are clarified in Fig. 11</w:t>
+        <w:t>The mechanisms underlying this divergent behavior are clarified in Fig. 11.</w:t>
       </w:r>
-      <m:oMath>
-        <m:r>
-          <m:rPr>
-            <m:nor/>
-            <m:sty m:val="p"/>
-          </m:rPr>
-          <w:rPr>
-            <w:rFonts w:ascii="Times New Roman" w:hAnsi="Times New Roman" w:cs="Times New Roman"/>
-            <w:b w:val="0"/>
-            <w:i w:val="0"/>
-            <w:color w:val="auto"/>
-            <w:sz w:val="24"/>
-            <w:szCs w:val="24"/>
-          </w:rPr>
-          <m:t>tanh</m:t>
-        </m:r>
-      </m:oMath>
     </w:p>
     <w:p>
       <w:pPr>
@@ -30838,7 +27520,7 @@
           <w:sz w:val="24"/>
           <w:szCs w:val="24"/>
         </w:rPr>
-        <w:t xml:space="preserve">To establish the statistical significance of the DFN-influenced results, we conducted a Monte Carlo ensemble study comprising 25 independent DFN realizations. Each realization was generated from the same parent statistical distributions (Fisher orientation, </w:t>
+        <w:t xml:space="preserve">Statistical significance of the DFN-influenced results was established through a Monte Carlo ensemble study comprising 25 independent DFN realizations. Each realization was generated from the same parent statistical distributions (Fisher orientation, </w:t>
       </w:r>
       <m:oMath>
         <m:sSub>
@@ -32214,7 +28896,20 @@
           <w:sz w:val="24"/>
           <w:szCs w:val="24"/>
         </w:rPr>
-        <w:t>The ensemble-mean recovery enhancement of 21.8 ± 4.3% (mean ± 1σ) arises primarily from the 312 ± 47 natural fractures that intersect the stimulated reservoir volume, extending the effective drainage area beyond the hydraulic-fracture tips</w:t>
+        <w:t xml:space="preserve">The ensemble-mean recovery enhancement of 21.8 ± 4.3% (mean </w:t>
+      </w:r>
+      <m:oMath>
+        <m:r>
+          <m:rPr/>
+          <m:t>± 1σ</m:t>
+        </m:r>
+      </m:oMath>
+      <w:r>
+        <w:rPr>
+          <w:rFonts w:ascii="Times New Roman" w:hAnsi="Times New Roman"/>
+          <w:sz w:val="24"/>
+        </w:rPr>
+        <w:t>) arises primarily from the 312 ± 47 natural fractures that intersect the stimulated reservoir volume, extending the effective drainage area beyond the hydraulic-fracture tips.</w:t>
       </w:r>
     </w:p>
     <w:p>
@@ -33360,7 +30055,7 @@
           <w:sz w:val="24"/>
           <w:szCs w:val="24"/>
         </w:rPr>
-        <w:t>The results in Fig. 12 and Table 15 confirm that fracture half-length is the dominant parameter, consistent with the drainage-geometry physics of ultra-low-permeability reservoirs. The introduction of natural-fracture permeability as a seventh parameter (ranked fifth in influence) indicates that the ensemble-mean DFN recovery enhancement is moderately sensitive to the assumed natural-fracture conductivity. The parameter importance ranking is invariant between the PEBI and Cartesian LGR discretizations, confirming physical consistency.</w:t>
+        <w:t>Figure 12 and Table 15 confirm that fracture half-length is the dominant parameter, consistent with the drainage-geometry physics of ultra-low-permeability reservoirs. The introduction of natural-fracture permeability as a seventh parameter (ranked fifth in influence) indicates that the ensemble-mean DFN recovery enhancement is moderately sensitive to the assumed natural-fracture conductivity. The parameter importance ranking is invariant between the PEBI and Cartesian LGR discretizations, confirming physical consistency.</w:t>
       </w:r>
     </w:p>
     <w:p>
@@ -33396,7 +30091,7 @@
           <w:sz w:val="20"/>
           <w:szCs w:val="20"/>
         </w:rPr>
-        <w:t>Table 16: Sensitivity of mesh quality to  density function parameters.</w:t>
+        <w:t>Table 16: Sensitivity of mesh quality to density function parameters.</w:t>
       </w:r>
     </w:p>
     <w:tbl>
@@ -35135,7 +31830,7 @@
           <w:sz w:val="24"/>
           <w:szCs w:val="20"/>
         </w:rPr>
-        <w:t xml:space="preserve">Table 16 reports mesh quality sensitivity to the  density function parameters. The K-orthogonality fraction (97.1%) is robust to variations in  and  across a factor-of-four range, varying by less than 2 percentage points. The near-fracture spacing  has the strongest influence: reducing  from 1.0 m to 0.5 m improves K-orthogonality marginally (97.1% → 97.8%) but increases the total cell count by 38%. The base parameter set ( </w:t>
+        <w:t xml:space="preserve">Table 16 reports mesh quality sensitivity to the density function parameters. The K-orthogonality fraction (97.1%) is robust to variations in and across a factor-of-four range, varying by less than 2 percentage points. The near-fracture spacing has the strongest influence: reducing from 1.0 m to 0.5 m improves K-orthogonality marginally (97.1% → 97.8%) but increases the total cell count by 38%. The base parameter set ( </w:t>
       </w:r>
       <m:oMath>
         <m:sSup>
@@ -35173,7 +31868,7 @@
           <w:sz w:val="24"/>
           <w:szCs w:val="20"/>
         </w:rPr>
-        <w:t>,  m,  m) represents a Pareto-optimal trade-off between mesh quality and cell count.</w:t>
+        <w:t>, m, m) represents a Pareto-optimal trade-off between mesh quality and cell count.</w:t>
       </w:r>
     </w:p>
     <w:p>
@@ -35244,7 +31939,7 @@
           <w:sz w:val="24"/>
           <w:szCs w:val="24"/>
         </w:rPr>
-        <w:t>To assess the generality of the findings beyond the base five-well pad configuration, we consider a second case with a different well geometry: a single horizontal well with 12 hydraulic-fracture stages, keeping the matrix permeability (</w:t>
+        <w:t>Generality of the findings beyond the base five-well pad configuration is assessed by considering a second case with a different well geometry: a single horizontal well with 12 hydraulic-fracture stages, keeping the matrix permeability (</w:t>
       </w:r>
       <m:oMath>
         <m:sSub>
@@ -35317,7 +32012,7 @@
           <w:sz w:val="24"/>
           <w:szCs w:val="24"/>
         </w:rPr>
-        <w:t>mD), porosity, fluid properties, fracture properties, and all other reservoir parameters identical to the base case (Table 6). We emphasize that the reduction in fracture count (12 vs. 100) inherently changes several structural properties of the computational problem: the total cell count decreases (387K vs. 1,024K), the TPFA Jacobian sparsity pattern and AMG hierarchy depth adapt to the smaller problem size, and the ParMETIS partitioning operates on a graph with fewer high-weight edges. This is therefore a configuration-robustness test, not a strict single-variable control experiment—the change in fracture count is itself the geometric perturbation whose impact on the framework we wish to quantify. The well is operated under primary depletion (no water injection). To enable a fair parallel-efficiency comparison, both cases are evaluated at the same core count.</w:t>
+        <w:t>mD), porosity, fluid properties, fracture properties, and all other reservoir parameters identical to the base case (Table 6). The reduction in fracture count (12 vs. 100) inherently changes several structural properties of the computational problem: the total cell count decreases (387K vs. 1,024K), the TPFA Jacobian sparsity pattern and AMG hierarchy depth adapt to the smaller problem size, and the ParMETIS partitioning operates on a graph with fewer high-weight edges. This is therefore a configuration-robustness test, not a strict single-variable control experiment—the change in fracture count is itself the geometric perturbation whose impact on the framework we wish to quantify. The well is operated under primary depletion (no water injection). To enable a fair parallel-efficiency comparison, both cases are evaluated at the same core count.</w:t>
       </w:r>
     </w:p>
     <w:p>
@@ -36899,7 +33594,7 @@
           <w:sz w:val="24"/>
           <w:szCs w:val="24"/>
         </w:rPr>
-        <w:t>The central empirical finding of this work is that mesh conformity, algebraic conditioning, and parallel concurrency form a quantitatively coupled propagative association--the Geometry-Algebra-Concurrency Triad--rather than independent tuning parameters. K-orthogonal mesh geometry is associated with improved Jacobian diagonal dominance (delta = 2.18 vs. 1.43), which accelerates AMG convergence (V-cycle factor 0.31 vs. 0.45), which in turn widens the temporal window for computation-communication overlap (eta = 0.73). The mesh-isolation experiment (Table 11, Configurations A vs. B) demonstrates that K-orthogonal PEBI geometry alone reduces GMRES iterations from 38 to 21 under identical CPR-SA-AMG preconditioning. Under DFN complexity, the proportional degradations persist: K-orthogonality decreases to 95.1 +/- 0.8%, GMRES iterations increase to 24.3 +/- 1.8, and overlap efficiency decreases to an estimated 0.68, confirming the Triad as a robust empirical design principle.</w:t>
+        <w:t>A central empirical finding of this work is that mesh conformity, algebraic conditioning, and parallel concurrency form a quantitatively coupled chain--the Geometry-Algebra-Concurrency Triad--rather than independent tuning parameters. K-orthogonal mesh geometry is associated with improved Jacobian diagonal dominance (delta = 2.18 vs. 1.43), which accelerates AMG convergence (V-cycle factor 0.31 vs. 0.45), which in turn widens the temporal window for computation-communication overlap (eta = 0.73). The mesh-isolation experiment (Table 11, Configurations A vs. B) demonstrates that K-orthogonal PEBI geometry alone reduces GMRES iterations from 38 to 21 under identical CPR-SA-AMG preconditioning. Under DFN complexity, the proportional degradations persist: K-orthogonality decreases to 95.1 +/- 0.8%, GMRES iterations increase to 24.3 +/- 1.8, and overlap efficiency decreases to an estimated 0.68, confirming the Triad as a robust empirical design principle.</w:t>
       </w:r>
     </w:p>
     <w:p>
@@ -36948,7 +33643,7 @@
           <w:sz w:val="24"/>
           <w:szCs w:val="24"/>
         </w:rPr>
-        <w:t>The comparative analysis in Section 3.3 reveals a cautionary result: two simulators may agree within 1.5% on cumulative production while disagreeing by 18.5% in the near-fracture pressure distribution—a discrepancy with direct consequences for history matching and fracture-property inversion. To make this concrete, we performed a synthetic pressure-transient analysis: treating the PEBI pressure profile at t = 1,000 days as the true reservoir response and the Cartesian LGR profile as the simulated observation, a standard well-test interpretation workflow (log–log derivative analysis followed by type-curve matching; Bourdet et al., 1989) was applied to estimate fracture half-length. The LGR-based estimate underestimated fracture half-length by 12.3% (133 m vs. the input 150 m) and overestimated fracture conductivity by 18.7%; the PEBI-based estimate recovered both parameters to within 2%. When calibrated parameters absorb numerical artifacts of this magnitude, they lose physical interpretability and propagate errors into well-spacing and completion-design decisions. The conforming PEBI discretization eliminates this bias at its source.</w:t>
+        <w:t>The comparative analysis in Section 3.3 reveals a notable result: two simulators may agree within 1.5% on cumulative production while disagreeing by 18.5% in the near-fracture pressure distribution—a discrepancy with direct consequences for history matching and fracture-property inversion. As a concrete illustration, a synthetic pressure-transient analysis was performed: treating the PEBI pressure profile at t = 1,000 days as the true reservoir response and the Cartesian LGR profile as the simulated observation, a standard well-test interpretation workflow (log–log derivative analysis followed by type-curve matching; Bourdet et al., 1989) was applied to estimate fracture half-length. The LGR-based estimate underestimated fracture half-length by 12.3% (133 m vs. the input 150 m) and overestimated fracture conductivity by 18.7%; the PEBI-based estimate recovered both parameters to within 2%. When calibrated parameters absorb numerical artifacts of this magnitude, they lose physical interpretability and propagate errors into well-spacing and completion-design decisions. The conforming PEBI discretization eliminates this bias at its source.</w:t>
       </w:r>
     </w:p>
     <w:p>
@@ -37108,7 +33803,7 @@
           <w:sz w:val="24"/>
           <w:szCs w:val="24"/>
         </w:rPr>
-        <w:t>MPFA comparison. Multi-point flux approximation schemes (MPFA-O, MPFA-H, AvgMPFA) restore flux consistency on non-K-orthogonal grids at the cost of enlarged stencils (7-27 points in 2D). A direct PEBI+TPFA vs. MPFA comparison would quantify the trade-off between mesh-generation effort (1,247 s one-time) and stencil complexity. Additional limitations include CPU-only implementation, though AMG operations are natural GPU-offload candidates (Anzt et al., 2022).</w:t>
+        <w:t>MPFA comparison. While the present study benchmarks PEBI+TPFA against Cartesian LGR and EDFM, multi-point flux approximation methods (MPFA-O, MPFA-H, AvgMPFA) offer an alternative path to flux consistency on non-orthogonal meshes using enlarged stencils of 7-27 points in 2D. A head-to-head PEBI+TPFA vs. MPFA evaluation would illuminate the trade-off between one-time mesh-generation cost (1,247 s one-time) and stencil complexity. Additional limitations include CPU-only implementation, though AMG operations are natural GPU-offload candidates (Anzt et al., 2022).</w:t>
       </w:r>
     </w:p>
     <w:p>
@@ -37157,7 +33852,7 @@
           <w:sz w:val="24"/>
           <w:szCs w:val="24"/>
         </w:rPr>
-        <w:t>This paper has presented a fracture-conforming 2.5D PEBI black-oil simulation framework whose defining contribution is the demonstration that mesh generation, pressure-system preconditioning, and parallel communication protocols can be treated as a single integrated design problem. The principal findings are as follows.</w:t>
+        <w:t>This paper presented a fracture-conforming 2.5D PEBI black-oil simulation framework. Its defining contribution is the demonstration that mesh generation, pressure-system preconditioning, and parallel communication protocols can be treated as a single integrated design problem. The principal findings are as follows.</w:t>
       </w:r>
     </w:p>
     <w:p>
@@ -37217,7 +33912,20 @@
           <w:sz w:val="24"/>
           <w:szCs w:val="24"/>
         </w:rPr>
-        <w:t>The CPR–SA-AMG preconditioner reduces GMRES iterations from 312 to 21, yielding a 72.7% reduction in linear-solve time; the spectral conditioning proxy κ̂(A) is approximately 3.7 × 10⁶ for the base PEBI case, compared with approximately 6.9 × 10⁷ for the standard unstructured DFN configuration (a 2.87× increase under DFN insertion, vs. 18.6× for standard unstructured grids).</w:t>
+        <w:t xml:space="preserve">The CPR–SA-AMG preconditioner reduces GMRES iterations from 312 to 21, yielding a 72.7% reduction in linear-solve time; the spectral conditioning proxy </w:t>
+      </w:r>
+      <m:oMath>
+        <m:r>
+          <m:rPr/>
+          <m:t>κ̂(A)</m:t>
+        </m:r>
+      </m:oMath>
+      <w:r>
+        <w:rPr>
+          <w:rFonts w:ascii="Times New Roman" w:hAnsi="Times New Roman"/>
+          <w:sz w:val="24"/>
+        </w:rPr>
+        <w:t xml:space="preserve"> is approximately 3.7 × 10⁶ for the base PEBI case, compared with approximately 6.9 × 10⁷ for the standard unstructured DFN configuration (a 2.87× increase under DFN insertion, vs. 18.6× for standard unstructured grids).</w:t>
       </w:r>
     </w:p>
     <w:p>
@@ -37240,7 +33948,7 @@
           <w:sz w:val="24"/>
           <w:szCs w:val="24"/>
         </w:rPr>
-        <w:t>Taken together, these results establish that, within the scope of 2.5D extrusion for reservoirs dominated by vertical or near-vertical fractures, fracture-conforming discretization restructures the algebraic properties of the fully implicit system in a manner that propagates systematically from geometric fidelity through solver convergence to parallel performance. The Geometry-Algebra-Concurrency Triad (Section 4.1) describes an empirically observed propagative dependency: K-orthogonal mesh geometry is associated with improved Jacobian diagonal dominance, which accelerates AMG convergence, which in turn widens the temporal window for effective computation-communication overlap.</w:t>
+        <w:t>Collectively, these results establish that, within the scope of 2.5D extrusion for reservoirs dominated by vertical or near-vertical fractures, fracture-conforming discretization restructures the algebraic properties of the fully implicit system. The effect propagates systematically from geometric fidelity through solver convergence to parallel performance. The Geometry-Algebra-Concurrency Triad (Section 4.1) describes an empirically observed systematic dependency: K-orthogonal mesh geometry is associated with improved Jacobian diagonal dominance, which accelerates AMG convergence, which in turn widens the temporal window for effective computation-communication overlap.</w:t>
       </w:r>
     </w:p>
     <w:p>
@@ -37326,7 +34034,7 @@
         <w:rPr>
           <w:rFonts w:ascii="Times New Roman" w:hAnsi="Times New Roman" w:cs="Times New Roman"/>
           <w:color w:val="auto"/>
-          <w:sz w:val="24"/>
+          <w:sz w:val="20"/>
           <w:szCs w:val="24"/>
         </w:rPr>
       </w:pPr>
@@ -37342,7 +34050,9 @@
     </w:p>
     <w:p>
       <w:pPr>
+        <w:pStyle w:val="3"/>
         <w:spacing w:before="120" w:after="60" w:line="360" w:lineRule="auto"/>
+        <w:ind w:firstLine="480"/>
         <w:jc w:val="both"/>
         <w:rPr>
           <w:rFonts w:ascii="Times New Roman" w:hAnsi="Times New Roman" w:cs="Times New Roman"/>
@@ -37351,17 +34061,16 @@
           <w:szCs w:val="24"/>
         </w:rPr>
       </w:pPr>
-      <w:bookmarkStart w:id="27" w:name="data-availability"/>
+      <w:bookmarkStart w:id="27" w:name="computer-code-availability"/>
       <w:r>
         <w:rPr>
           <w:rFonts w:ascii="Times New Roman" w:hAnsi="Times New Roman" w:cs="Times New Roman"/>
           <w:b/>
-          <w:bCs/>
           <w:color w:val="auto"/>
           <w:sz w:val="24"/>
           <w:szCs w:val="24"/>
         </w:rPr>
-        <w:t>Data Availability</w:t>
+        <w:t>Computer Code Availability</w:t>
       </w:r>
       <w:bookmarkEnd w:id="27"/>
     </w:p>
@@ -37374,7 +34083,7 @@
         <w:rPr>
           <w:rFonts w:ascii="Times New Roman" w:hAnsi="Times New Roman" w:cs="Times New Roman"/>
           <w:color w:val="auto"/>
-          <w:sz w:val="24"/>
+          <w:sz w:val="20"/>
           <w:szCs w:val="24"/>
         </w:rPr>
       </w:pPr>
@@ -37385,14 +34094,30 @@
           <w:sz w:val="20"/>
           <w:szCs w:val="24"/>
         </w:rPr>
-        <w:t>The datasets generated and analyzed during the current</w:t>
+        <w:t>The numerical framework described in this paper incorporates the open-source PETSc library (version 3.19, https://petsc.org/), ParMETIS (version 4.0.3), and SLEPc (version 3.19). Custom code components—including the PEBI mesh generator, CPR–SA-AMG preconditioner wrapper, and non-blocking MPI communication scheduler—are available in a public GitHub repository (</w:t>
+      </w:r>
+      <w:r>
+        <w:rPr>
+          <w:rFonts w:hint="eastAsia" w:ascii="Times New Roman" w:hAnsi="Times New Roman" w:cs="Times New Roman"/>
+          <w:color w:val="auto"/>
+          <w:sz w:val="20"/>
+          <w:szCs w:val="24"/>
+        </w:rPr>
+        <w:t xml:space="preserve"> https://github.com/rwyin08-bit/paper</w:t>
+      </w:r>
+      <w:r>
+        <w:rPr>
+          <w:rFonts w:ascii="Times New Roman" w:hAnsi="Times New Roman" w:cs="Times New Roman"/>
+          <w:color w:val="auto"/>
+          <w:sz w:val="20"/>
+          <w:szCs w:val="24"/>
+        </w:rPr>
+        <w:t>), archived on Zenodo with DOI [to be assigned upon acceptance]. The repository includes: (i) the complete PEBI mesh generation pipeline with the tanh density function implementation, (ii) configuration files and parameter scripts to reproduce all numerical experiments reported in Sections 3.1–3.8, (iii) the SPE 10 comparative solution input files and the re-computed Cartesian reference solution, and (iv) a Docker container definition for reproducible execution on any x86-64 Linux platform. The SPE 10 comparative solution dataset is publicly available from the Society of Petroleum Engineers (https://www.spe.org/web/csp/datasets/set02.htm).</w:t>
       </w:r>
     </w:p>
     <w:p>
       <w:pPr>
-        <w:pStyle w:val="3"/>
         <w:spacing w:before="120" w:after="60" w:line="360" w:lineRule="auto"/>
-        <w:ind w:firstLine="480"/>
         <w:jc w:val="both"/>
         <w:rPr>
           <w:rFonts w:ascii="Times New Roman" w:hAnsi="Times New Roman" w:cs="Times New Roman"/>
@@ -37401,16 +34126,17 @@
           <w:szCs w:val="24"/>
         </w:rPr>
       </w:pPr>
-      <w:bookmarkStart w:id="28" w:name="use-of-ai-assisted-tools"/>
+      <w:bookmarkStart w:id="28" w:name="data-availability"/>
       <w:r>
         <w:rPr>
           <w:rFonts w:ascii="Times New Roman" w:hAnsi="Times New Roman" w:cs="Times New Roman"/>
           <w:b/>
+          <w:bCs/>
           <w:color w:val="auto"/>
           <w:sz w:val="24"/>
           <w:szCs w:val="24"/>
         </w:rPr>
-        <w:t>Use of AI-Assisted Tools</w:t>
+        <w:t>Data Availability</w:t>
       </w:r>
       <w:bookmarkEnd w:id="28"/>
     </w:p>
@@ -37434,6 +34160,57 @@
           <w:sz w:val="20"/>
           <w:szCs w:val="24"/>
         </w:rPr>
+        <w:t>The datasets generated and analyzed during the current study are available from the corresponding author on reasonable request.</w:t>
+      </w:r>
+    </w:p>
+    <w:p>
+      <w:pPr>
+        <w:pStyle w:val="3"/>
+        <w:spacing w:before="120" w:after="60" w:line="360" w:lineRule="auto"/>
+        <w:ind w:firstLine="480"/>
+        <w:jc w:val="both"/>
+        <w:rPr>
+          <w:rFonts w:ascii="Times New Roman" w:hAnsi="Times New Roman" w:cs="Times New Roman"/>
+          <w:color w:val="auto"/>
+          <w:sz w:val="24"/>
+          <w:szCs w:val="24"/>
+        </w:rPr>
+      </w:pPr>
+      <w:bookmarkStart w:id="29" w:name="use-of-ai-assisted-tools"/>
+      <w:bookmarkStart w:id="32" w:name="_GoBack"/>
+      <w:bookmarkEnd w:id="32"/>
+      <w:r>
+        <w:rPr>
+          <w:rFonts w:ascii="Times New Roman" w:hAnsi="Times New Roman" w:cs="Times New Roman"/>
+          <w:b/>
+          <w:color w:val="auto"/>
+          <w:sz w:val="24"/>
+          <w:szCs w:val="24"/>
+        </w:rPr>
+        <w:t>Use of AI-Assisted Tools</w:t>
+      </w:r>
+      <w:bookmarkEnd w:id="29"/>
+    </w:p>
+    <w:p>
+      <w:pPr>
+        <w:pStyle w:val="3"/>
+        <w:spacing w:line="360" w:lineRule="auto"/>
+        <w:ind w:firstLine="400" w:firstLineChars="200"/>
+        <w:jc w:val="both"/>
+        <w:rPr>
+          <w:rFonts w:ascii="Times New Roman" w:hAnsi="Times New Roman" w:cs="Times New Roman"/>
+          <w:color w:val="auto"/>
+          <w:sz w:val="24"/>
+          <w:szCs w:val="24"/>
+        </w:rPr>
+      </w:pPr>
+      <w:r>
+        <w:rPr>
+          <w:rFonts w:ascii="Times New Roman" w:hAnsi="Times New Roman" w:cs="Times New Roman"/>
+          <w:color w:val="auto"/>
+          <w:sz w:val="20"/>
+          <w:szCs w:val="24"/>
+        </w:rPr>
         <w:t>During the preparation of this manuscript, the authors used</w:t>
       </w:r>
       <w:r>
@@ -37460,7 +34237,8 @@
       <w:pPr>
         <w:pStyle w:val="2"/>
         <w:spacing w:before="120" w:after="60" w:line="360" w:lineRule="auto"/>
-        <w:jc w:val="both"/>
+        <w:ind w:firstLine="0"/>
+        <w:jc w:val="left"/>
         <w:rPr>
           <w:rFonts w:ascii="Times New Roman" w:hAnsi="Times New Roman" w:cs="Times New Roman"/>
           <w:color w:val="auto"/>
@@ -37468,19 +34246,19 @@
           <w:szCs w:val="28"/>
         </w:rPr>
       </w:pPr>
-      <w:bookmarkStart w:id="29" w:name="acknowledgments"/>
+      <w:bookmarkStart w:id="30" w:name="acknowledgments"/>
       <w:r>
         <w:rPr>
           <w:rFonts w:ascii="Times New Roman" w:hAnsi="Times New Roman" w:cs="Times New Roman"/>
           <w:b/>
           <w:bCs/>
           <w:color w:val="auto"/>
-          <w:sz w:val="24"/>
+          <w:sz w:val="28"/>
           <w:szCs w:val="28"/>
         </w:rPr>
         <w:t>Acknowledgments</w:t>
       </w:r>
-      <w:bookmarkEnd w:id="29"/>
+      <w:bookmarkEnd w:id="30"/>
     </w:p>
     <w:p>
       <w:pPr>
@@ -38161,7 +34939,7 @@
           <w:szCs w:val="28"/>
         </w:rPr>
       </w:pPr>
-      <w:bookmarkStart w:id="30" w:name="appendix-nomenclature"/>
+      <w:bookmarkStart w:id="31" w:name="appendix-nomenclature"/>
       <w:r>
         <w:rPr>
           <w:rFonts w:ascii="Times New Roman" w:hAnsi="Times New Roman" w:cs="Times New Roman"/>
@@ -38172,7 +34950,7 @@
         </w:rPr>
         <w:t>Appendix: Nomenclature</w:t>
       </w:r>
-      <w:bookmarkEnd w:id="30"/>
+      <w:bookmarkEnd w:id="31"/>
     </w:p>
     <w:p>
       <w:pPr>

</xml_diff>